<commit_message>
Completed Task 2 of OOP Project - Problem analysis Signed-off-by: Harvey <HarveyDanSmith@gmail.com>
</commit_message>
<xml_diff>
--- a/OOP Coastal Project.docx
+++ b/OOP Coastal Project.docx
@@ -682,15 +682,7 @@
           <w:p/>
           <w:p>
             <w:r>
-              <w:t xml:space="preserve">Creates strong </w:t>
-            </w:r>
-            <w:proofErr w:type="gramStart"/>
-            <w:r>
-              <w:t>likely-hood</w:t>
-            </w:r>
-            <w:proofErr w:type="gramEnd"/>
-            <w:r>
-              <w:t xml:space="preserve"> of errors such as fragmentation in the system</w:t>
+              <w:t>Creates strong likely-hood of errors such as fragmentation in the system</w:t>
             </w:r>
           </w:p>
         </w:tc>
@@ -903,7 +895,14 @@
             </w:tcMar>
             <w:vAlign w:val="center"/>
           </w:tcPr>
-          <w:p/>
+          <w:p>
+            <w:r>
+              <w:t>Describes factors</w:t>
+            </w:r>
+            <w:r>
+              <w:t xml:space="preserve"> for safe preparation</w:t>
+            </w:r>
+          </w:p>
         </w:tc>
       </w:tr>
       <w:tr>
@@ -952,7 +951,11 @@
             </w:tcMar>
             <w:vAlign w:val="center"/>
           </w:tcPr>
-          <w:p/>
+          <w:p>
+            <w:r>
+              <w:t>Domain rule for volunteers</w:t>
+            </w:r>
+          </w:p>
         </w:tc>
       </w:tr>
       <w:tr>
@@ -1001,7 +1004,11 @@
             </w:tcMar>
             <w:vAlign w:val="center"/>
           </w:tcPr>
-          <w:p/>
+          <w:p>
+            <w:r>
+              <w:t>Domain rule for capacity</w:t>
+            </w:r>
+          </w:p>
         </w:tc>
       </w:tr>
       <w:tr>
@@ -1050,7 +1057,11 @@
             </w:tcMar>
             <w:vAlign w:val="center"/>
           </w:tcPr>
-          <w:p/>
+          <w:p>
+            <w:r>
+              <w:t>Describes items required for events</w:t>
+            </w:r>
+          </w:p>
         </w:tc>
       </w:tr>
       <w:tr>
@@ -1100,7 +1111,11 @@
             </w:tcMar>
             <w:vAlign w:val="center"/>
           </w:tcPr>
-          <w:p/>
+          <w:p>
+            <w:r>
+              <w:t xml:space="preserve">Issue that allows damaged property and assumes is acceptable </w:t>
+            </w:r>
+          </w:p>
         </w:tc>
       </w:tr>
       <w:tr>
@@ -1149,7 +1164,14 @@
             </w:tcMar>
             <w:vAlign w:val="center"/>
           </w:tcPr>
-          <w:p/>
+          <w:p>
+            <w:r>
+              <w:t>Risky as c</w:t>
+            </w:r>
+            <w:r>
+              <w:t>an result in very different levels of training</w:t>
+            </w:r>
+          </w:p>
         </w:tc>
       </w:tr>
       <w:tr>
@@ -1198,7 +1220,11 @@
             </w:tcMar>
             <w:vAlign w:val="center"/>
           </w:tcPr>
-          <w:p/>
+          <w:p>
+            <w:r>
+              <w:t>Domain rule describing possibly more leader requirements</w:t>
+            </w:r>
+          </w:p>
         </w:tc>
       </w:tr>
       <w:tr>
@@ -1247,7 +1273,11 @@
             </w:tcMar>
             <w:vAlign w:val="center"/>
           </w:tcPr>
-          <w:p/>
+          <w:p>
+            <w:r>
+              <w:t>Can cause issues where no leader is available for a confirmed event</w:t>
+            </w:r>
+          </w:p>
         </w:tc>
       </w:tr>
       <w:tr>
@@ -1296,7 +1326,11 @@
             </w:tcMar>
             <w:vAlign w:val="center"/>
           </w:tcPr>
-          <w:p/>
+          <w:p>
+            <w:r>
+              <w:t>Domain rules describing waste collection arrangements</w:t>
+            </w:r>
+          </w:p>
         </w:tc>
       </w:tr>
       <w:tr>
@@ -1345,7 +1379,11 @@
             </w:tcMar>
             <w:vAlign w:val="center"/>
           </w:tcPr>
-          <w:p/>
+          <w:p>
+            <w:r>
+              <w:t>Domain rule describing possible separate handling of waste</w:t>
+            </w:r>
+          </w:p>
         </w:tc>
       </w:tr>
       <w:tr>
@@ -1394,7 +1432,11 @@
             </w:tcMar>
             <w:vAlign w:val="center"/>
           </w:tcPr>
-          <w:p/>
+          <w:p>
+            <w:r>
+              <w:t>Issues can arise when a vehicle doesn’t have enough capacity</w:t>
+            </w:r>
+          </w:p>
         </w:tc>
       </w:tr>
       <w:tr>
@@ -1443,7 +1485,11 @@
             </w:tcMar>
             <w:vAlign w:val="center"/>
           </w:tcPr>
-          <w:p/>
+          <w:p>
+            <w:r>
+              <w:t>Describes the current situation and shows potential issues that can delay or cancel events</w:t>
+            </w:r>
+          </w:p>
         </w:tc>
       </w:tr>
       <w:tr>
@@ -1492,7 +1538,11 @@
             </w:tcMar>
             <w:vAlign w:val="center"/>
           </w:tcPr>
-          <w:p/>
+          <w:p>
+            <w:r>
+              <w:t>Inconsistent messages will cause problems for many events</w:t>
+            </w:r>
+          </w:p>
         </w:tc>
       </w:tr>
       <w:tr>
@@ -1541,7 +1591,11 @@
             </w:tcMar>
             <w:vAlign w:val="center"/>
           </w:tcPr>
-          <w:p/>
+          <w:p>
+            <w:r>
+              <w:t>Domain rule describing rules for attendance recording</w:t>
+            </w:r>
+          </w:p>
         </w:tc>
       </w:tr>
       <w:tr>
@@ -1590,23 +1644,28 @@
             </w:tcMar>
             <w:vAlign w:val="center"/>
           </w:tcPr>
-          <w:p/>
-        </w:tc>
-      </w:tr>
-      <w:tr>
-        <w:tc>
-          <w:tcPr>
-            <w:tcW w:w="0" w:type="auto"/>
-            <w:tcMar>
-              <w:top w:w="30" w:type="dxa"/>
-              <w:left w:w="30" w:type="dxa"/>
-              <w:bottom w:w="30" w:type="dxa"/>
-              <w:right w:w="30" w:type="dxa"/>
-            </w:tcMar>
-            <w:vAlign w:val="center"/>
-          </w:tcPr>
-          <w:p>
-            <w:r>
+          <w:p>
+            <w:r>
+              <w:t>Domain rule allowing estimation</w:t>
+            </w:r>
+          </w:p>
+        </w:tc>
+      </w:tr>
+      <w:tr>
+        <w:tc>
+          <w:tcPr>
+            <w:tcW w:w="0" w:type="auto"/>
+            <w:tcMar>
+              <w:top w:w="30" w:type="dxa"/>
+              <w:left w:w="30" w:type="dxa"/>
+              <w:bottom w:w="30" w:type="dxa"/>
+              <w:right w:w="30" w:type="dxa"/>
+            </w:tcMar>
+            <w:vAlign w:val="center"/>
+          </w:tcPr>
+          <w:p>
+            <w:r>
+              <w:lastRenderedPageBreak/>
               <w:t>The coordinator needs views of events awaiting approval, leader and equipment gaps, changed events, outstanding waste collection and incomplete reports</w:t>
             </w:r>
           </w:p>
@@ -1639,24 +1698,27 @@
             </w:tcMar>
             <w:vAlign w:val="center"/>
           </w:tcPr>
-          <w:p/>
-        </w:tc>
-      </w:tr>
-      <w:tr>
-        <w:tc>
-          <w:tcPr>
-            <w:tcW w:w="0" w:type="auto"/>
-            <w:tcMar>
-              <w:top w:w="30" w:type="dxa"/>
-              <w:left w:w="30" w:type="dxa"/>
-              <w:bottom w:w="30" w:type="dxa"/>
-              <w:right w:w="30" w:type="dxa"/>
-            </w:tcMar>
-            <w:vAlign w:val="center"/>
-          </w:tcPr>
-          <w:p>
-            <w:r>
-              <w:lastRenderedPageBreak/>
+          <w:p>
+            <w:r>
+              <w:t>Requirement stating the needs of a coordinator in relation to views of events</w:t>
+            </w:r>
+          </w:p>
+        </w:tc>
+      </w:tr>
+      <w:tr>
+        <w:tc>
+          <w:tcPr>
+            <w:tcW w:w="0" w:type="auto"/>
+            <w:tcMar>
+              <w:top w:w="30" w:type="dxa"/>
+              <w:left w:w="30" w:type="dxa"/>
+              <w:bottom w:w="30" w:type="dxa"/>
+              <w:right w:w="30" w:type="dxa"/>
+            </w:tcMar>
+            <w:vAlign w:val="center"/>
+          </w:tcPr>
+          <w:p>
+            <w:r>
               <w:t>Emergency response and environmental enforcement are outside scope</w:t>
             </w:r>
           </w:p>
@@ -1737,6 +1799,78 @@
     <w:p>
       <w:r>
         <w:t>Task 2: Business Problem Statement</w:t>
+      </w:r>
+    </w:p>
+    <w:p>
+      <w:r>
+        <w:t xml:space="preserve">There are a number of problems throughout this system. </w:t>
+      </w:r>
+      <w:r>
+        <w:t>Event details, volunteer lists, equipment requests and waste arrangements are managed through email, forms and shared calendars</w:t>
+      </w:r>
+      <w:r>
+        <w:t xml:space="preserve"> which can cause fragmentation. Due to this, data will be spread among a number of different data collection methods and will cause confusion or missing data. Because v</w:t>
+      </w:r>
+      <w:r>
+        <w:t>olunteers may register individually or through schools, clubs and community organisations</w:t>
+      </w:r>
+      <w:r>
+        <w:t xml:space="preserve">, duplication could occur here if someone is to register on their own, but then be registered by their school. Because </w:t>
+      </w:r>
+      <w:r>
+        <w:t>Group organisers sometimes provide only estimated numbers until shortly before the event</w:t>
+      </w:r>
+      <w:r>
+        <w:t xml:space="preserve">, issues could arise as if the estimated numbers differ greatly from the estimation (numbers being much higher or lower than predicted), leaders could come overprepared or worse, underprepared and not have enough equipment for the event. </w:t>
+      </w:r>
+      <w:r>
+        <w:t>Equipment may be reserved across several events and can return wet, incomplete or damaged</w:t>
+      </w:r>
+      <w:r>
+        <w:t xml:space="preserve"> which can encourage people to not take proper care of equipment. If there is no penalty or issue with returning a broken piece of equipment, then why would anyone need to care too much about the condition of equipment, it promotes faulty equipment which can be a safety hazard. Having e</w:t>
+      </w:r>
+      <w:r>
+        <w:t xml:space="preserve">vent leaders </w:t>
+      </w:r>
+      <w:r>
+        <w:t>with</w:t>
+      </w:r>
+      <w:r>
+        <w:t xml:space="preserve"> different experience and training</w:t>
+      </w:r>
+      <w:r>
+        <w:t xml:space="preserve"> is risky, as it could allow undertrained leaders to work and potentially put equipment or others at risk.</w:t>
+      </w:r>
+      <w:r>
+        <w:t xml:space="preserve"> If a </w:t>
+      </w:r>
+      <w:r>
+        <w:t>leader assignment can remain provisional while availability or permission is confirmed</w:t>
+      </w:r>
+      <w:r>
+        <w:t xml:space="preserve">, it could end up having an event not have a leader available at the time of the event causing the event to be postponed, cancelled or urgently needing a new leader to take over the position. </w:t>
+      </w:r>
+      <w:r>
+        <w:t>A collection vehicle may have limited access or capacity</w:t>
+      </w:r>
+      <w:r>
+        <w:t xml:space="preserve">, this is a problem as if the collection vehicle does not have enough capacity required for the event, it could cause delays or if underprepared jeopardise the whole event. </w:t>
+      </w:r>
+      <w:r>
+        <w:t>Weather, tides, access restrictions or insufficient leadership may cause relocation, postponement, shortening or cancellation</w:t>
+      </w:r>
+      <w:r>
+        <w:t>. Anything that can risk cancelation of an event is a problem that needs to be planned around better. If m</w:t>
+      </w:r>
+      <w:r>
+        <w:t>essages to volunteers and partners are not always updated consistently</w:t>
+      </w:r>
+      <w:r>
+        <w:t xml:space="preserve">, it can cause issues with volunteers maybe not showing on time, or at all if not correctly informed of a postponement or time </w:t>
+      </w:r>
+      <w:r>
+        <w:lastRenderedPageBreak/>
+        <w:t>change. It could also cause volunteers to show up early or on the wrong date prior to the event which will cause angry volunteers due to a lack of planning.</w:t>
       </w:r>
     </w:p>
     <w:p/>

</xml_diff>

<commit_message>
Began work on Task 3 - Purpose Statement Signed-off-by: Harvey <HarveyDanSmith@gmail.com>
</commit_message>
<xml_diff>
--- a/OOP Coastal Project.docx
+++ b/OOP Coastal Project.docx
@@ -3,6 +3,9 @@
 <w:document xmlns:wpc="http://schemas.microsoft.com/office/word/2010/wordprocessingCanvas" xmlns:cx="http://schemas.microsoft.com/office/drawing/2014/chartex" xmlns:cx1="http://schemas.microsoft.com/office/drawing/2015/9/8/chartex" xmlns:cx2="http://schemas.microsoft.com/office/drawing/2015/10/21/chartex" xmlns:cx3="http://schemas.microsoft.com/office/drawing/2016/5/9/chartex" xmlns:cx4="http://schemas.microsoft.com/office/drawing/2016/5/10/chartex" xmlns:cx5="http://schemas.microsoft.com/office/drawing/2016/5/11/chartex" xmlns:cx6="http://schemas.microsoft.com/office/drawing/2016/5/12/chartex" xmlns:cx7="http://schemas.microsoft.com/office/drawing/2016/5/13/chartex" xmlns:cx8="http://schemas.microsoft.com/office/drawing/2016/5/14/chartex" xmlns:mc="http://schemas.openxmlformats.org/markup-compatibility/2006" xmlns:aink="http://schemas.microsoft.com/office/drawing/2016/ink" xmlns:am3d="http://schemas.microsoft.com/office/drawing/2017/model3d" xmlns:o="urn:schemas-microsoft-com:office:office" xmlns:oel="http://schemas.microsoft.com/office/2019/extlst" xmlns:r="http://schemas.openxmlformats.org/officeDocument/2006/relationships" xmlns:m="http://schemas.openxmlformats.org/officeDocument/2006/math" xmlns:v="urn:schemas-microsoft-com:vml" xmlns:wp14="http://schemas.microsoft.com/office/word/2010/wordprocessingDrawing" xmlns:wp="http://schemas.openxmlformats.org/drawingml/2006/wordprocessingDrawing" xmlns:w10="urn:schemas-microsoft-com:office:word" xmlns:w="http://schemas.openxmlformats.org/wordprocessingml/2006/main" xmlns:w14="http://schemas.microsoft.com/office/word/2010/wordml" xmlns:w15="http://schemas.microsoft.com/office/word/2012/wordml" xmlns:w16cex="http://schemas.microsoft.com/office/word/2018/wordml/cex" xmlns:w16cid="http://schemas.microsoft.com/office/word/2016/wordml/cid" xmlns:w16="http://schemas.microsoft.com/office/word/2018/wordml" xmlns:w16du="http://schemas.microsoft.com/office/word/2023/wordml/word16du" xmlns:w16sdtdh="http://schemas.microsoft.com/office/word/2020/wordml/sdtdatahash" xmlns:w16sdtfl="http://schemas.microsoft.com/office/word/2024/wordml/sdtformatlock" xmlns:w16se="http://schemas.microsoft.com/office/word/2015/wordml/symex" xmlns:wpg="http://schemas.microsoft.com/office/word/2010/wordprocessingGroup" xmlns:wpi="http://schemas.microsoft.com/office/word/2010/wordprocessingInk" xmlns:wne="http://schemas.microsoft.com/office/word/2006/wordml" xmlns:wps="http://schemas.microsoft.com/office/word/2010/wordprocessingShape" mc:Ignorable="w14 w15 w16se w16cid w16 w16cex w16sdtdh w16sdtfl w16du wp14">
   <w:body>
     <w:p>
+      <w:pPr>
+        <w:pStyle w:val="Heading1"/>
+      </w:pPr>
       <w:r>
         <w:t>Task 1: Classify Statements</w:t>
       </w:r>
@@ -1754,126 +1757,57 @@
           <w:p/>
         </w:tc>
       </w:tr>
-      <w:tr>
-        <w:tc>
-          <w:tcPr>
-            <w:tcW w:w="0" w:type="auto"/>
-            <w:tcMar>
-              <w:top w:w="30" w:type="dxa"/>
-              <w:left w:w="30" w:type="dxa"/>
-              <w:bottom w:w="30" w:type="dxa"/>
-              <w:right w:w="30" w:type="dxa"/>
-            </w:tcMar>
-            <w:vAlign w:val="center"/>
-          </w:tcPr>
-          <w:p/>
-        </w:tc>
-        <w:tc>
-          <w:tcPr>
-            <w:tcW w:w="0" w:type="auto"/>
-            <w:tcMar>
-              <w:top w:w="30" w:type="dxa"/>
-              <w:left w:w="30" w:type="dxa"/>
-              <w:bottom w:w="30" w:type="dxa"/>
-              <w:right w:w="30" w:type="dxa"/>
-            </w:tcMar>
-            <w:vAlign w:val="center"/>
-          </w:tcPr>
-          <w:p/>
-        </w:tc>
-        <w:tc>
-          <w:tcPr>
-            <w:tcW w:w="0" w:type="auto"/>
-            <w:tcMar>
-              <w:top w:w="30" w:type="dxa"/>
-              <w:left w:w="30" w:type="dxa"/>
-              <w:bottom w:w="30" w:type="dxa"/>
-              <w:right w:w="30" w:type="dxa"/>
-            </w:tcMar>
-            <w:vAlign w:val="center"/>
-          </w:tcPr>
-          <w:p/>
-        </w:tc>
-      </w:tr>
     </w:tbl>
     <w:p>
       <w:r>
+        <w:br w:type="page"/>
+      </w:r>
+      <w:r>
+        <w:lastRenderedPageBreak/>
         <w:t>Task 2: Business Problem Statement</w:t>
       </w:r>
     </w:p>
     <w:p>
       <w:r>
-        <w:t xml:space="preserve">There are a number of problems throughout this system. </w:t>
+        <w:t>There are a number of problems throughout this system. Event details, volunteer lists, equipment requests and waste arrangements are managed through email, forms and shared calendars which can cause fragmentation. Due to this, data will be spread among a number of different data collection methods and will cause confusion or missing data. Because volunteers may register individually or through schools, clubs and community organisations, duplication could occur here if someone is to register on their own, but then be registered by their school. Because Group organisers sometimes provide only estimated numbers until shortly before the event, issues could arise as if the estimated numbers differ greatly from the estimation (numbers being much higher or lower than predicted), leaders could come overprepared or worse, underprepared and not have enough equipment for the event. Equipment may be reserved across several events and can return wet, incomplete or damaged which can encourage people to not take proper care of equipment. If there is no penalty or issue with returning a broken piece of equipment, then why would anyone need to care too much about the condition of equipment, it promotes faulty equipment which can be a safety hazard. Having event leaders with different experience and training is risky, as it could allow undertrained leaders to work and potentially put equipment or others at risk.</w:t>
       </w:r>
       <w:r>
-        <w:t>Event details, volunteer lists, equipment requests and waste arrangements are managed through email, forms and shared calendars</w:t>
+        <w:t xml:space="preserve"> If a leader assignment can remain provisional while availability or permission is confirmed, it could end up having an event not have a leader available at the time of the event causing the event to be postponed, cancelled or urgently needing a new leader to take over the position. A collection vehicle may have limited access or capacity, this is a problem as if the collection vehicle does not have enough capacity required for the event, it could cause delays or if underprepared jeopardise the whole event. Weather, tides, access restrictions or insufficient leadership may cause relocation, postponement, shortening or cancellation. Anything that can risk cancelation of an event is a problem that needs to be planned around better. If messages to volunteers and partners are not always updated consistently, it can cause issues with volunteers maybe not showing on time, or at all if not correctly informed of a postponement or time change. It could also cause volunteers to show up early or on the wrong date prior to the event which will cause angry volunteers due to a lack of planning.</w:t>
+      </w:r>
+    </w:p>
+    <w:p>
+      <w:r>
+        <w:br w:type="page"/>
+      </w:r>
+    </w:p>
+    <w:p>
+      <w:pPr>
+        <w:pStyle w:val="Heading1"/>
+      </w:pPr>
+      <w:r>
+        <w:lastRenderedPageBreak/>
+        <w:t>Task 3: Define purpose and scope</w:t>
+      </w:r>
+    </w:p>
+    <w:p>
+      <w:pPr>
+        <w:pStyle w:val="Heading2"/>
+      </w:pPr>
+      <w:r>
+        <w:t>Purpose Statement</w:t>
+      </w:r>
+    </w:p>
+    <w:p>
+      <w:r>
+        <w:t xml:space="preserve">The proposed </w:t>
       </w:r>
       <w:r>
-        <w:t xml:space="preserve"> which can cause fragmentation. Due to this, data will be spread among a number of different data collection methods and will cause confusion or missing data. Because v</w:t>
+        <w:t>Kerry Coastal Clean-up Coordination Service</w:t>
       </w:r>
       <w:r>
-        <w:t>olunteers may register individually or through schools, clubs and community organisations</w:t>
-      </w:r>
-      <w:r>
-        <w:t xml:space="preserve">, duplication could occur here if someone is to register on their own, but then be registered by their school. Because </w:t>
-      </w:r>
-      <w:r>
-        <w:t>Group organisers sometimes provide only estimated numbers until shortly before the event</w:t>
-      </w:r>
-      <w:r>
-        <w:t xml:space="preserve">, issues could arise as if the estimated numbers differ greatly from the estimation (numbers being much higher or lower than predicted), leaders could come overprepared or worse, underprepared and not have enough equipment for the event. </w:t>
-      </w:r>
-      <w:r>
-        <w:t>Equipment may be reserved across several events and can return wet, incomplete or damaged</w:t>
-      </w:r>
-      <w:r>
-        <w:t xml:space="preserve"> which can encourage people to not take proper care of equipment. If there is no penalty or issue with returning a broken piece of equipment, then why would anyone need to care too much about the condition of equipment, it promotes faulty equipment which can be a safety hazard. Having e</w:t>
-      </w:r>
-      <w:r>
-        <w:t xml:space="preserve">vent leaders </w:t>
-      </w:r>
-      <w:r>
-        <w:t>with</w:t>
-      </w:r>
-      <w:r>
-        <w:t xml:space="preserve"> different experience and training</w:t>
-      </w:r>
-      <w:r>
-        <w:t xml:space="preserve"> is risky, as it could allow undertrained leaders to work and potentially put equipment or others at risk.</w:t>
-      </w:r>
-      <w:r>
-        <w:t xml:space="preserve"> If a </w:t>
-      </w:r>
-      <w:r>
-        <w:t>leader assignment can remain provisional while availability or permission is confirmed</w:t>
-      </w:r>
-      <w:r>
-        <w:t xml:space="preserve">, it could end up having an event not have a leader available at the time of the event causing the event to be postponed, cancelled or urgently needing a new leader to take over the position. </w:t>
-      </w:r>
-      <w:r>
-        <w:t>A collection vehicle may have limited access or capacity</w:t>
-      </w:r>
-      <w:r>
-        <w:t xml:space="preserve">, this is a problem as if the collection vehicle does not have enough capacity required for the event, it could cause delays or if underprepared jeopardise the whole event. </w:t>
-      </w:r>
-      <w:r>
-        <w:t>Weather, tides, access restrictions or insufficient leadership may cause relocation, postponement, shortening or cancellation</w:t>
-      </w:r>
-      <w:r>
-        <w:t>. Anything that can risk cancelation of an event is a problem that needs to be planned around better. If m</w:t>
-      </w:r>
-      <w:r>
-        <w:t>essages to volunteers and partners are not always updated consistently</w:t>
-      </w:r>
-      <w:r>
-        <w:t xml:space="preserve">, it can cause issues with volunteers maybe not showing on time, or at all if not correctly informed of a postponement or time </w:t>
-      </w:r>
-      <w:r>
-        <w:lastRenderedPageBreak/>
-        <w:t>change. It could also cause volunteers to show up early or on the wrong date prior to the event which will cause angry volunteers due to a lack of planning.</w:t>
+        <w:t xml:space="preserve"> will be used to manage and organise coastal cleaning events</w:t>
       </w:r>
     </w:p>
-    <w:p/>
     <w:sectPr>
       <w:pgSz w:w="11906" w:h="16838"/>
       <w:pgMar w:top="1440" w:right="1440" w:bottom="1440" w:left="1440" w:header="708" w:footer="708" w:gutter="0"/>
@@ -2312,7 +2246,6 @@
     <w:next w:val="Normal"/>
     <w:link w:val="Heading2Char"/>
     <w:uiPriority w:val="9"/>
-    <w:semiHidden/>
     <w:unhideWhenUsed/>
     <w:qFormat/>
     <w:rsid w:val="00270067"/>
@@ -2487,7 +2420,6 @@
   <w:style w:type="character" w:default="1" w:styleId="DefaultParagraphFont">
     <w:name w:val="Default Paragraph Font"/>
     <w:uiPriority w:val="1"/>
-    <w:semiHidden/>
     <w:unhideWhenUsed/>
   </w:style>
   <w:style w:type="table" w:default="1" w:styleId="TableNormal">
@@ -2529,7 +2461,6 @@
     <w:basedOn w:val="DefaultParagraphFont"/>
     <w:link w:val="Heading2"/>
     <w:uiPriority w:val="9"/>
-    <w:semiHidden/>
     <w:rsid w:val="00270067"/>
     <w:rPr>
       <w:rFonts w:asciiTheme="majorHAnsi" w:eastAsiaTheme="majorEastAsia" w:hAnsiTheme="majorHAnsi" w:cstheme="majorBidi"/>

</xml_diff>

<commit_message>
Began work on a number of new tasks up to Task 7, not completed all but setup the format Signed-off-by: Harvey <HarveyDanSmith@gmail.com>
</commit_message>
<xml_diff>
--- a/OOP Coastal Project.docx
+++ b/OOP Coastal Project.docx
@@ -685,7 +685,15 @@
           <w:p/>
           <w:p>
             <w:r>
-              <w:t>Creates strong likely-hood of errors such as fragmentation in the system</w:t>
+              <w:t xml:space="preserve">Creates strong </w:t>
+            </w:r>
+            <w:proofErr w:type="gramStart"/>
+            <w:r>
+              <w:t>likely-hood</w:t>
+            </w:r>
+            <w:proofErr w:type="gramEnd"/>
+            <w:r>
+              <w:t xml:space="preserve"> of errors such as fragmentation in the system</w:t>
             </w:r>
           </w:p>
         </w:tc>
@@ -1769,7 +1777,31 @@
     </w:p>
     <w:p>
       <w:r>
-        <w:t>There are a number of problems throughout this system. Event details, volunteer lists, equipment requests and waste arrangements are managed through email, forms and shared calendars which can cause fragmentation. Due to this, data will be spread among a number of different data collection methods and will cause confusion or missing data. Because volunteers may register individually or through schools, clubs and community organisations, duplication could occur here if someone is to register on their own, but then be registered by their school. Because Group organisers sometimes provide only estimated numbers until shortly before the event, issues could arise as if the estimated numbers differ greatly from the estimation (numbers being much higher or lower than predicted), leaders could come overprepared or worse, underprepared and not have enough equipment for the event. Equipment may be reserved across several events and can return wet, incomplete or damaged which can encourage people to not take proper care of equipment. If there is no penalty or issue with returning a broken piece of equipment, then why would anyone need to care too much about the condition of equipment, it promotes faulty equipment which can be a safety hazard. Having event leaders with different experience and training is risky, as it could allow undertrained leaders to work and potentially put equipment or others at risk.</w:t>
+        <w:t xml:space="preserve">There are </w:t>
+      </w:r>
+      <w:proofErr w:type="gramStart"/>
+      <w:r>
+        <w:t>a number of</w:t>
+      </w:r>
+      <w:proofErr w:type="gramEnd"/>
+      <w:r>
+        <w:t xml:space="preserve"> problems throughout this system. Event details, volunteer lists, equipment requests and waste arrangements are managed through email, forms and shared calendars which can cause fragmentation. Due to this, data will be spread among </w:t>
+      </w:r>
+      <w:proofErr w:type="gramStart"/>
+      <w:r>
+        <w:t>a number of</w:t>
+      </w:r>
+      <w:proofErr w:type="gramEnd"/>
+      <w:r>
+        <w:t xml:space="preserve"> different data collection methods and will cause confusion or missing data. Because volunteers may register individually or through schools, clubs and community organisations, duplication could occur here if someone is to register on their </w:t>
+      </w:r>
+      <w:proofErr w:type="gramStart"/>
+      <w:r>
+        <w:t>own, but</w:t>
+      </w:r>
+      <w:proofErr w:type="gramEnd"/>
+      <w:r>
+        <w:t xml:space="preserve"> then be registered by their school. Because Group organisers sometimes provide only estimated numbers until shortly before the event, issues could arise as if the estimated numbers differ greatly from the estimation (numbers being much higher or lower than predicted), leaders could come overprepared or worse, underprepared and not have enough equipment for the event. Equipment may be reserved across several events and can return wet, incomplete or damaged which can encourage people to not take proper care of equipment. If there is no penalty or issue with returning a broken piece of equipment, then why would anyone need to care too much about the condition of equipment, it promotes faulty equipment which can be a safety hazard.</w:t>
       </w:r>
       <w:r>
         <w:t xml:space="preserve"> If a leader assignment can remain provisional while availability or permission is confirmed, it could end up having an event not have a leader available at the time of the event causing the event to be postponed, cancelled or urgently needing a new leader to take over the position. A collection vehicle may have limited access or capacity, this is a problem as if the collection vehicle does not have enough capacity required for the event, it could cause delays or if underprepared jeopardise the whole event. Weather, tides, access restrictions or insufficient leadership may cause relocation, postponement, shortening or cancellation. Anything that can risk cancelation of an event is a problem that needs to be planned around better. If messages to volunteers and partners are not always updated consistently, it can cause issues with volunteers maybe not showing on time, or at all if not correctly informed of a postponement or time change. It could also cause volunteers to show up early or on the wrong date prior to the event which will cause angry volunteers due to a lack of planning.</w:t>
@@ -1807,7 +1839,2098 @@
       <w:r>
         <w:t xml:space="preserve"> will be used to manage and organise coastal cleaning events</w:t>
       </w:r>
+      <w:r>
+        <w:t>, propose new events</w:t>
+      </w:r>
+      <w:r>
+        <w:t>, host events, volunteer registration, site quality, leader and equipment assignment, waste collection and reporting on completed events</w:t>
+      </w:r>
     </w:p>
+    <w:p>
+      <w:pPr>
+        <w:pStyle w:val="Heading2"/>
+      </w:pPr>
+      <w:r>
+        <w:t>Scope Definition</w:t>
+      </w:r>
+    </w:p>
+    <w:tbl>
+      <w:tblPr>
+        <w:tblW w:w="0" w:type="auto"/>
+        <w:shd w:val="clear" w:color="auto" w:fill="FFFFFF"/>
+        <w:tblCellMar>
+          <w:top w:w="15" w:type="dxa"/>
+          <w:left w:w="15" w:type="dxa"/>
+          <w:bottom w:w="15" w:type="dxa"/>
+          <w:right w:w="15" w:type="dxa"/>
+        </w:tblCellMar>
+        <w:tblLook w:val="04A0" w:firstRow="1" w:lastRow="0" w:firstColumn="1" w:lastColumn="0" w:noHBand="0" w:noVBand="1"/>
+      </w:tblPr>
+      <w:tblGrid>
+        <w:gridCol w:w="7894"/>
+        <w:gridCol w:w="1132"/>
+      </w:tblGrid>
+      <w:tr>
+        <w:tc>
+          <w:tcPr>
+            <w:tcW w:w="4253" w:type="dxa"/>
+            <w:shd w:val="clear" w:color="auto" w:fill="FFFFFF"/>
+            <w:tcMar>
+              <w:top w:w="30" w:type="dxa"/>
+              <w:left w:w="30" w:type="dxa"/>
+              <w:bottom w:w="30" w:type="dxa"/>
+              <w:right w:w="30" w:type="dxa"/>
+            </w:tcMar>
+            <w:vAlign w:val="center"/>
+            <w:hideMark/>
+          </w:tcPr>
+          <w:tbl>
+            <w:tblPr>
+              <w:tblStyle w:val="TableGrid"/>
+              <w:tblW w:w="7824" w:type="dxa"/>
+              <w:tblLook w:val="04A0" w:firstRow="1" w:lastRow="0" w:firstColumn="1" w:lastColumn="0" w:noHBand="0" w:noVBand="1"/>
+            </w:tblPr>
+            <w:tblGrid>
+              <w:gridCol w:w="3911"/>
+              <w:gridCol w:w="3913"/>
+            </w:tblGrid>
+            <w:tr>
+              <w:trPr>
+                <w:trHeight w:val="621"/>
+              </w:trPr>
+              <w:tc>
+                <w:tcPr>
+                  <w:tcW w:w="3911" w:type="dxa"/>
+                </w:tcPr>
+                <w:p>
+                  <w:pPr>
+                    <w:jc w:val="center"/>
+                    <w:rPr>
+                      <w:b/>
+                      <w:bCs/>
+                    </w:rPr>
+                  </w:pPr>
+                  <w:r>
+                    <w:rPr>
+                      <w:b/>
+                      <w:bCs/>
+                    </w:rPr>
+                    <w:t>In Scope</w:t>
+                  </w:r>
+                </w:p>
+              </w:tc>
+              <w:tc>
+                <w:tcPr>
+                  <w:tcW w:w="3913" w:type="dxa"/>
+                </w:tcPr>
+                <w:p>
+                  <w:pPr>
+                    <w:jc w:val="center"/>
+                    <w:rPr>
+                      <w:b/>
+                      <w:bCs/>
+                    </w:rPr>
+                  </w:pPr>
+                  <w:r>
+                    <w:rPr>
+                      <w:b/>
+                      <w:bCs/>
+                    </w:rPr>
+                    <w:t xml:space="preserve">Out Of Scope </w:t>
+                  </w:r>
+                  <w:proofErr w:type="gramStart"/>
+                  <w:r>
+                    <w:rPr>
+                      <w:b/>
+                      <w:bCs/>
+                    </w:rPr>
+                    <w:t>For</w:t>
+                  </w:r>
+                  <w:proofErr w:type="gramEnd"/>
+                  <w:r>
+                    <w:rPr>
+                      <w:b/>
+                      <w:bCs/>
+                    </w:rPr>
+                    <w:t xml:space="preserve"> Initial Release</w:t>
+                  </w:r>
+                </w:p>
+              </w:tc>
+            </w:tr>
+            <w:tr>
+              <w:trPr>
+                <w:trHeight w:val="621"/>
+              </w:trPr>
+              <w:tc>
+                <w:tcPr>
+                  <w:tcW w:w="3911" w:type="dxa"/>
+                </w:tcPr>
+                <w:p>
+                  <w:r>
+                    <w:t>Volunteer registration</w:t>
+                  </w:r>
+                </w:p>
+              </w:tc>
+              <w:tc>
+                <w:tcPr>
+                  <w:tcW w:w="3913" w:type="dxa"/>
+                </w:tcPr>
+                <w:p>
+                  <w:r>
+                    <w:t>Social Media Integration</w:t>
+                  </w:r>
+                </w:p>
+              </w:tc>
+            </w:tr>
+            <w:tr>
+              <w:trPr>
+                <w:trHeight w:val="647"/>
+              </w:trPr>
+              <w:tc>
+                <w:tcPr>
+                  <w:tcW w:w="3911" w:type="dxa"/>
+                </w:tcPr>
+                <w:p>
+                  <w:r>
+                    <w:t>Leader</w:t>
+                  </w:r>
+                  <w:r>
+                    <w:t xml:space="preserve"> and equipment assignment + management</w:t>
+                  </w:r>
+                </w:p>
+              </w:tc>
+              <w:tc>
+                <w:tcPr>
+                  <w:tcW w:w="3913" w:type="dxa"/>
+                </w:tcPr>
+                <w:p>
+                  <w:r>
+                    <w:t>Emergency response and environmental enforcement</w:t>
+                  </w:r>
+                </w:p>
+              </w:tc>
+            </w:tr>
+            <w:tr>
+              <w:trPr>
+                <w:trHeight w:val="621"/>
+              </w:trPr>
+              <w:tc>
+                <w:tcPr>
+                  <w:tcW w:w="3911" w:type="dxa"/>
+                </w:tcPr>
+                <w:p>
+                  <w:r>
+                    <w:t>Messages sent out to Volunteers</w:t>
+                  </w:r>
+                </w:p>
+              </w:tc>
+              <w:tc>
+                <w:tcPr>
+                  <w:tcW w:w="3913" w:type="dxa"/>
+                </w:tcPr>
+                <w:p>
+                  <w:r>
+                    <w:t>Website design</w:t>
+                  </w:r>
+                </w:p>
+              </w:tc>
+            </w:tr>
+            <w:tr>
+              <w:trPr>
+                <w:trHeight w:val="621"/>
+              </w:trPr>
+              <w:tc>
+                <w:tcPr>
+                  <w:tcW w:w="3911" w:type="dxa"/>
+                </w:tcPr>
+                <w:p>
+                  <w:r>
+                    <w:t>Reporting post event</w:t>
+                  </w:r>
+                </w:p>
+              </w:tc>
+              <w:tc>
+                <w:tcPr>
+                  <w:tcW w:w="3913" w:type="dxa"/>
+                </w:tcPr>
+                <w:p>
+                  <w:r>
+                    <w:t>Advertising/Marketing campaign</w:t>
+                  </w:r>
+                </w:p>
+              </w:tc>
+            </w:tr>
+            <w:tr>
+              <w:trPr>
+                <w:trHeight w:val="621"/>
+              </w:trPr>
+              <w:tc>
+                <w:tcPr>
+                  <w:tcW w:w="3911" w:type="dxa"/>
+                </w:tcPr>
+                <w:p>
+                  <w:r>
+                    <w:t>Waste Collection</w:t>
+                  </w:r>
+                </w:p>
+              </w:tc>
+              <w:tc>
+                <w:tcPr>
+                  <w:tcW w:w="3913" w:type="dxa"/>
+                </w:tcPr>
+                <w:p>
+                  <w:r>
+                    <w:t>Volunteer Pay</w:t>
+                  </w:r>
+                </w:p>
+              </w:tc>
+            </w:tr>
+          </w:tbl>
+          <w:p>
+            <w:pPr>
+              <w:rPr>
+                <w:b/>
+                <w:bCs/>
+              </w:rPr>
+            </w:pPr>
+          </w:p>
+        </w:tc>
+        <w:tc>
+          <w:tcPr>
+            <w:tcW w:w="3402" w:type="dxa"/>
+            <w:shd w:val="clear" w:color="auto" w:fill="FFFFFF"/>
+            <w:tcMar>
+              <w:top w:w="30" w:type="dxa"/>
+              <w:left w:w="30" w:type="dxa"/>
+              <w:bottom w:w="30" w:type="dxa"/>
+              <w:right w:w="30" w:type="dxa"/>
+            </w:tcMar>
+            <w:vAlign w:val="center"/>
+            <w:hideMark/>
+          </w:tcPr>
+          <w:p>
+            <w:pPr>
+              <w:rPr>
+                <w:b/>
+                <w:bCs/>
+              </w:rPr>
+            </w:pPr>
+          </w:p>
+        </w:tc>
+      </w:tr>
+    </w:tbl>
+    <w:p/>
+    <w:p>
+      <w:r>
+        <w:br w:type="page"/>
+      </w:r>
+    </w:p>
+    <w:p>
+      <w:pPr>
+        <w:pStyle w:val="Heading1"/>
+      </w:pPr>
+      <w:r>
+        <w:lastRenderedPageBreak/>
+        <w:t>Task 4: Stakeholder Analysis</w:t>
+      </w:r>
+    </w:p>
+    <w:tbl>
+      <w:tblPr>
+        <w:tblStyle w:val="TableGrid"/>
+        <w:tblW w:w="11340" w:type="dxa"/>
+        <w:tblInd w:w="-1139" w:type="dxa"/>
+        <w:tblLook w:val="04A0" w:firstRow="1" w:lastRow="0" w:firstColumn="1" w:lastColumn="0" w:noHBand="0" w:noVBand="1"/>
+      </w:tblPr>
+      <w:tblGrid>
+        <w:gridCol w:w="1667"/>
+        <w:gridCol w:w="3781"/>
+        <w:gridCol w:w="2563"/>
+        <w:gridCol w:w="1290"/>
+        <w:gridCol w:w="2039"/>
+      </w:tblGrid>
+      <w:tr>
+        <w:tc>
+          <w:tcPr>
+            <w:tcW w:w="1667" w:type="dxa"/>
+          </w:tcPr>
+          <w:p>
+            <w:pPr>
+              <w:jc w:val="center"/>
+              <w:rPr>
+                <w:b/>
+                <w:bCs/>
+              </w:rPr>
+            </w:pPr>
+            <w:r>
+              <w:rPr>
+                <w:b/>
+                <w:bCs/>
+              </w:rPr>
+              <w:t>Stakeholders</w:t>
+            </w:r>
+          </w:p>
+        </w:tc>
+        <w:tc>
+          <w:tcPr>
+            <w:tcW w:w="3781" w:type="dxa"/>
+          </w:tcPr>
+          <w:p>
+            <w:pPr>
+              <w:jc w:val="center"/>
+              <w:rPr>
+                <w:b/>
+                <w:bCs/>
+              </w:rPr>
+            </w:pPr>
+            <w:r>
+              <w:rPr>
+                <w:b/>
+                <w:bCs/>
+              </w:rPr>
+              <w:t>Goals</w:t>
+            </w:r>
+          </w:p>
+        </w:tc>
+        <w:tc>
+          <w:tcPr>
+            <w:tcW w:w="2563" w:type="dxa"/>
+          </w:tcPr>
+          <w:p>
+            <w:pPr>
+              <w:jc w:val="center"/>
+              <w:rPr>
+                <w:b/>
+                <w:bCs/>
+              </w:rPr>
+            </w:pPr>
+            <w:r>
+              <w:rPr>
+                <w:b/>
+                <w:bCs/>
+              </w:rPr>
+              <w:t>Concerns</w:t>
+            </w:r>
+          </w:p>
+        </w:tc>
+        <w:tc>
+          <w:tcPr>
+            <w:tcW w:w="1290" w:type="dxa"/>
+          </w:tcPr>
+          <w:p>
+            <w:pPr>
+              <w:jc w:val="center"/>
+              <w:rPr>
+                <w:b/>
+                <w:bCs/>
+              </w:rPr>
+            </w:pPr>
+            <w:r>
+              <w:rPr>
+                <w:b/>
+                <w:bCs/>
+              </w:rPr>
+              <w:t>Influence</w:t>
+            </w:r>
+          </w:p>
+        </w:tc>
+        <w:tc>
+          <w:tcPr>
+            <w:tcW w:w="2039" w:type="dxa"/>
+          </w:tcPr>
+          <w:p>
+            <w:pPr>
+              <w:jc w:val="center"/>
+              <w:rPr>
+                <w:b/>
+                <w:bCs/>
+              </w:rPr>
+            </w:pPr>
+            <w:r>
+              <w:rPr>
+                <w:b/>
+                <w:bCs/>
+              </w:rPr>
+              <w:t>Expected Interaction</w:t>
+            </w:r>
+          </w:p>
+        </w:tc>
+      </w:tr>
+      <w:tr>
+        <w:tc>
+          <w:tcPr>
+            <w:tcW w:w="1667" w:type="dxa"/>
+          </w:tcPr>
+          <w:p>
+            <w:pPr>
+              <w:rPr>
+                <w:sz w:val="20"/>
+                <w:szCs w:val="20"/>
+              </w:rPr>
+            </w:pPr>
+            <w:r>
+              <w:rPr>
+                <w:sz w:val="20"/>
+                <w:szCs w:val="20"/>
+              </w:rPr>
+              <w:t>Coordinator</w:t>
+            </w:r>
+          </w:p>
+        </w:tc>
+        <w:tc>
+          <w:tcPr>
+            <w:tcW w:w="3781" w:type="dxa"/>
+          </w:tcPr>
+          <w:p>
+            <w:pPr>
+              <w:rPr>
+                <w:sz w:val="20"/>
+                <w:szCs w:val="20"/>
+              </w:rPr>
+            </w:pPr>
+            <w:r>
+              <w:rPr>
+                <w:sz w:val="20"/>
+                <w:szCs w:val="20"/>
+              </w:rPr>
+              <w:t>Coordinate and manage events</w:t>
+            </w:r>
+            <w:r>
+              <w:rPr>
+                <w:sz w:val="20"/>
+                <w:szCs w:val="20"/>
+              </w:rPr>
+              <w:t>, notify relevant parties of events</w:t>
+            </w:r>
+          </w:p>
+        </w:tc>
+        <w:tc>
+          <w:tcPr>
+            <w:tcW w:w="2563" w:type="dxa"/>
+          </w:tcPr>
+          <w:p>
+            <w:pPr>
+              <w:rPr>
+                <w:sz w:val="20"/>
+                <w:szCs w:val="20"/>
+              </w:rPr>
+            </w:pPr>
+          </w:p>
+        </w:tc>
+        <w:tc>
+          <w:tcPr>
+            <w:tcW w:w="1290" w:type="dxa"/>
+          </w:tcPr>
+          <w:p>
+            <w:pPr>
+              <w:rPr>
+                <w:sz w:val="20"/>
+                <w:szCs w:val="20"/>
+              </w:rPr>
+            </w:pPr>
+            <w:r>
+              <w:rPr>
+                <w:sz w:val="20"/>
+                <w:szCs w:val="20"/>
+              </w:rPr>
+              <w:t>High</w:t>
+            </w:r>
+          </w:p>
+        </w:tc>
+        <w:tc>
+          <w:tcPr>
+            <w:tcW w:w="2039" w:type="dxa"/>
+          </w:tcPr>
+          <w:p>
+            <w:pPr>
+              <w:rPr>
+                <w:sz w:val="20"/>
+                <w:szCs w:val="20"/>
+              </w:rPr>
+            </w:pPr>
+            <w:r>
+              <w:rPr>
+                <w:sz w:val="20"/>
+                <w:szCs w:val="20"/>
+              </w:rPr>
+              <w:t>Input and edit information regarding events</w:t>
+            </w:r>
+          </w:p>
+        </w:tc>
+      </w:tr>
+      <w:tr>
+        <w:tc>
+          <w:tcPr>
+            <w:tcW w:w="1667" w:type="dxa"/>
+          </w:tcPr>
+          <w:p>
+            <w:pPr>
+              <w:rPr>
+                <w:sz w:val="20"/>
+                <w:szCs w:val="20"/>
+              </w:rPr>
+            </w:pPr>
+            <w:r>
+              <w:rPr>
+                <w:sz w:val="20"/>
+                <w:szCs w:val="20"/>
+              </w:rPr>
+              <w:t>Volunteer</w:t>
+            </w:r>
+          </w:p>
+        </w:tc>
+        <w:tc>
+          <w:tcPr>
+            <w:tcW w:w="3781" w:type="dxa"/>
+          </w:tcPr>
+          <w:p>
+            <w:pPr>
+              <w:rPr>
+                <w:sz w:val="20"/>
+                <w:szCs w:val="20"/>
+              </w:rPr>
+            </w:pPr>
+            <w:r>
+              <w:rPr>
+                <w:sz w:val="20"/>
+                <w:szCs w:val="20"/>
+              </w:rPr>
+              <w:t>Register for events and receive</w:t>
+            </w:r>
+            <w:r>
+              <w:rPr>
+                <w:sz w:val="20"/>
+                <w:szCs w:val="20"/>
+              </w:rPr>
+              <w:t xml:space="preserve"> </w:t>
+            </w:r>
+            <w:r>
+              <w:rPr>
+                <w:sz w:val="20"/>
+                <w:szCs w:val="20"/>
+              </w:rPr>
+              <w:t>information on times, dates and location</w:t>
+            </w:r>
+          </w:p>
+        </w:tc>
+        <w:tc>
+          <w:tcPr>
+            <w:tcW w:w="2563" w:type="dxa"/>
+          </w:tcPr>
+          <w:p>
+            <w:pPr>
+              <w:rPr>
+                <w:sz w:val="20"/>
+                <w:szCs w:val="20"/>
+              </w:rPr>
+            </w:pPr>
+            <w:r>
+              <w:rPr>
+                <w:sz w:val="20"/>
+                <w:szCs w:val="20"/>
+              </w:rPr>
+              <w:t>Is this information accurate? Will it change? Will I be notified?</w:t>
+            </w:r>
+          </w:p>
+        </w:tc>
+        <w:tc>
+          <w:tcPr>
+            <w:tcW w:w="1290" w:type="dxa"/>
+          </w:tcPr>
+          <w:p>
+            <w:pPr>
+              <w:rPr>
+                <w:sz w:val="20"/>
+                <w:szCs w:val="20"/>
+              </w:rPr>
+            </w:pPr>
+            <w:r>
+              <w:rPr>
+                <w:sz w:val="20"/>
+                <w:szCs w:val="20"/>
+              </w:rPr>
+              <w:t xml:space="preserve">Medium </w:t>
+            </w:r>
+          </w:p>
+        </w:tc>
+        <w:tc>
+          <w:tcPr>
+            <w:tcW w:w="2039" w:type="dxa"/>
+          </w:tcPr>
+          <w:p>
+            <w:pPr>
+              <w:rPr>
+                <w:sz w:val="20"/>
+                <w:szCs w:val="20"/>
+              </w:rPr>
+            </w:pPr>
+            <w:r>
+              <w:rPr>
+                <w:sz w:val="20"/>
+                <w:szCs w:val="20"/>
+              </w:rPr>
+              <w:t>Register and view event information</w:t>
+            </w:r>
+          </w:p>
+        </w:tc>
+      </w:tr>
+      <w:tr>
+        <w:tc>
+          <w:tcPr>
+            <w:tcW w:w="1667" w:type="dxa"/>
+          </w:tcPr>
+          <w:p>
+            <w:pPr>
+              <w:rPr>
+                <w:sz w:val="20"/>
+                <w:szCs w:val="20"/>
+              </w:rPr>
+            </w:pPr>
+            <w:r>
+              <w:rPr>
+                <w:sz w:val="20"/>
+                <w:szCs w:val="20"/>
+              </w:rPr>
+              <w:t>Event Leader</w:t>
+            </w:r>
+          </w:p>
+        </w:tc>
+        <w:tc>
+          <w:tcPr>
+            <w:tcW w:w="3781" w:type="dxa"/>
+          </w:tcPr>
+          <w:p>
+            <w:pPr>
+              <w:rPr>
+                <w:sz w:val="20"/>
+                <w:szCs w:val="20"/>
+              </w:rPr>
+            </w:pPr>
+          </w:p>
+        </w:tc>
+        <w:tc>
+          <w:tcPr>
+            <w:tcW w:w="2563" w:type="dxa"/>
+          </w:tcPr>
+          <w:p>
+            <w:pPr>
+              <w:rPr>
+                <w:sz w:val="20"/>
+                <w:szCs w:val="20"/>
+              </w:rPr>
+            </w:pPr>
+          </w:p>
+        </w:tc>
+        <w:tc>
+          <w:tcPr>
+            <w:tcW w:w="1290" w:type="dxa"/>
+          </w:tcPr>
+          <w:p>
+            <w:pPr>
+              <w:rPr>
+                <w:sz w:val="20"/>
+                <w:szCs w:val="20"/>
+              </w:rPr>
+            </w:pPr>
+            <w:r>
+              <w:rPr>
+                <w:sz w:val="20"/>
+                <w:szCs w:val="20"/>
+              </w:rPr>
+              <w:t>High</w:t>
+            </w:r>
+          </w:p>
+        </w:tc>
+        <w:tc>
+          <w:tcPr>
+            <w:tcW w:w="2039" w:type="dxa"/>
+          </w:tcPr>
+          <w:p>
+            <w:pPr>
+              <w:rPr>
+                <w:sz w:val="20"/>
+                <w:szCs w:val="20"/>
+              </w:rPr>
+            </w:pPr>
+          </w:p>
+        </w:tc>
+      </w:tr>
+      <w:tr>
+        <w:tc>
+          <w:tcPr>
+            <w:tcW w:w="1667" w:type="dxa"/>
+          </w:tcPr>
+          <w:p>
+            <w:pPr>
+              <w:rPr>
+                <w:sz w:val="20"/>
+                <w:szCs w:val="20"/>
+              </w:rPr>
+            </w:pPr>
+            <w:r>
+              <w:rPr>
+                <w:sz w:val="20"/>
+                <w:szCs w:val="20"/>
+              </w:rPr>
+              <w:t>Waste Partner</w:t>
+            </w:r>
+          </w:p>
+        </w:tc>
+        <w:tc>
+          <w:tcPr>
+            <w:tcW w:w="3781" w:type="dxa"/>
+          </w:tcPr>
+          <w:p>
+            <w:pPr>
+              <w:rPr>
+                <w:sz w:val="20"/>
+                <w:szCs w:val="20"/>
+              </w:rPr>
+            </w:pPr>
+            <w:r>
+              <w:rPr>
+                <w:sz w:val="20"/>
+                <w:szCs w:val="20"/>
+              </w:rPr>
+              <w:t>Receive information on waste types and estimated waste amounts</w:t>
+            </w:r>
+          </w:p>
+        </w:tc>
+        <w:tc>
+          <w:tcPr>
+            <w:tcW w:w="2563" w:type="dxa"/>
+          </w:tcPr>
+          <w:p>
+            <w:pPr>
+              <w:rPr>
+                <w:sz w:val="20"/>
+                <w:szCs w:val="20"/>
+              </w:rPr>
+            </w:pPr>
+            <w:r>
+              <w:rPr>
+                <w:sz w:val="20"/>
+                <w:szCs w:val="20"/>
+              </w:rPr>
+              <w:t xml:space="preserve">Are waste estimate figures accurate? </w:t>
+            </w:r>
+          </w:p>
+        </w:tc>
+        <w:tc>
+          <w:tcPr>
+            <w:tcW w:w="1290" w:type="dxa"/>
+          </w:tcPr>
+          <w:p>
+            <w:pPr>
+              <w:rPr>
+                <w:sz w:val="20"/>
+                <w:szCs w:val="20"/>
+              </w:rPr>
+            </w:pPr>
+            <w:r>
+              <w:rPr>
+                <w:sz w:val="20"/>
+                <w:szCs w:val="20"/>
+              </w:rPr>
+              <w:t>Low</w:t>
+            </w:r>
+          </w:p>
+        </w:tc>
+        <w:tc>
+          <w:tcPr>
+            <w:tcW w:w="2039" w:type="dxa"/>
+          </w:tcPr>
+          <w:p>
+            <w:pPr>
+              <w:rPr>
+                <w:sz w:val="20"/>
+                <w:szCs w:val="20"/>
+              </w:rPr>
+            </w:pPr>
+            <w:r>
+              <w:rPr>
+                <w:sz w:val="20"/>
+                <w:szCs w:val="20"/>
+              </w:rPr>
+              <w:t>Check waste types and waste amounts for events</w:t>
+            </w:r>
+          </w:p>
+        </w:tc>
+      </w:tr>
+      <w:tr>
+        <w:tc>
+          <w:tcPr>
+            <w:tcW w:w="1667" w:type="dxa"/>
+          </w:tcPr>
+          <w:p>
+            <w:pPr>
+              <w:rPr>
+                <w:sz w:val="20"/>
+                <w:szCs w:val="20"/>
+              </w:rPr>
+            </w:pPr>
+            <w:r>
+              <w:rPr>
+                <w:sz w:val="20"/>
+                <w:szCs w:val="20"/>
+              </w:rPr>
+              <w:t>Group Organiser</w:t>
+            </w:r>
+          </w:p>
+        </w:tc>
+        <w:tc>
+          <w:tcPr>
+            <w:tcW w:w="3781" w:type="dxa"/>
+          </w:tcPr>
+          <w:p>
+            <w:pPr>
+              <w:rPr>
+                <w:sz w:val="20"/>
+                <w:szCs w:val="20"/>
+              </w:rPr>
+            </w:pPr>
+            <w:r>
+              <w:rPr>
+                <w:sz w:val="20"/>
+                <w:szCs w:val="20"/>
+              </w:rPr>
+              <w:t>Organise groups of volunteers and assign them to specific events</w:t>
+            </w:r>
+          </w:p>
+        </w:tc>
+        <w:tc>
+          <w:tcPr>
+            <w:tcW w:w="2563" w:type="dxa"/>
+          </w:tcPr>
+          <w:p>
+            <w:pPr>
+              <w:rPr>
+                <w:sz w:val="20"/>
+                <w:szCs w:val="20"/>
+              </w:rPr>
+            </w:pPr>
+          </w:p>
+        </w:tc>
+        <w:tc>
+          <w:tcPr>
+            <w:tcW w:w="1290" w:type="dxa"/>
+          </w:tcPr>
+          <w:p>
+            <w:pPr>
+              <w:rPr>
+                <w:sz w:val="20"/>
+                <w:szCs w:val="20"/>
+              </w:rPr>
+            </w:pPr>
+            <w:r>
+              <w:rPr>
+                <w:sz w:val="20"/>
+                <w:szCs w:val="20"/>
+              </w:rPr>
+              <w:t>High</w:t>
+            </w:r>
+          </w:p>
+        </w:tc>
+        <w:tc>
+          <w:tcPr>
+            <w:tcW w:w="2039" w:type="dxa"/>
+          </w:tcPr>
+          <w:p>
+            <w:pPr>
+              <w:rPr>
+                <w:sz w:val="20"/>
+                <w:szCs w:val="20"/>
+              </w:rPr>
+            </w:pPr>
+          </w:p>
+        </w:tc>
+      </w:tr>
+      <w:tr>
+        <w:tc>
+          <w:tcPr>
+            <w:tcW w:w="1667" w:type="dxa"/>
+          </w:tcPr>
+          <w:p>
+            <w:pPr>
+              <w:rPr>
+                <w:sz w:val="20"/>
+                <w:szCs w:val="20"/>
+              </w:rPr>
+            </w:pPr>
+            <w:r>
+              <w:rPr>
+                <w:sz w:val="20"/>
+                <w:szCs w:val="20"/>
+              </w:rPr>
+              <w:t>Equipment Volunteer</w:t>
+            </w:r>
+          </w:p>
+        </w:tc>
+        <w:tc>
+          <w:tcPr>
+            <w:tcW w:w="3781" w:type="dxa"/>
+          </w:tcPr>
+          <w:p>
+            <w:pPr>
+              <w:rPr>
+                <w:sz w:val="20"/>
+                <w:szCs w:val="20"/>
+              </w:rPr>
+            </w:pPr>
+            <w:r>
+              <w:rPr>
+                <w:sz w:val="20"/>
+                <w:szCs w:val="20"/>
+              </w:rPr>
+              <w:t xml:space="preserve">View equipment inventory, and  </w:t>
+            </w:r>
+          </w:p>
+        </w:tc>
+        <w:tc>
+          <w:tcPr>
+            <w:tcW w:w="2563" w:type="dxa"/>
+          </w:tcPr>
+          <w:p>
+            <w:pPr>
+              <w:rPr>
+                <w:sz w:val="20"/>
+                <w:szCs w:val="20"/>
+              </w:rPr>
+            </w:pPr>
+            <w:r>
+              <w:rPr>
+                <w:sz w:val="20"/>
+                <w:szCs w:val="20"/>
+              </w:rPr>
+              <w:t>Equipment may be returned still wet, incomplete or unsuitable for next event</w:t>
+            </w:r>
+          </w:p>
+        </w:tc>
+        <w:tc>
+          <w:tcPr>
+            <w:tcW w:w="1290" w:type="dxa"/>
+          </w:tcPr>
+          <w:p>
+            <w:pPr>
+              <w:rPr>
+                <w:sz w:val="20"/>
+                <w:szCs w:val="20"/>
+              </w:rPr>
+            </w:pPr>
+            <w:r>
+              <w:rPr>
+                <w:sz w:val="20"/>
+                <w:szCs w:val="20"/>
+              </w:rPr>
+              <w:t>Low</w:t>
+            </w:r>
+          </w:p>
+        </w:tc>
+        <w:tc>
+          <w:tcPr>
+            <w:tcW w:w="2039" w:type="dxa"/>
+          </w:tcPr>
+          <w:p>
+            <w:pPr>
+              <w:rPr>
+                <w:sz w:val="20"/>
+                <w:szCs w:val="20"/>
+              </w:rPr>
+            </w:pPr>
+          </w:p>
+        </w:tc>
+      </w:tr>
+    </w:tbl>
+    <w:p/>
+    <w:p>
+      <w:r>
+        <w:br w:type="page"/>
+      </w:r>
+    </w:p>
+    <w:p>
+      <w:pPr>
+        <w:pStyle w:val="Heading1"/>
+      </w:pPr>
+      <w:r>
+        <w:lastRenderedPageBreak/>
+        <w:t>Task 5: Functional Requirements</w:t>
+      </w:r>
+    </w:p>
+    <w:tbl>
+      <w:tblPr>
+        <w:tblStyle w:val="TableGrid"/>
+        <w:tblW w:w="9351" w:type="dxa"/>
+        <w:tblLook w:val="04A0" w:firstRow="1" w:lastRow="0" w:firstColumn="1" w:lastColumn="0" w:noHBand="0" w:noVBand="1"/>
+      </w:tblPr>
+      <w:tblGrid>
+        <w:gridCol w:w="656"/>
+        <w:gridCol w:w="4958"/>
+        <w:gridCol w:w="1187"/>
+        <w:gridCol w:w="2550"/>
+      </w:tblGrid>
+      <w:tr>
+        <w:tc>
+          <w:tcPr>
+            <w:tcW w:w="656" w:type="dxa"/>
+          </w:tcPr>
+          <w:p>
+            <w:r>
+              <w:t>ID</w:t>
+            </w:r>
+          </w:p>
+        </w:tc>
+        <w:tc>
+          <w:tcPr>
+            <w:tcW w:w="4958" w:type="dxa"/>
+          </w:tcPr>
+          <w:p>
+            <w:r>
+              <w:t>Functional Requirement</w:t>
+            </w:r>
+          </w:p>
+        </w:tc>
+        <w:tc>
+          <w:tcPr>
+            <w:tcW w:w="1187" w:type="dxa"/>
+          </w:tcPr>
+          <w:p>
+            <w:proofErr w:type="spellStart"/>
+            <w:r>
+              <w:t>MoSCoW</w:t>
+            </w:r>
+            <w:proofErr w:type="spellEnd"/>
+          </w:p>
+        </w:tc>
+        <w:tc>
+          <w:tcPr>
+            <w:tcW w:w="2550" w:type="dxa"/>
+          </w:tcPr>
+          <w:p>
+            <w:r>
+              <w:t xml:space="preserve">Source/Rationale </w:t>
+            </w:r>
+          </w:p>
+        </w:tc>
+      </w:tr>
+      <w:tr>
+        <w:tc>
+          <w:tcPr>
+            <w:tcW w:w="656" w:type="dxa"/>
+          </w:tcPr>
+          <w:p>
+            <w:pPr>
+              <w:rPr>
+                <w:sz w:val="20"/>
+                <w:szCs w:val="20"/>
+              </w:rPr>
+            </w:pPr>
+            <w:r>
+              <w:rPr>
+                <w:sz w:val="20"/>
+                <w:szCs w:val="20"/>
+              </w:rPr>
+              <w:t>FR01</w:t>
+            </w:r>
+          </w:p>
+        </w:tc>
+        <w:tc>
+          <w:tcPr>
+            <w:tcW w:w="4958" w:type="dxa"/>
+          </w:tcPr>
+          <w:p>
+            <w:pPr>
+              <w:rPr>
+                <w:sz w:val="20"/>
+                <w:szCs w:val="20"/>
+              </w:rPr>
+            </w:pPr>
+            <w:r>
+              <w:rPr>
+                <w:sz w:val="20"/>
+                <w:szCs w:val="20"/>
+              </w:rPr>
+              <w:t>A proposed event should not be advertised as confirmed until required checks are complete</w:t>
+            </w:r>
+          </w:p>
+        </w:tc>
+        <w:tc>
+          <w:tcPr>
+            <w:tcW w:w="1187" w:type="dxa"/>
+          </w:tcPr>
+          <w:p>
+            <w:pPr>
+              <w:rPr>
+                <w:sz w:val="20"/>
+                <w:szCs w:val="20"/>
+              </w:rPr>
+            </w:pPr>
+            <w:r>
+              <w:rPr>
+                <w:sz w:val="20"/>
+                <w:szCs w:val="20"/>
+              </w:rPr>
+              <w:t>Must</w:t>
+            </w:r>
+          </w:p>
+        </w:tc>
+        <w:tc>
+          <w:tcPr>
+            <w:tcW w:w="2550" w:type="dxa"/>
+          </w:tcPr>
+          <w:p>
+            <w:pPr>
+              <w:rPr>
+                <w:sz w:val="20"/>
+                <w:szCs w:val="20"/>
+              </w:rPr>
+            </w:pPr>
+            <w:r>
+              <w:rPr>
+                <w:b/>
+                <w:bCs/>
+                <w:sz w:val="20"/>
+                <w:szCs w:val="20"/>
+              </w:rPr>
+              <w:t>Coordinator</w:t>
+            </w:r>
+            <w:r>
+              <w:rPr>
+                <w:sz w:val="20"/>
+                <w:szCs w:val="20"/>
+              </w:rPr>
+              <w:t xml:space="preserve"> - Stake Holder Evidence</w:t>
+            </w:r>
+          </w:p>
+        </w:tc>
+      </w:tr>
+      <w:tr>
+        <w:tc>
+          <w:tcPr>
+            <w:tcW w:w="656" w:type="dxa"/>
+          </w:tcPr>
+          <w:p>
+            <w:pPr>
+              <w:rPr>
+                <w:sz w:val="20"/>
+                <w:szCs w:val="20"/>
+              </w:rPr>
+            </w:pPr>
+            <w:r>
+              <w:rPr>
+                <w:sz w:val="20"/>
+                <w:szCs w:val="20"/>
+              </w:rPr>
+              <w:t>FR02</w:t>
+            </w:r>
+          </w:p>
+        </w:tc>
+        <w:tc>
+          <w:tcPr>
+            <w:tcW w:w="4958" w:type="dxa"/>
+          </w:tcPr>
+          <w:p>
+            <w:pPr>
+              <w:rPr>
+                <w:sz w:val="20"/>
+                <w:szCs w:val="20"/>
+              </w:rPr>
+            </w:pPr>
+            <w:r>
+              <w:rPr>
+                <w:sz w:val="20"/>
+                <w:szCs w:val="20"/>
+              </w:rPr>
+              <w:t>Registrations may include practical accessibility, communication and supervision requirements</w:t>
+            </w:r>
+          </w:p>
+        </w:tc>
+        <w:tc>
+          <w:tcPr>
+            <w:tcW w:w="1187" w:type="dxa"/>
+          </w:tcPr>
+          <w:p>
+            <w:pPr>
+              <w:rPr>
+                <w:sz w:val="20"/>
+                <w:szCs w:val="20"/>
+              </w:rPr>
+            </w:pPr>
+            <w:r>
+              <w:rPr>
+                <w:sz w:val="20"/>
+                <w:szCs w:val="20"/>
+              </w:rPr>
+              <w:t>Should</w:t>
+            </w:r>
+          </w:p>
+        </w:tc>
+        <w:tc>
+          <w:tcPr>
+            <w:tcW w:w="2550" w:type="dxa"/>
+          </w:tcPr>
+          <w:p>
+            <w:pPr>
+              <w:rPr>
+                <w:sz w:val="20"/>
+                <w:szCs w:val="20"/>
+              </w:rPr>
+            </w:pPr>
+            <w:r>
+              <w:rPr>
+                <w:b/>
+                <w:bCs/>
+                <w:sz w:val="20"/>
+                <w:szCs w:val="20"/>
+              </w:rPr>
+              <w:t>Scenario</w:t>
+            </w:r>
+            <w:r>
+              <w:rPr>
+                <w:sz w:val="20"/>
+                <w:szCs w:val="20"/>
+              </w:rPr>
+              <w:t xml:space="preserve"> – Volunteers and group arrangements</w:t>
+            </w:r>
+          </w:p>
+        </w:tc>
+      </w:tr>
+      <w:tr>
+        <w:tc>
+          <w:tcPr>
+            <w:tcW w:w="656" w:type="dxa"/>
+          </w:tcPr>
+          <w:p>
+            <w:pPr>
+              <w:rPr>
+                <w:sz w:val="20"/>
+                <w:szCs w:val="20"/>
+              </w:rPr>
+            </w:pPr>
+            <w:r>
+              <w:rPr>
+                <w:sz w:val="20"/>
+                <w:szCs w:val="20"/>
+              </w:rPr>
+              <w:t>FR03</w:t>
+            </w:r>
+          </w:p>
+        </w:tc>
+        <w:tc>
+          <w:tcPr>
+            <w:tcW w:w="4958" w:type="dxa"/>
+          </w:tcPr>
+          <w:p>
+            <w:pPr>
+              <w:rPr>
+                <w:sz w:val="20"/>
+                <w:szCs w:val="20"/>
+              </w:rPr>
+            </w:pPr>
+            <w:r>
+              <w:rPr>
+                <w:sz w:val="20"/>
+                <w:szCs w:val="20"/>
+              </w:rPr>
+              <w:t>Event leaders need enough information to prepare safely without receiving unnecessary personal details</w:t>
+            </w:r>
+          </w:p>
+        </w:tc>
+        <w:tc>
+          <w:tcPr>
+            <w:tcW w:w="1187" w:type="dxa"/>
+          </w:tcPr>
+          <w:p>
+            <w:pPr>
+              <w:rPr>
+                <w:sz w:val="20"/>
+                <w:szCs w:val="20"/>
+              </w:rPr>
+            </w:pPr>
+            <w:r>
+              <w:rPr>
+                <w:sz w:val="20"/>
+                <w:szCs w:val="20"/>
+              </w:rPr>
+              <w:t>Must</w:t>
+            </w:r>
+          </w:p>
+        </w:tc>
+        <w:tc>
+          <w:tcPr>
+            <w:tcW w:w="2550" w:type="dxa"/>
+          </w:tcPr>
+          <w:p>
+            <w:pPr>
+              <w:rPr>
+                <w:sz w:val="20"/>
+                <w:szCs w:val="20"/>
+              </w:rPr>
+            </w:pPr>
+            <w:r>
+              <w:rPr>
+                <w:b/>
+                <w:bCs/>
+                <w:sz w:val="20"/>
+                <w:szCs w:val="20"/>
+              </w:rPr>
+              <w:t>Scenario</w:t>
+            </w:r>
+            <w:r>
+              <w:rPr>
+                <w:sz w:val="20"/>
+                <w:szCs w:val="20"/>
+              </w:rPr>
+              <w:t xml:space="preserve"> – Volunteers and group arrangements</w:t>
+            </w:r>
+          </w:p>
+        </w:tc>
+      </w:tr>
+      <w:tr>
+        <w:tc>
+          <w:tcPr>
+            <w:tcW w:w="656" w:type="dxa"/>
+          </w:tcPr>
+          <w:p>
+            <w:pPr>
+              <w:rPr>
+                <w:sz w:val="20"/>
+                <w:szCs w:val="20"/>
+              </w:rPr>
+            </w:pPr>
+            <w:r>
+              <w:rPr>
+                <w:sz w:val="20"/>
+                <w:szCs w:val="20"/>
+              </w:rPr>
+              <w:t>FR04</w:t>
+            </w:r>
+          </w:p>
+        </w:tc>
+        <w:tc>
+          <w:tcPr>
+            <w:tcW w:w="4958" w:type="dxa"/>
+          </w:tcPr>
+          <w:p>
+            <w:pPr>
+              <w:rPr>
+                <w:sz w:val="20"/>
+                <w:szCs w:val="20"/>
+              </w:rPr>
+            </w:pPr>
+            <w:r>
+              <w:rPr>
+                <w:sz w:val="20"/>
+                <w:szCs w:val="20"/>
+              </w:rPr>
+              <w:t>Events require gloves, litter pickers, bags, high-visibility clothing, first-aid supplies and sometimes specialist containers</w:t>
+            </w:r>
+          </w:p>
+        </w:tc>
+        <w:tc>
+          <w:tcPr>
+            <w:tcW w:w="1187" w:type="dxa"/>
+          </w:tcPr>
+          <w:p>
+            <w:pPr>
+              <w:rPr>
+                <w:sz w:val="20"/>
+                <w:szCs w:val="20"/>
+              </w:rPr>
+            </w:pPr>
+            <w:r>
+              <w:rPr>
+                <w:sz w:val="20"/>
+                <w:szCs w:val="20"/>
+              </w:rPr>
+              <w:t>Must</w:t>
+            </w:r>
+          </w:p>
+        </w:tc>
+        <w:tc>
+          <w:tcPr>
+            <w:tcW w:w="2550" w:type="dxa"/>
+          </w:tcPr>
+          <w:p>
+            <w:pPr>
+              <w:rPr>
+                <w:sz w:val="20"/>
+                <w:szCs w:val="20"/>
+              </w:rPr>
+            </w:pPr>
+            <w:r>
+              <w:rPr>
+                <w:b/>
+                <w:bCs/>
+                <w:sz w:val="20"/>
+                <w:szCs w:val="20"/>
+              </w:rPr>
+              <w:t>Scenario</w:t>
+            </w:r>
+            <w:r>
+              <w:rPr>
+                <w:sz w:val="20"/>
+                <w:szCs w:val="20"/>
+              </w:rPr>
+              <w:t xml:space="preserve"> - </w:t>
+            </w:r>
+            <w:r>
+              <w:rPr>
+                <w:sz w:val="20"/>
+                <w:szCs w:val="20"/>
+              </w:rPr>
+              <w:t>Equipment, leaders and waste collection</w:t>
+            </w:r>
+          </w:p>
+        </w:tc>
+      </w:tr>
+      <w:tr>
+        <w:tc>
+          <w:tcPr>
+            <w:tcW w:w="656" w:type="dxa"/>
+          </w:tcPr>
+          <w:p>
+            <w:pPr>
+              <w:rPr>
+                <w:sz w:val="20"/>
+                <w:szCs w:val="20"/>
+              </w:rPr>
+            </w:pPr>
+            <w:r>
+              <w:rPr>
+                <w:sz w:val="20"/>
+                <w:szCs w:val="20"/>
+              </w:rPr>
+              <w:t>FR05</w:t>
+            </w:r>
+          </w:p>
+        </w:tc>
+        <w:tc>
+          <w:tcPr>
+            <w:tcW w:w="4958" w:type="dxa"/>
+          </w:tcPr>
+          <w:p>
+            <w:pPr>
+              <w:rPr>
+                <w:sz w:val="20"/>
+                <w:szCs w:val="20"/>
+              </w:rPr>
+            </w:pPr>
+            <w:r>
+              <w:rPr>
+                <w:sz w:val="20"/>
+                <w:szCs w:val="20"/>
+              </w:rPr>
+              <w:t>The coordinator needs views of events awaiting approval, leader and equipment gaps, changed events, outstanding waste collection and incomplete reports</w:t>
+            </w:r>
+          </w:p>
+        </w:tc>
+        <w:tc>
+          <w:tcPr>
+            <w:tcW w:w="1187" w:type="dxa"/>
+          </w:tcPr>
+          <w:p>
+            <w:pPr>
+              <w:rPr>
+                <w:sz w:val="20"/>
+                <w:szCs w:val="20"/>
+              </w:rPr>
+            </w:pPr>
+            <w:r>
+              <w:rPr>
+                <w:sz w:val="20"/>
+                <w:szCs w:val="20"/>
+              </w:rPr>
+              <w:t>Must</w:t>
+            </w:r>
+          </w:p>
+        </w:tc>
+        <w:tc>
+          <w:tcPr>
+            <w:tcW w:w="2550" w:type="dxa"/>
+          </w:tcPr>
+          <w:p>
+            <w:pPr>
+              <w:rPr>
+                <w:sz w:val="20"/>
+                <w:szCs w:val="20"/>
+              </w:rPr>
+            </w:pPr>
+            <w:r>
+              <w:rPr>
+                <w:b/>
+                <w:bCs/>
+                <w:sz w:val="20"/>
+                <w:szCs w:val="20"/>
+              </w:rPr>
+              <w:t>Scenario</w:t>
+            </w:r>
+            <w:r>
+              <w:rPr>
+                <w:sz w:val="20"/>
+                <w:szCs w:val="20"/>
+              </w:rPr>
+              <w:t xml:space="preserve"> - </w:t>
+            </w:r>
+            <w:r>
+              <w:rPr>
+                <w:sz w:val="20"/>
+                <w:szCs w:val="20"/>
+              </w:rPr>
+              <w:t>Disruption, completion and reporting</w:t>
+            </w:r>
+          </w:p>
+        </w:tc>
+      </w:tr>
+    </w:tbl>
+    <w:p/>
+    <w:p>
+      <w:r>
+        <w:br w:type="page"/>
+      </w:r>
+    </w:p>
+    <w:p>
+      <w:pPr>
+        <w:pStyle w:val="Heading1"/>
+      </w:pPr>
+      <w:r>
+        <w:lastRenderedPageBreak/>
+        <w:t>Task 6: Non-Functional Requirements</w:t>
+      </w:r>
+    </w:p>
+    <w:tbl>
+      <w:tblPr>
+        <w:tblStyle w:val="TableGrid"/>
+        <w:tblW w:w="10348" w:type="dxa"/>
+        <w:tblInd w:w="-572" w:type="dxa"/>
+        <w:tblLook w:val="04A0" w:firstRow="1" w:lastRow="0" w:firstColumn="1" w:lastColumn="0" w:noHBand="0" w:noVBand="1"/>
+      </w:tblPr>
+      <w:tblGrid>
+        <w:gridCol w:w="851"/>
+        <w:gridCol w:w="2126"/>
+        <w:gridCol w:w="4820"/>
+        <w:gridCol w:w="2551"/>
+      </w:tblGrid>
+      <w:tr>
+        <w:tc>
+          <w:tcPr>
+            <w:tcW w:w="851" w:type="dxa"/>
+          </w:tcPr>
+          <w:p>
+            <w:r>
+              <w:t>ID</w:t>
+            </w:r>
+          </w:p>
+        </w:tc>
+        <w:tc>
+          <w:tcPr>
+            <w:tcW w:w="2126" w:type="dxa"/>
+          </w:tcPr>
+          <w:p>
+            <w:r>
+              <w:t>Quality Category</w:t>
+            </w:r>
+          </w:p>
+        </w:tc>
+        <w:tc>
+          <w:tcPr>
+            <w:tcW w:w="4820" w:type="dxa"/>
+          </w:tcPr>
+          <w:p>
+            <w:r>
+              <w:t>Measurable Requirement</w:t>
+            </w:r>
+          </w:p>
+        </w:tc>
+        <w:tc>
+          <w:tcPr>
+            <w:tcW w:w="2551" w:type="dxa"/>
+          </w:tcPr>
+          <w:p>
+            <w:r>
+              <w:t xml:space="preserve">Rationale </w:t>
+            </w:r>
+          </w:p>
+        </w:tc>
+      </w:tr>
+      <w:tr>
+        <w:tc>
+          <w:tcPr>
+            <w:tcW w:w="851" w:type="dxa"/>
+          </w:tcPr>
+          <w:p>
+            <w:pPr>
+              <w:rPr>
+                <w:sz w:val="20"/>
+                <w:szCs w:val="20"/>
+              </w:rPr>
+            </w:pPr>
+            <w:r>
+              <w:rPr>
+                <w:sz w:val="20"/>
+                <w:szCs w:val="20"/>
+              </w:rPr>
+              <w:t>N</w:t>
+            </w:r>
+            <w:r>
+              <w:rPr>
+                <w:sz w:val="20"/>
+                <w:szCs w:val="20"/>
+              </w:rPr>
+              <w:t>FR01</w:t>
+            </w:r>
+          </w:p>
+        </w:tc>
+        <w:tc>
+          <w:tcPr>
+            <w:tcW w:w="2126" w:type="dxa"/>
+          </w:tcPr>
+          <w:p>
+            <w:pPr>
+              <w:rPr>
+                <w:sz w:val="20"/>
+                <w:szCs w:val="20"/>
+              </w:rPr>
+            </w:pPr>
+          </w:p>
+        </w:tc>
+        <w:tc>
+          <w:tcPr>
+            <w:tcW w:w="4820" w:type="dxa"/>
+          </w:tcPr>
+          <w:p>
+            <w:pPr>
+              <w:rPr>
+                <w:sz w:val="20"/>
+                <w:szCs w:val="20"/>
+              </w:rPr>
+            </w:pPr>
+          </w:p>
+        </w:tc>
+        <w:tc>
+          <w:tcPr>
+            <w:tcW w:w="2551" w:type="dxa"/>
+          </w:tcPr>
+          <w:p>
+            <w:pPr>
+              <w:rPr>
+                <w:sz w:val="20"/>
+                <w:szCs w:val="20"/>
+              </w:rPr>
+            </w:pPr>
+          </w:p>
+        </w:tc>
+      </w:tr>
+      <w:tr>
+        <w:tc>
+          <w:tcPr>
+            <w:tcW w:w="851" w:type="dxa"/>
+          </w:tcPr>
+          <w:p>
+            <w:pPr>
+              <w:rPr>
+                <w:sz w:val="20"/>
+                <w:szCs w:val="20"/>
+              </w:rPr>
+            </w:pPr>
+            <w:r>
+              <w:rPr>
+                <w:sz w:val="20"/>
+                <w:szCs w:val="20"/>
+              </w:rPr>
+              <w:t>N</w:t>
+            </w:r>
+            <w:r>
+              <w:rPr>
+                <w:sz w:val="20"/>
+                <w:szCs w:val="20"/>
+              </w:rPr>
+              <w:t>FR02</w:t>
+            </w:r>
+          </w:p>
+        </w:tc>
+        <w:tc>
+          <w:tcPr>
+            <w:tcW w:w="2126" w:type="dxa"/>
+          </w:tcPr>
+          <w:p>
+            <w:pPr>
+              <w:rPr>
+                <w:sz w:val="20"/>
+                <w:szCs w:val="20"/>
+              </w:rPr>
+            </w:pPr>
+          </w:p>
+        </w:tc>
+        <w:tc>
+          <w:tcPr>
+            <w:tcW w:w="4820" w:type="dxa"/>
+          </w:tcPr>
+          <w:p>
+            <w:pPr>
+              <w:rPr>
+                <w:sz w:val="20"/>
+                <w:szCs w:val="20"/>
+              </w:rPr>
+            </w:pPr>
+          </w:p>
+        </w:tc>
+        <w:tc>
+          <w:tcPr>
+            <w:tcW w:w="2551" w:type="dxa"/>
+          </w:tcPr>
+          <w:p>
+            <w:pPr>
+              <w:rPr>
+                <w:sz w:val="20"/>
+                <w:szCs w:val="20"/>
+              </w:rPr>
+            </w:pPr>
+          </w:p>
+        </w:tc>
+      </w:tr>
+      <w:tr>
+        <w:tc>
+          <w:tcPr>
+            <w:tcW w:w="851" w:type="dxa"/>
+          </w:tcPr>
+          <w:p>
+            <w:pPr>
+              <w:rPr>
+                <w:sz w:val="20"/>
+                <w:szCs w:val="20"/>
+              </w:rPr>
+            </w:pPr>
+            <w:r>
+              <w:rPr>
+                <w:sz w:val="20"/>
+                <w:szCs w:val="20"/>
+              </w:rPr>
+              <w:t>N</w:t>
+            </w:r>
+            <w:r>
+              <w:rPr>
+                <w:sz w:val="20"/>
+                <w:szCs w:val="20"/>
+              </w:rPr>
+              <w:t>FR03</w:t>
+            </w:r>
+          </w:p>
+        </w:tc>
+        <w:tc>
+          <w:tcPr>
+            <w:tcW w:w="2126" w:type="dxa"/>
+          </w:tcPr>
+          <w:p>
+            <w:pPr>
+              <w:rPr>
+                <w:sz w:val="20"/>
+                <w:szCs w:val="20"/>
+              </w:rPr>
+            </w:pPr>
+          </w:p>
+        </w:tc>
+        <w:tc>
+          <w:tcPr>
+            <w:tcW w:w="4820" w:type="dxa"/>
+          </w:tcPr>
+          <w:p>
+            <w:pPr>
+              <w:rPr>
+                <w:sz w:val="20"/>
+                <w:szCs w:val="20"/>
+              </w:rPr>
+            </w:pPr>
+          </w:p>
+        </w:tc>
+        <w:tc>
+          <w:tcPr>
+            <w:tcW w:w="2551" w:type="dxa"/>
+          </w:tcPr>
+          <w:p>
+            <w:pPr>
+              <w:rPr>
+                <w:sz w:val="20"/>
+                <w:szCs w:val="20"/>
+              </w:rPr>
+            </w:pPr>
+          </w:p>
+        </w:tc>
+      </w:tr>
+      <w:tr>
+        <w:tc>
+          <w:tcPr>
+            <w:tcW w:w="851" w:type="dxa"/>
+          </w:tcPr>
+          <w:p>
+            <w:pPr>
+              <w:rPr>
+                <w:sz w:val="20"/>
+                <w:szCs w:val="20"/>
+              </w:rPr>
+            </w:pPr>
+            <w:r>
+              <w:rPr>
+                <w:sz w:val="20"/>
+                <w:szCs w:val="20"/>
+              </w:rPr>
+              <w:t>N</w:t>
+            </w:r>
+            <w:r>
+              <w:rPr>
+                <w:sz w:val="20"/>
+                <w:szCs w:val="20"/>
+              </w:rPr>
+              <w:t>FR04</w:t>
+            </w:r>
+          </w:p>
+        </w:tc>
+        <w:tc>
+          <w:tcPr>
+            <w:tcW w:w="2126" w:type="dxa"/>
+          </w:tcPr>
+          <w:p>
+            <w:pPr>
+              <w:rPr>
+                <w:sz w:val="20"/>
+                <w:szCs w:val="20"/>
+              </w:rPr>
+            </w:pPr>
+          </w:p>
+        </w:tc>
+        <w:tc>
+          <w:tcPr>
+            <w:tcW w:w="4820" w:type="dxa"/>
+          </w:tcPr>
+          <w:p>
+            <w:pPr>
+              <w:rPr>
+                <w:sz w:val="20"/>
+                <w:szCs w:val="20"/>
+              </w:rPr>
+            </w:pPr>
+          </w:p>
+        </w:tc>
+        <w:tc>
+          <w:tcPr>
+            <w:tcW w:w="2551" w:type="dxa"/>
+          </w:tcPr>
+          <w:p>
+            <w:pPr>
+              <w:rPr>
+                <w:sz w:val="20"/>
+                <w:szCs w:val="20"/>
+              </w:rPr>
+            </w:pPr>
+          </w:p>
+        </w:tc>
+      </w:tr>
+      <w:tr>
+        <w:tc>
+          <w:tcPr>
+            <w:tcW w:w="851" w:type="dxa"/>
+          </w:tcPr>
+          <w:p>
+            <w:pPr>
+              <w:rPr>
+                <w:sz w:val="20"/>
+                <w:szCs w:val="20"/>
+              </w:rPr>
+            </w:pPr>
+            <w:r>
+              <w:rPr>
+                <w:sz w:val="20"/>
+                <w:szCs w:val="20"/>
+              </w:rPr>
+              <w:t>N</w:t>
+            </w:r>
+            <w:r>
+              <w:rPr>
+                <w:sz w:val="20"/>
+                <w:szCs w:val="20"/>
+              </w:rPr>
+              <w:t>FR05</w:t>
+            </w:r>
+          </w:p>
+        </w:tc>
+        <w:tc>
+          <w:tcPr>
+            <w:tcW w:w="2126" w:type="dxa"/>
+          </w:tcPr>
+          <w:p>
+            <w:pPr>
+              <w:rPr>
+                <w:sz w:val="20"/>
+                <w:szCs w:val="20"/>
+              </w:rPr>
+            </w:pPr>
+          </w:p>
+        </w:tc>
+        <w:tc>
+          <w:tcPr>
+            <w:tcW w:w="4820" w:type="dxa"/>
+          </w:tcPr>
+          <w:p>
+            <w:pPr>
+              <w:rPr>
+                <w:sz w:val="20"/>
+                <w:szCs w:val="20"/>
+              </w:rPr>
+            </w:pPr>
+          </w:p>
+        </w:tc>
+        <w:tc>
+          <w:tcPr>
+            <w:tcW w:w="2551" w:type="dxa"/>
+          </w:tcPr>
+          <w:p>
+            <w:pPr>
+              <w:rPr>
+                <w:sz w:val="20"/>
+                <w:szCs w:val="20"/>
+              </w:rPr>
+            </w:pPr>
+          </w:p>
+        </w:tc>
+      </w:tr>
+    </w:tbl>
+    <w:p/>
+    <w:p>
+      <w:r>
+        <w:br w:type="page"/>
+      </w:r>
+    </w:p>
+    <w:p>
+      <w:pPr>
+        <w:pStyle w:val="Heading1"/>
+      </w:pPr>
+      <w:r>
+        <w:lastRenderedPageBreak/>
+        <w:t>Task 7: Rules, Assumptions, Constraints and Risks</w:t>
+      </w:r>
+    </w:p>
+    <w:tbl>
+      <w:tblPr>
+        <w:tblStyle w:val="TableGrid"/>
+        <w:tblW w:w="0" w:type="auto"/>
+        <w:tblLook w:val="04A0" w:firstRow="1" w:lastRow="0" w:firstColumn="1" w:lastColumn="0" w:noHBand="0" w:noVBand="1"/>
+      </w:tblPr>
+      <w:tblGrid>
+        <w:gridCol w:w="4508"/>
+        <w:gridCol w:w="4508"/>
+      </w:tblGrid>
+      <w:tr>
+        <w:tc>
+          <w:tcPr>
+            <w:tcW w:w="4508" w:type="dxa"/>
+          </w:tcPr>
+          <w:p>
+            <w:pPr>
+              <w:rPr>
+                <w:b/>
+                <w:bCs/>
+              </w:rPr>
+            </w:pPr>
+            <w:r>
+              <w:rPr>
+                <w:b/>
+                <w:bCs/>
+              </w:rPr>
+              <w:t>Category</w:t>
+            </w:r>
+          </w:p>
+        </w:tc>
+        <w:tc>
+          <w:tcPr>
+            <w:tcW w:w="4508" w:type="dxa"/>
+          </w:tcPr>
+          <w:p>
+            <w:pPr>
+              <w:rPr>
+                <w:b/>
+                <w:bCs/>
+              </w:rPr>
+            </w:pPr>
+            <w:r>
+              <w:rPr>
+                <w:b/>
+                <w:bCs/>
+              </w:rPr>
+              <w:t>Statement</w:t>
+            </w:r>
+          </w:p>
+        </w:tc>
+      </w:tr>
+      <w:tr>
+        <w:tc>
+          <w:tcPr>
+            <w:tcW w:w="4508" w:type="dxa"/>
+          </w:tcPr>
+          <w:p/>
+        </w:tc>
+        <w:tc>
+          <w:tcPr>
+            <w:tcW w:w="4508" w:type="dxa"/>
+          </w:tcPr>
+          <w:p/>
+        </w:tc>
+      </w:tr>
+      <w:tr>
+        <w:tc>
+          <w:tcPr>
+            <w:tcW w:w="4508" w:type="dxa"/>
+          </w:tcPr>
+          <w:p/>
+        </w:tc>
+        <w:tc>
+          <w:tcPr>
+            <w:tcW w:w="4508" w:type="dxa"/>
+          </w:tcPr>
+          <w:p/>
+        </w:tc>
+      </w:tr>
+      <w:tr>
+        <w:tc>
+          <w:tcPr>
+            <w:tcW w:w="4508" w:type="dxa"/>
+          </w:tcPr>
+          <w:p/>
+        </w:tc>
+        <w:tc>
+          <w:tcPr>
+            <w:tcW w:w="4508" w:type="dxa"/>
+          </w:tcPr>
+          <w:p/>
+        </w:tc>
+      </w:tr>
+      <w:tr>
+        <w:tc>
+          <w:tcPr>
+            <w:tcW w:w="4508" w:type="dxa"/>
+          </w:tcPr>
+          <w:p/>
+        </w:tc>
+        <w:tc>
+          <w:tcPr>
+            <w:tcW w:w="4508" w:type="dxa"/>
+          </w:tcPr>
+          <w:p/>
+        </w:tc>
+      </w:tr>
+      <w:tr>
+        <w:tc>
+          <w:tcPr>
+            <w:tcW w:w="4508" w:type="dxa"/>
+          </w:tcPr>
+          <w:p/>
+        </w:tc>
+        <w:tc>
+          <w:tcPr>
+            <w:tcW w:w="4508" w:type="dxa"/>
+          </w:tcPr>
+          <w:p/>
+        </w:tc>
+      </w:tr>
+    </w:tbl>
+    <w:p/>
     <w:sectPr>
       <w:pgSz w:w="11906" w:h="16838"/>
       <w:pgMar w:top="1440" w:right="1440" w:bottom="1440" w:left="1440" w:header="708" w:footer="708" w:gutter="0"/>
@@ -2732,6 +4855,25 @@
       <w:spacing w:val="5"/>
     </w:rPr>
   </w:style>
+  <w:style w:type="table" w:styleId="TableGrid">
+    <w:name w:val="Table Grid"/>
+    <w:basedOn w:val="TableNormal"/>
+    <w:uiPriority w:val="39"/>
+    <w:rsid w:val="00852540"/>
+    <w:pPr>
+      <w:spacing w:after="0" w:line="240" w:lineRule="auto"/>
+    </w:pPr>
+    <w:tblPr>
+      <w:tblBorders>
+        <w:top w:val="single" w:sz="4" w:space="0" w:color="auto"/>
+        <w:left w:val="single" w:sz="4" w:space="0" w:color="auto"/>
+        <w:bottom w:val="single" w:sz="4" w:space="0" w:color="auto"/>
+        <w:right w:val="single" w:sz="4" w:space="0" w:color="auto"/>
+        <w:insideH w:val="single" w:sz="4" w:space="0" w:color="auto"/>
+        <w:insideV w:val="single" w:sz="4" w:space="0" w:color="auto"/>
+      </w:tblBorders>
+    </w:tblPr>
+  </w:style>
 </w:styles>
 </file>
 

</xml_diff>

<commit_message>
Mostly completed up to task 9, more progress made but still not full completed in places Signed-off-by: Harvey <HarveyDanSmith@gmail.com>
</commit_message>
<xml_diff>
--- a/OOP Coastal Project.docx
+++ b/OOP Coastal Project.docx
@@ -2,6 +2,36 @@
 <file path=word/document.xml><?xml version="1.0" encoding="utf-8"?>
 <w:document xmlns:wpc="http://schemas.microsoft.com/office/word/2010/wordprocessingCanvas" xmlns:cx="http://schemas.microsoft.com/office/drawing/2014/chartex" xmlns:cx1="http://schemas.microsoft.com/office/drawing/2015/9/8/chartex" xmlns:cx2="http://schemas.microsoft.com/office/drawing/2015/10/21/chartex" xmlns:cx3="http://schemas.microsoft.com/office/drawing/2016/5/9/chartex" xmlns:cx4="http://schemas.microsoft.com/office/drawing/2016/5/10/chartex" xmlns:cx5="http://schemas.microsoft.com/office/drawing/2016/5/11/chartex" xmlns:cx6="http://schemas.microsoft.com/office/drawing/2016/5/12/chartex" xmlns:cx7="http://schemas.microsoft.com/office/drawing/2016/5/13/chartex" xmlns:cx8="http://schemas.microsoft.com/office/drawing/2016/5/14/chartex" xmlns:mc="http://schemas.openxmlformats.org/markup-compatibility/2006" xmlns:aink="http://schemas.microsoft.com/office/drawing/2016/ink" xmlns:am3d="http://schemas.microsoft.com/office/drawing/2017/model3d" xmlns:o="urn:schemas-microsoft-com:office:office" xmlns:oel="http://schemas.microsoft.com/office/2019/extlst" xmlns:r="http://schemas.openxmlformats.org/officeDocument/2006/relationships" xmlns:m="http://schemas.openxmlformats.org/officeDocument/2006/math" xmlns:v="urn:schemas-microsoft-com:vml" xmlns:wp14="http://schemas.microsoft.com/office/word/2010/wordprocessingDrawing" xmlns:wp="http://schemas.openxmlformats.org/drawingml/2006/wordprocessingDrawing" xmlns:w10="urn:schemas-microsoft-com:office:word" xmlns:w="http://schemas.openxmlformats.org/wordprocessingml/2006/main" xmlns:w14="http://schemas.microsoft.com/office/word/2010/wordml" xmlns:w15="http://schemas.microsoft.com/office/word/2012/wordml" xmlns:w16cex="http://schemas.microsoft.com/office/word/2018/wordml/cex" xmlns:w16cid="http://schemas.microsoft.com/office/word/2016/wordml/cid" xmlns:w16="http://schemas.microsoft.com/office/word/2018/wordml" xmlns:w16du="http://schemas.microsoft.com/office/word/2023/wordml/word16du" xmlns:w16sdtdh="http://schemas.microsoft.com/office/word/2020/wordml/sdtdatahash" xmlns:w16sdtfl="http://schemas.microsoft.com/office/word/2024/wordml/sdtformatlock" xmlns:w16se="http://schemas.microsoft.com/office/word/2015/wordml/symex" xmlns:wpg="http://schemas.microsoft.com/office/word/2010/wordprocessingGroup" xmlns:wpi="http://schemas.microsoft.com/office/word/2010/wordprocessingInk" xmlns:wne="http://schemas.microsoft.com/office/word/2006/wordml" xmlns:wps="http://schemas.microsoft.com/office/word/2010/wordprocessingShape" mc:Ignorable="w14 w15 w16se w16cid w16 w16cex w16sdtdh w16sdtfl w16du wp14">
   <w:body>
+    <w:p>
+      <w:pPr>
+        <w:spacing w:after="40"/>
+        <w:jc w:val="center"/>
+        <w:rPr>
+          <w:rFonts w:ascii="Aptos Display" w:hAnsi="Aptos Display"/>
+          <w:b/>
+          <w:color w:val="17365D"/>
+          <w:sz w:val="40"/>
+        </w:rPr>
+      </w:pPr>
+      <w:r>
+        <w:rPr>
+          <w:rFonts w:ascii="Aptos Display" w:hAnsi="Aptos Display"/>
+          <w:b/>
+          <w:color w:val="17365D"/>
+          <w:sz w:val="40"/>
+        </w:rPr>
+        <w:t>Kerry Coastal Clean-up Coordination Service</w:t>
+      </w:r>
+    </w:p>
+    <w:p>
+      <w:pPr>
+        <w:pStyle w:val="Subtitle"/>
+        <w:jc w:val="center"/>
+      </w:pPr>
+      <w:r>
+        <w:t>Harvey Smith / T00264389</w:t>
+      </w:r>
+    </w:p>
     <w:p>
       <w:pPr>
         <w:pStyle w:val="Heading1"/>
@@ -541,6 +571,7 @@
           </w:tcPr>
           <w:p>
             <w:r>
+              <w:lastRenderedPageBreak/>
               <w:t>A site may remain usable if the meeting point or clean-up area changes</w:t>
             </w:r>
           </w:p>
@@ -594,250 +625,469 @@
           </w:tcPr>
           <w:p>
             <w:r>
+              <w:t>Several groups may propose nearby events</w:t>
+            </w:r>
+          </w:p>
+        </w:tc>
+        <w:tc>
+          <w:tcPr>
+            <w:tcW w:w="0" w:type="auto"/>
+            <w:tcMar>
+              <w:top w:w="30" w:type="dxa"/>
+              <w:left w:w="30" w:type="dxa"/>
+              <w:bottom w:w="30" w:type="dxa"/>
+              <w:right w:w="30" w:type="dxa"/>
+            </w:tcMar>
+            <w:vAlign w:val="center"/>
+          </w:tcPr>
+          <w:p>
+            <w:r>
+              <w:t>Business Rule</w:t>
+            </w:r>
+          </w:p>
+        </w:tc>
+        <w:tc>
+          <w:tcPr>
+            <w:tcW w:w="0" w:type="auto"/>
+            <w:tcMar>
+              <w:top w:w="30" w:type="dxa"/>
+              <w:left w:w="30" w:type="dxa"/>
+              <w:bottom w:w="30" w:type="dxa"/>
+              <w:right w:w="30" w:type="dxa"/>
+            </w:tcMar>
+            <w:vAlign w:val="center"/>
+          </w:tcPr>
+          <w:p>
+            <w:r>
+              <w:t>Domain rule detailing group proposals</w:t>
+            </w:r>
+          </w:p>
+        </w:tc>
+      </w:tr>
+      <w:tr>
+        <w:tc>
+          <w:tcPr>
+            <w:tcW w:w="0" w:type="auto"/>
+            <w:tcMar>
+              <w:top w:w="30" w:type="dxa"/>
+              <w:left w:w="30" w:type="dxa"/>
+              <w:bottom w:w="30" w:type="dxa"/>
+              <w:right w:w="30" w:type="dxa"/>
+            </w:tcMar>
+            <w:vAlign w:val="center"/>
+          </w:tcPr>
+          <w:p/>
+          <w:p>
+            <w:r>
+              <w:t>The partnership may combine events, separate areas or discourage duplication, but the decision process is informal</w:t>
+            </w:r>
+          </w:p>
+        </w:tc>
+        <w:tc>
+          <w:tcPr>
+            <w:tcW w:w="0" w:type="auto"/>
+            <w:tcMar>
+              <w:top w:w="30" w:type="dxa"/>
+              <w:left w:w="30" w:type="dxa"/>
+              <w:bottom w:w="30" w:type="dxa"/>
+              <w:right w:w="30" w:type="dxa"/>
+            </w:tcMar>
+            <w:vAlign w:val="center"/>
+          </w:tcPr>
+          <w:p/>
+          <w:p>
+            <w:r>
+              <w:t>Risk</w:t>
+            </w:r>
+          </w:p>
+        </w:tc>
+        <w:tc>
+          <w:tcPr>
+            <w:tcW w:w="0" w:type="auto"/>
+            <w:tcMar>
+              <w:top w:w="30" w:type="dxa"/>
+              <w:left w:w="30" w:type="dxa"/>
+              <w:bottom w:w="30" w:type="dxa"/>
+              <w:right w:w="30" w:type="dxa"/>
+            </w:tcMar>
+            <w:vAlign w:val="center"/>
+          </w:tcPr>
+          <w:p/>
+          <w:p>
+            <w:r>
+              <w:t xml:space="preserve">Creates strong </w:t>
+            </w:r>
+            <w:proofErr w:type="gramStart"/>
+            <w:r>
+              <w:t>likely-hood</w:t>
+            </w:r>
+            <w:proofErr w:type="gramEnd"/>
+            <w:r>
+              <w:t xml:space="preserve"> of errors such as fragmentation in the system</w:t>
+            </w:r>
+          </w:p>
+        </w:tc>
+      </w:tr>
+      <w:tr>
+        <w:tc>
+          <w:tcPr>
+            <w:tcW w:w="0" w:type="auto"/>
+            <w:tcMar>
+              <w:top w:w="30" w:type="dxa"/>
+              <w:left w:w="30" w:type="dxa"/>
+              <w:bottom w:w="30" w:type="dxa"/>
+              <w:right w:w="30" w:type="dxa"/>
+            </w:tcMar>
+            <w:vAlign w:val="center"/>
+          </w:tcPr>
+          <w:p>
+            <w:r>
+              <w:t>Volunteers may register individually or through schools, clubs and community organisations.</w:t>
+            </w:r>
+          </w:p>
+        </w:tc>
+        <w:tc>
+          <w:tcPr>
+            <w:tcW w:w="0" w:type="auto"/>
+            <w:tcMar>
+              <w:top w:w="30" w:type="dxa"/>
+              <w:left w:w="30" w:type="dxa"/>
+              <w:bottom w:w="30" w:type="dxa"/>
+              <w:right w:w="30" w:type="dxa"/>
+            </w:tcMar>
+            <w:vAlign w:val="center"/>
+          </w:tcPr>
+          <w:p>
+            <w:r>
+              <w:t>Problem Evidence</w:t>
+            </w:r>
+          </w:p>
+        </w:tc>
+        <w:tc>
+          <w:tcPr>
+            <w:tcW w:w="0" w:type="auto"/>
+            <w:tcMar>
+              <w:top w:w="30" w:type="dxa"/>
+              <w:left w:w="30" w:type="dxa"/>
+              <w:bottom w:w="30" w:type="dxa"/>
+              <w:right w:w="30" w:type="dxa"/>
+            </w:tcMar>
+            <w:vAlign w:val="center"/>
+          </w:tcPr>
+          <w:p>
+            <w:r>
+              <w:t>Can cause fragmentation if not correctly managed. Will occur if an individual can register themselves and through a school</w:t>
+            </w:r>
+          </w:p>
+        </w:tc>
+      </w:tr>
+      <w:tr>
+        <w:tc>
+          <w:tcPr>
+            <w:tcW w:w="0" w:type="auto"/>
+            <w:tcMar>
+              <w:top w:w="30" w:type="dxa"/>
+              <w:left w:w="30" w:type="dxa"/>
+              <w:bottom w:w="30" w:type="dxa"/>
+              <w:right w:w="30" w:type="dxa"/>
+            </w:tcMar>
+            <w:vAlign w:val="center"/>
+          </w:tcPr>
+          <w:p>
+            <w:r>
+              <w:t>Group organisers sometimes provide only estimated numbers until shortly before the event</w:t>
+            </w:r>
+          </w:p>
+        </w:tc>
+        <w:tc>
+          <w:tcPr>
+            <w:tcW w:w="0" w:type="auto"/>
+            <w:tcMar>
+              <w:top w:w="30" w:type="dxa"/>
+              <w:left w:w="30" w:type="dxa"/>
+              <w:bottom w:w="30" w:type="dxa"/>
+              <w:right w:w="30" w:type="dxa"/>
+            </w:tcMar>
+            <w:vAlign w:val="center"/>
+          </w:tcPr>
+          <w:p>
+            <w:r>
+              <w:t>Problem Evidence</w:t>
+            </w:r>
+            <w:r>
+              <w:t xml:space="preserve"> </w:t>
+            </w:r>
+          </w:p>
+        </w:tc>
+        <w:tc>
+          <w:tcPr>
+            <w:tcW w:w="0" w:type="auto"/>
+            <w:tcMar>
+              <w:top w:w="30" w:type="dxa"/>
+              <w:left w:w="30" w:type="dxa"/>
+              <w:bottom w:w="30" w:type="dxa"/>
+              <w:right w:w="30" w:type="dxa"/>
+            </w:tcMar>
+            <w:vAlign w:val="center"/>
+          </w:tcPr>
+          <w:p>
+            <w:r>
+              <w:t>Describes the current situation and shows possible short-notice issues for a variety of factors if estimation is off</w:t>
+            </w:r>
+          </w:p>
+        </w:tc>
+      </w:tr>
+      <w:tr>
+        <w:tc>
+          <w:tcPr>
+            <w:tcW w:w="0" w:type="auto"/>
+            <w:tcMar>
+              <w:top w:w="30" w:type="dxa"/>
+              <w:left w:w="30" w:type="dxa"/>
+              <w:bottom w:w="30" w:type="dxa"/>
+              <w:right w:w="30" w:type="dxa"/>
+            </w:tcMar>
+            <w:vAlign w:val="center"/>
+          </w:tcPr>
+          <w:p>
+            <w:r>
+              <w:t>Registrations may include practical accessibility, communication and supervision requirements</w:t>
+            </w:r>
+          </w:p>
+        </w:tc>
+        <w:tc>
+          <w:tcPr>
+            <w:tcW w:w="0" w:type="auto"/>
+            <w:tcMar>
+              <w:top w:w="30" w:type="dxa"/>
+              <w:left w:w="30" w:type="dxa"/>
+              <w:bottom w:w="30" w:type="dxa"/>
+              <w:right w:w="30" w:type="dxa"/>
+            </w:tcMar>
+            <w:vAlign w:val="center"/>
+          </w:tcPr>
+          <w:p>
+            <w:r>
+              <w:t>Requirement</w:t>
+            </w:r>
+          </w:p>
+        </w:tc>
+        <w:tc>
+          <w:tcPr>
+            <w:tcW w:w="0" w:type="auto"/>
+            <w:tcMar>
+              <w:top w:w="30" w:type="dxa"/>
+              <w:left w:w="30" w:type="dxa"/>
+              <w:bottom w:w="30" w:type="dxa"/>
+              <w:right w:w="30" w:type="dxa"/>
+            </w:tcMar>
+            <w:vAlign w:val="center"/>
+          </w:tcPr>
+          <w:p>
+            <w:r>
+              <w:t>Describes factors on registration that should be included in the system</w:t>
+            </w:r>
+          </w:p>
+        </w:tc>
+      </w:tr>
+      <w:tr>
+        <w:tc>
+          <w:tcPr>
+            <w:tcW w:w="0" w:type="auto"/>
+            <w:tcMar>
+              <w:top w:w="30" w:type="dxa"/>
+              <w:left w:w="30" w:type="dxa"/>
+              <w:bottom w:w="30" w:type="dxa"/>
+              <w:right w:w="30" w:type="dxa"/>
+            </w:tcMar>
+            <w:vAlign w:val="center"/>
+          </w:tcPr>
+          <w:p>
+            <w:r>
+              <w:t>Event leaders need enough information to prepare safely without receiving unnecessary personal details</w:t>
+            </w:r>
+          </w:p>
+        </w:tc>
+        <w:tc>
+          <w:tcPr>
+            <w:tcW w:w="0" w:type="auto"/>
+            <w:tcMar>
+              <w:top w:w="30" w:type="dxa"/>
+              <w:left w:w="30" w:type="dxa"/>
+              <w:bottom w:w="30" w:type="dxa"/>
+              <w:right w:w="30" w:type="dxa"/>
+            </w:tcMar>
+            <w:vAlign w:val="center"/>
+          </w:tcPr>
+          <w:p>
+            <w:r>
+              <w:t>Requirement</w:t>
+            </w:r>
+          </w:p>
+        </w:tc>
+        <w:tc>
+          <w:tcPr>
+            <w:tcW w:w="0" w:type="auto"/>
+            <w:tcMar>
+              <w:top w:w="30" w:type="dxa"/>
+              <w:left w:w="30" w:type="dxa"/>
+              <w:bottom w:w="30" w:type="dxa"/>
+              <w:right w:w="30" w:type="dxa"/>
+            </w:tcMar>
+            <w:vAlign w:val="center"/>
+          </w:tcPr>
+          <w:p>
+            <w:r>
+              <w:t>Describes factors</w:t>
+            </w:r>
+            <w:r>
+              <w:t xml:space="preserve"> for safe preparation</w:t>
+            </w:r>
+          </w:p>
+        </w:tc>
+      </w:tr>
+      <w:tr>
+        <w:tc>
+          <w:tcPr>
+            <w:tcW w:w="0" w:type="auto"/>
+            <w:tcMar>
+              <w:top w:w="30" w:type="dxa"/>
+              <w:left w:w="30" w:type="dxa"/>
+              <w:bottom w:w="30" w:type="dxa"/>
+              <w:right w:w="30" w:type="dxa"/>
+            </w:tcMar>
+            <w:vAlign w:val="center"/>
+          </w:tcPr>
+          <w:p>
+            <w:r>
+              <w:t>A volunteer may transfer to another event, arrive without registration or withdraw</w:t>
+            </w:r>
+          </w:p>
+        </w:tc>
+        <w:tc>
+          <w:tcPr>
+            <w:tcW w:w="0" w:type="auto"/>
+            <w:tcMar>
+              <w:top w:w="30" w:type="dxa"/>
+              <w:left w:w="30" w:type="dxa"/>
+              <w:bottom w:w="30" w:type="dxa"/>
+              <w:right w:w="30" w:type="dxa"/>
+            </w:tcMar>
+            <w:vAlign w:val="center"/>
+          </w:tcPr>
+          <w:p>
+            <w:r>
+              <w:t>Business Rule</w:t>
+            </w:r>
+          </w:p>
+        </w:tc>
+        <w:tc>
+          <w:tcPr>
+            <w:tcW w:w="0" w:type="auto"/>
+            <w:tcMar>
+              <w:top w:w="30" w:type="dxa"/>
+              <w:left w:w="30" w:type="dxa"/>
+              <w:bottom w:w="30" w:type="dxa"/>
+              <w:right w:w="30" w:type="dxa"/>
+            </w:tcMar>
+            <w:vAlign w:val="center"/>
+          </w:tcPr>
+          <w:p>
+            <w:r>
+              <w:t>Domain rule for volunteers</w:t>
+            </w:r>
+          </w:p>
+        </w:tc>
+      </w:tr>
+      <w:tr>
+        <w:tc>
+          <w:tcPr>
+            <w:tcW w:w="0" w:type="auto"/>
+            <w:tcMar>
+              <w:top w:w="30" w:type="dxa"/>
+              <w:left w:w="30" w:type="dxa"/>
+              <w:bottom w:w="30" w:type="dxa"/>
+              <w:right w:w="30" w:type="dxa"/>
+            </w:tcMar>
+            <w:vAlign w:val="center"/>
+          </w:tcPr>
+          <w:p>
+            <w:r>
+              <w:t>Capacity depends partly on leaders, equipment and waste collection rather than only the physical site</w:t>
+            </w:r>
+          </w:p>
+        </w:tc>
+        <w:tc>
+          <w:tcPr>
+            <w:tcW w:w="0" w:type="auto"/>
+            <w:tcMar>
+              <w:top w:w="30" w:type="dxa"/>
+              <w:left w:w="30" w:type="dxa"/>
+              <w:bottom w:w="30" w:type="dxa"/>
+              <w:right w:w="30" w:type="dxa"/>
+            </w:tcMar>
+            <w:vAlign w:val="center"/>
+          </w:tcPr>
+          <w:p>
+            <w:r>
+              <w:t>Business Rule</w:t>
+            </w:r>
+          </w:p>
+        </w:tc>
+        <w:tc>
+          <w:tcPr>
+            <w:tcW w:w="0" w:type="auto"/>
+            <w:tcMar>
+              <w:top w:w="30" w:type="dxa"/>
+              <w:left w:w="30" w:type="dxa"/>
+              <w:bottom w:w="30" w:type="dxa"/>
+              <w:right w:w="30" w:type="dxa"/>
+            </w:tcMar>
+            <w:vAlign w:val="center"/>
+          </w:tcPr>
+          <w:p>
+            <w:r>
+              <w:t>Domain rule for capacity</w:t>
+            </w:r>
+          </w:p>
+        </w:tc>
+      </w:tr>
+      <w:tr>
+        <w:tc>
+          <w:tcPr>
+            <w:tcW w:w="0" w:type="auto"/>
+            <w:tcMar>
+              <w:top w:w="30" w:type="dxa"/>
+              <w:left w:w="30" w:type="dxa"/>
+              <w:bottom w:w="30" w:type="dxa"/>
+              <w:right w:w="30" w:type="dxa"/>
+            </w:tcMar>
+            <w:vAlign w:val="center"/>
+          </w:tcPr>
+          <w:p>
+            <w:r>
+              <w:t xml:space="preserve">Events require gloves, litter pickers, bags, high-visibility clothing, first-aid </w:t>
+            </w:r>
+            <w:r>
               <w:lastRenderedPageBreak/>
-              <w:t>Several groups may propose nearby events</w:t>
-            </w:r>
-          </w:p>
-        </w:tc>
-        <w:tc>
-          <w:tcPr>
-            <w:tcW w:w="0" w:type="auto"/>
-            <w:tcMar>
-              <w:top w:w="30" w:type="dxa"/>
-              <w:left w:w="30" w:type="dxa"/>
-              <w:bottom w:w="30" w:type="dxa"/>
-              <w:right w:w="30" w:type="dxa"/>
-            </w:tcMar>
-            <w:vAlign w:val="center"/>
-          </w:tcPr>
-          <w:p>
-            <w:r>
-              <w:t>Business Rule</w:t>
-            </w:r>
-          </w:p>
-        </w:tc>
-        <w:tc>
-          <w:tcPr>
-            <w:tcW w:w="0" w:type="auto"/>
-            <w:tcMar>
-              <w:top w:w="30" w:type="dxa"/>
-              <w:left w:w="30" w:type="dxa"/>
-              <w:bottom w:w="30" w:type="dxa"/>
-              <w:right w:w="30" w:type="dxa"/>
-            </w:tcMar>
-            <w:vAlign w:val="center"/>
-          </w:tcPr>
-          <w:p>
-            <w:r>
-              <w:t>Domain rule detailing group proposals</w:t>
-            </w:r>
-          </w:p>
-        </w:tc>
-      </w:tr>
-      <w:tr>
-        <w:tc>
-          <w:tcPr>
-            <w:tcW w:w="0" w:type="auto"/>
-            <w:tcMar>
-              <w:top w:w="30" w:type="dxa"/>
-              <w:left w:w="30" w:type="dxa"/>
-              <w:bottom w:w="30" w:type="dxa"/>
-              <w:right w:w="30" w:type="dxa"/>
-            </w:tcMar>
-            <w:vAlign w:val="center"/>
-          </w:tcPr>
-          <w:p/>
-          <w:p>
-            <w:r>
-              <w:t>The partnership may combine events, separate areas or discourage duplication, but the decision process is informal</w:t>
-            </w:r>
-          </w:p>
-        </w:tc>
-        <w:tc>
-          <w:tcPr>
-            <w:tcW w:w="0" w:type="auto"/>
-            <w:tcMar>
-              <w:top w:w="30" w:type="dxa"/>
-              <w:left w:w="30" w:type="dxa"/>
-              <w:bottom w:w="30" w:type="dxa"/>
-              <w:right w:w="30" w:type="dxa"/>
-            </w:tcMar>
-            <w:vAlign w:val="center"/>
-          </w:tcPr>
-          <w:p/>
-          <w:p>
-            <w:r>
-              <w:t>Risk</w:t>
-            </w:r>
-          </w:p>
-        </w:tc>
-        <w:tc>
-          <w:tcPr>
-            <w:tcW w:w="0" w:type="auto"/>
-            <w:tcMar>
-              <w:top w:w="30" w:type="dxa"/>
-              <w:left w:w="30" w:type="dxa"/>
-              <w:bottom w:w="30" w:type="dxa"/>
-              <w:right w:w="30" w:type="dxa"/>
-            </w:tcMar>
-            <w:vAlign w:val="center"/>
-          </w:tcPr>
-          <w:p/>
-          <w:p>
-            <w:r>
-              <w:t xml:space="preserve">Creates strong </w:t>
-            </w:r>
-            <w:proofErr w:type="gramStart"/>
-            <w:r>
-              <w:t>likely-hood</w:t>
-            </w:r>
-            <w:proofErr w:type="gramEnd"/>
-            <w:r>
-              <w:t xml:space="preserve"> of errors such as fragmentation in the system</w:t>
-            </w:r>
-          </w:p>
-        </w:tc>
-      </w:tr>
-      <w:tr>
-        <w:tc>
-          <w:tcPr>
-            <w:tcW w:w="0" w:type="auto"/>
-            <w:tcMar>
-              <w:top w:w="30" w:type="dxa"/>
-              <w:left w:w="30" w:type="dxa"/>
-              <w:bottom w:w="30" w:type="dxa"/>
-              <w:right w:w="30" w:type="dxa"/>
-            </w:tcMar>
-            <w:vAlign w:val="center"/>
-          </w:tcPr>
-          <w:p>
-            <w:r>
-              <w:t>Volunteers may register individually or through schools, clubs and community organisations.</w:t>
-            </w:r>
-          </w:p>
-        </w:tc>
-        <w:tc>
-          <w:tcPr>
-            <w:tcW w:w="0" w:type="auto"/>
-            <w:tcMar>
-              <w:top w:w="30" w:type="dxa"/>
-              <w:left w:w="30" w:type="dxa"/>
-              <w:bottom w:w="30" w:type="dxa"/>
-              <w:right w:w="30" w:type="dxa"/>
-            </w:tcMar>
-            <w:vAlign w:val="center"/>
-          </w:tcPr>
-          <w:p>
-            <w:r>
-              <w:t>Problem Evidence</w:t>
-            </w:r>
-          </w:p>
-        </w:tc>
-        <w:tc>
-          <w:tcPr>
-            <w:tcW w:w="0" w:type="auto"/>
-            <w:tcMar>
-              <w:top w:w="30" w:type="dxa"/>
-              <w:left w:w="30" w:type="dxa"/>
-              <w:bottom w:w="30" w:type="dxa"/>
-              <w:right w:w="30" w:type="dxa"/>
-            </w:tcMar>
-            <w:vAlign w:val="center"/>
-          </w:tcPr>
-          <w:p>
-            <w:r>
-              <w:t>Can cause fragmentation if not correctly managed. Will occur if an individual can register themselves and through a school</w:t>
-            </w:r>
-          </w:p>
-        </w:tc>
-      </w:tr>
-      <w:tr>
-        <w:tc>
-          <w:tcPr>
-            <w:tcW w:w="0" w:type="auto"/>
-            <w:tcMar>
-              <w:top w:w="30" w:type="dxa"/>
-              <w:left w:w="30" w:type="dxa"/>
-              <w:bottom w:w="30" w:type="dxa"/>
-              <w:right w:w="30" w:type="dxa"/>
-            </w:tcMar>
-            <w:vAlign w:val="center"/>
-          </w:tcPr>
-          <w:p>
-            <w:r>
-              <w:t>Group organisers sometimes provide only estimated numbers until shortly before the event</w:t>
-            </w:r>
-          </w:p>
-        </w:tc>
-        <w:tc>
-          <w:tcPr>
-            <w:tcW w:w="0" w:type="auto"/>
-            <w:tcMar>
-              <w:top w:w="30" w:type="dxa"/>
-              <w:left w:w="30" w:type="dxa"/>
-              <w:bottom w:w="30" w:type="dxa"/>
-              <w:right w:w="30" w:type="dxa"/>
-            </w:tcMar>
-            <w:vAlign w:val="center"/>
-          </w:tcPr>
-          <w:p>
-            <w:r>
-              <w:t>Problem Evidence</w:t>
-            </w:r>
-            <w:r>
-              <w:t xml:space="preserve"> </w:t>
-            </w:r>
-          </w:p>
-        </w:tc>
-        <w:tc>
-          <w:tcPr>
-            <w:tcW w:w="0" w:type="auto"/>
-            <w:tcMar>
-              <w:top w:w="30" w:type="dxa"/>
-              <w:left w:w="30" w:type="dxa"/>
-              <w:bottom w:w="30" w:type="dxa"/>
-              <w:right w:w="30" w:type="dxa"/>
-            </w:tcMar>
-            <w:vAlign w:val="center"/>
-          </w:tcPr>
-          <w:p>
-            <w:r>
-              <w:t>Describes the current situation and shows possible short-notice issues for a variety of factors if estimation is off</w:t>
-            </w:r>
-          </w:p>
-        </w:tc>
-      </w:tr>
-      <w:tr>
-        <w:tc>
-          <w:tcPr>
-            <w:tcW w:w="0" w:type="auto"/>
-            <w:tcMar>
-              <w:top w:w="30" w:type="dxa"/>
-              <w:left w:w="30" w:type="dxa"/>
-              <w:bottom w:w="30" w:type="dxa"/>
-              <w:right w:w="30" w:type="dxa"/>
-            </w:tcMar>
-            <w:vAlign w:val="center"/>
-          </w:tcPr>
-          <w:p>
-            <w:r>
-              <w:t>Registrations may include practical accessibility, communication and supervision requirements</w:t>
-            </w:r>
-          </w:p>
-        </w:tc>
-        <w:tc>
-          <w:tcPr>
-            <w:tcW w:w="0" w:type="auto"/>
-            <w:tcMar>
-              <w:top w:w="30" w:type="dxa"/>
-              <w:left w:w="30" w:type="dxa"/>
-              <w:bottom w:w="30" w:type="dxa"/>
-              <w:right w:w="30" w:type="dxa"/>
-            </w:tcMar>
-            <w:vAlign w:val="center"/>
-          </w:tcPr>
-          <w:p>
-            <w:r>
+              <w:t>supplies and sometimes specialist containers</w:t>
+            </w:r>
+          </w:p>
+        </w:tc>
+        <w:tc>
+          <w:tcPr>
+            <w:tcW w:w="0" w:type="auto"/>
+            <w:tcMar>
+              <w:top w:w="30" w:type="dxa"/>
+              <w:left w:w="30" w:type="dxa"/>
+              <w:bottom w:w="30" w:type="dxa"/>
+              <w:right w:w="30" w:type="dxa"/>
+            </w:tcMar>
+            <w:vAlign w:val="center"/>
+          </w:tcPr>
+          <w:p>
+            <w:r>
+              <w:lastRenderedPageBreak/>
               <w:t>Requirement</w:t>
             </w:r>
           </w:p>
@@ -855,221 +1105,6 @@
           </w:tcPr>
           <w:p>
             <w:r>
-              <w:t>Describes factors on registration that should be included in the system</w:t>
-            </w:r>
-          </w:p>
-        </w:tc>
-      </w:tr>
-      <w:tr>
-        <w:tc>
-          <w:tcPr>
-            <w:tcW w:w="0" w:type="auto"/>
-            <w:tcMar>
-              <w:top w:w="30" w:type="dxa"/>
-              <w:left w:w="30" w:type="dxa"/>
-              <w:bottom w:w="30" w:type="dxa"/>
-              <w:right w:w="30" w:type="dxa"/>
-            </w:tcMar>
-            <w:vAlign w:val="center"/>
-          </w:tcPr>
-          <w:p>
-            <w:r>
-              <w:t>Event leaders need enough information to prepare safely without receiving unnecessary personal details</w:t>
-            </w:r>
-          </w:p>
-        </w:tc>
-        <w:tc>
-          <w:tcPr>
-            <w:tcW w:w="0" w:type="auto"/>
-            <w:tcMar>
-              <w:top w:w="30" w:type="dxa"/>
-              <w:left w:w="30" w:type="dxa"/>
-              <w:bottom w:w="30" w:type="dxa"/>
-              <w:right w:w="30" w:type="dxa"/>
-            </w:tcMar>
-            <w:vAlign w:val="center"/>
-          </w:tcPr>
-          <w:p>
-            <w:r>
-              <w:t>Requirement</w:t>
-            </w:r>
-          </w:p>
-        </w:tc>
-        <w:tc>
-          <w:tcPr>
-            <w:tcW w:w="0" w:type="auto"/>
-            <w:tcMar>
-              <w:top w:w="30" w:type="dxa"/>
-              <w:left w:w="30" w:type="dxa"/>
-              <w:bottom w:w="30" w:type="dxa"/>
-              <w:right w:w="30" w:type="dxa"/>
-            </w:tcMar>
-            <w:vAlign w:val="center"/>
-          </w:tcPr>
-          <w:p>
-            <w:r>
-              <w:t>Describes factors</w:t>
-            </w:r>
-            <w:r>
-              <w:t xml:space="preserve"> for safe preparation</w:t>
-            </w:r>
-          </w:p>
-        </w:tc>
-      </w:tr>
-      <w:tr>
-        <w:tc>
-          <w:tcPr>
-            <w:tcW w:w="0" w:type="auto"/>
-            <w:tcMar>
-              <w:top w:w="30" w:type="dxa"/>
-              <w:left w:w="30" w:type="dxa"/>
-              <w:bottom w:w="30" w:type="dxa"/>
-              <w:right w:w="30" w:type="dxa"/>
-            </w:tcMar>
-            <w:vAlign w:val="center"/>
-          </w:tcPr>
-          <w:p>
-            <w:r>
-              <w:t>A volunteer may transfer to another event, arrive without registration or withdraw</w:t>
-            </w:r>
-          </w:p>
-        </w:tc>
-        <w:tc>
-          <w:tcPr>
-            <w:tcW w:w="0" w:type="auto"/>
-            <w:tcMar>
-              <w:top w:w="30" w:type="dxa"/>
-              <w:left w:w="30" w:type="dxa"/>
-              <w:bottom w:w="30" w:type="dxa"/>
-              <w:right w:w="30" w:type="dxa"/>
-            </w:tcMar>
-            <w:vAlign w:val="center"/>
-          </w:tcPr>
-          <w:p>
-            <w:r>
-              <w:t>Business Rule</w:t>
-            </w:r>
-          </w:p>
-        </w:tc>
-        <w:tc>
-          <w:tcPr>
-            <w:tcW w:w="0" w:type="auto"/>
-            <w:tcMar>
-              <w:top w:w="30" w:type="dxa"/>
-              <w:left w:w="30" w:type="dxa"/>
-              <w:bottom w:w="30" w:type="dxa"/>
-              <w:right w:w="30" w:type="dxa"/>
-            </w:tcMar>
-            <w:vAlign w:val="center"/>
-          </w:tcPr>
-          <w:p>
-            <w:r>
-              <w:t>Domain rule for volunteers</w:t>
-            </w:r>
-          </w:p>
-        </w:tc>
-      </w:tr>
-      <w:tr>
-        <w:tc>
-          <w:tcPr>
-            <w:tcW w:w="0" w:type="auto"/>
-            <w:tcMar>
-              <w:top w:w="30" w:type="dxa"/>
-              <w:left w:w="30" w:type="dxa"/>
-              <w:bottom w:w="30" w:type="dxa"/>
-              <w:right w:w="30" w:type="dxa"/>
-            </w:tcMar>
-            <w:vAlign w:val="center"/>
-          </w:tcPr>
-          <w:p>
-            <w:r>
-              <w:t>Capacity depends partly on leaders, equipment and waste collection rather than only the physical site</w:t>
-            </w:r>
-          </w:p>
-        </w:tc>
-        <w:tc>
-          <w:tcPr>
-            <w:tcW w:w="0" w:type="auto"/>
-            <w:tcMar>
-              <w:top w:w="30" w:type="dxa"/>
-              <w:left w:w="30" w:type="dxa"/>
-              <w:bottom w:w="30" w:type="dxa"/>
-              <w:right w:w="30" w:type="dxa"/>
-            </w:tcMar>
-            <w:vAlign w:val="center"/>
-          </w:tcPr>
-          <w:p>
-            <w:r>
-              <w:t>Business Rule</w:t>
-            </w:r>
-          </w:p>
-        </w:tc>
-        <w:tc>
-          <w:tcPr>
-            <w:tcW w:w="0" w:type="auto"/>
-            <w:tcMar>
-              <w:top w:w="30" w:type="dxa"/>
-              <w:left w:w="30" w:type="dxa"/>
-              <w:bottom w:w="30" w:type="dxa"/>
-              <w:right w:w="30" w:type="dxa"/>
-            </w:tcMar>
-            <w:vAlign w:val="center"/>
-          </w:tcPr>
-          <w:p>
-            <w:r>
-              <w:t>Domain rule for capacity</w:t>
-            </w:r>
-          </w:p>
-        </w:tc>
-      </w:tr>
-      <w:tr>
-        <w:tc>
-          <w:tcPr>
-            <w:tcW w:w="0" w:type="auto"/>
-            <w:tcMar>
-              <w:top w:w="30" w:type="dxa"/>
-              <w:left w:w="30" w:type="dxa"/>
-              <w:bottom w:w="30" w:type="dxa"/>
-              <w:right w:w="30" w:type="dxa"/>
-            </w:tcMar>
-            <w:vAlign w:val="center"/>
-          </w:tcPr>
-          <w:p>
-            <w:r>
-              <w:t>Events require gloves, litter pickers, bags, high-visibility clothing, first-aid supplies and sometimes specialist containers</w:t>
-            </w:r>
-          </w:p>
-        </w:tc>
-        <w:tc>
-          <w:tcPr>
-            <w:tcW w:w="0" w:type="auto"/>
-            <w:tcMar>
-              <w:top w:w="30" w:type="dxa"/>
-              <w:left w:w="30" w:type="dxa"/>
-              <w:bottom w:w="30" w:type="dxa"/>
-              <w:right w:w="30" w:type="dxa"/>
-            </w:tcMar>
-            <w:vAlign w:val="center"/>
-          </w:tcPr>
-          <w:p>
-            <w:r>
-              <w:t>Requirement</w:t>
-            </w:r>
-          </w:p>
-        </w:tc>
-        <w:tc>
-          <w:tcPr>
-            <w:tcW w:w="0" w:type="auto"/>
-            <w:tcMar>
-              <w:top w:w="30" w:type="dxa"/>
-              <w:left w:w="30" w:type="dxa"/>
-              <w:bottom w:w="30" w:type="dxa"/>
-              <w:right w:w="30" w:type="dxa"/>
-            </w:tcMar>
-            <w:vAlign w:val="center"/>
-          </w:tcPr>
-          <w:p>
-            <w:r>
               <w:t>Describes items required for events</w:t>
             </w:r>
           </w:p>
@@ -1089,7 +1124,6 @@
           </w:tcPr>
           <w:p>
             <w:r>
-              <w:lastRenderedPageBreak/>
               <w:t>Equipment may be reserved across several events and can return wet, incomplete or damaged</w:t>
             </w:r>
           </w:p>
@@ -1767,6 +1801,9 @@
       </w:tr>
     </w:tbl>
     <w:p>
+      <w:pPr>
+        <w:pStyle w:val="Heading1"/>
+      </w:pPr>
       <w:r>
         <w:br w:type="page"/>
       </w:r>
@@ -2863,9 +2900,9 @@
       </w:tblPr>
       <w:tblGrid>
         <w:gridCol w:w="656"/>
-        <w:gridCol w:w="4958"/>
-        <w:gridCol w:w="1187"/>
-        <w:gridCol w:w="2550"/>
+        <w:gridCol w:w="4922"/>
+        <w:gridCol w:w="1227"/>
+        <w:gridCol w:w="2546"/>
       </w:tblGrid>
       <w:tr>
         <w:tc>
@@ -2873,7 +2910,18 @@
             <w:tcW w:w="656" w:type="dxa"/>
           </w:tcPr>
           <w:p>
-            <w:r>
+            <w:pPr>
+              <w:jc w:val="center"/>
+              <w:rPr>
+                <w:b/>
+                <w:bCs/>
+              </w:rPr>
+            </w:pPr>
+            <w:r>
+              <w:rPr>
+                <w:b/>
+                <w:bCs/>
+              </w:rPr>
               <w:t>ID</w:t>
             </w:r>
           </w:p>
@@ -2883,7 +2931,18 @@
             <w:tcW w:w="4958" w:type="dxa"/>
           </w:tcPr>
           <w:p>
-            <w:r>
+            <w:pPr>
+              <w:jc w:val="center"/>
+              <w:rPr>
+                <w:b/>
+                <w:bCs/>
+              </w:rPr>
+            </w:pPr>
+            <w:r>
+              <w:rPr>
+                <w:b/>
+                <w:bCs/>
+              </w:rPr>
               <w:t>Functional Requirement</w:t>
             </w:r>
           </w:p>
@@ -2893,8 +2952,19 @@
             <w:tcW w:w="1187" w:type="dxa"/>
           </w:tcPr>
           <w:p>
+            <w:pPr>
+              <w:jc w:val="center"/>
+              <w:rPr>
+                <w:b/>
+                <w:bCs/>
+              </w:rPr>
+            </w:pPr>
             <w:proofErr w:type="spellStart"/>
             <w:r>
+              <w:rPr>
+                <w:b/>
+                <w:bCs/>
+              </w:rPr>
               <w:t>MoSCoW</w:t>
             </w:r>
             <w:proofErr w:type="spellEnd"/>
@@ -2905,8 +2975,19 @@
             <w:tcW w:w="2550" w:type="dxa"/>
           </w:tcPr>
           <w:p>
-            <w:r>
-              <w:t xml:space="preserve">Source/Rationale </w:t>
+            <w:pPr>
+              <w:jc w:val="center"/>
+              <w:rPr>
+                <w:b/>
+                <w:bCs/>
+              </w:rPr>
+            </w:pPr>
+            <w:r>
+              <w:rPr>
+                <w:b/>
+                <w:bCs/>
+              </w:rPr>
+              <w:t>Source/Rationale</w:t>
             </w:r>
           </w:p>
         </w:tc>
@@ -3415,7 +3496,18 @@
             <w:tcW w:w="851" w:type="dxa"/>
           </w:tcPr>
           <w:p>
-            <w:r>
+            <w:pPr>
+              <w:jc w:val="center"/>
+              <w:rPr>
+                <w:b/>
+                <w:bCs/>
+              </w:rPr>
+            </w:pPr>
+            <w:r>
+              <w:rPr>
+                <w:b/>
+                <w:bCs/>
+              </w:rPr>
               <w:t>ID</w:t>
             </w:r>
           </w:p>
@@ -3425,7 +3517,18 @@
             <w:tcW w:w="2126" w:type="dxa"/>
           </w:tcPr>
           <w:p>
-            <w:r>
+            <w:pPr>
+              <w:jc w:val="center"/>
+              <w:rPr>
+                <w:b/>
+                <w:bCs/>
+              </w:rPr>
+            </w:pPr>
+            <w:r>
+              <w:rPr>
+                <w:b/>
+                <w:bCs/>
+              </w:rPr>
               <w:t>Quality Category</w:t>
             </w:r>
           </w:p>
@@ -3435,7 +3538,18 @@
             <w:tcW w:w="4820" w:type="dxa"/>
           </w:tcPr>
           <w:p>
-            <w:r>
+            <w:pPr>
+              <w:jc w:val="center"/>
+              <w:rPr>
+                <w:b/>
+                <w:bCs/>
+              </w:rPr>
+            </w:pPr>
+            <w:r>
+              <w:rPr>
+                <w:b/>
+                <w:bCs/>
+              </w:rPr>
               <w:t>Measurable Requirement</w:t>
             </w:r>
           </w:p>
@@ -3445,8 +3559,19 @@
             <w:tcW w:w="2551" w:type="dxa"/>
           </w:tcPr>
           <w:p>
-            <w:r>
-              <w:t xml:space="preserve">Rationale </w:t>
+            <w:pPr>
+              <w:jc w:val="center"/>
+              <w:rPr>
+                <w:b/>
+                <w:bCs/>
+              </w:rPr>
+            </w:pPr>
+            <w:r>
+              <w:rPr>
+                <w:b/>
+                <w:bCs/>
+              </w:rPr>
+              <w:t>Rationale</w:t>
             </w:r>
           </w:p>
         </w:tc>
@@ -3810,20 +3935,21 @@
     <w:tbl>
       <w:tblPr>
         <w:tblStyle w:val="TableGrid"/>
-        <w:tblW w:w="0" w:type="auto"/>
+        <w:tblW w:w="9634" w:type="dxa"/>
         <w:tblLook w:val="04A0" w:firstRow="1" w:lastRow="0" w:firstColumn="1" w:lastColumn="0" w:noHBand="0" w:noVBand="1"/>
       </w:tblPr>
       <w:tblGrid>
-        <w:gridCol w:w="4508"/>
-        <w:gridCol w:w="4508"/>
+        <w:gridCol w:w="1462"/>
+        <w:gridCol w:w="8172"/>
       </w:tblGrid>
       <w:tr>
         <w:tc>
           <w:tcPr>
-            <w:tcW w:w="4508" w:type="dxa"/>
-          </w:tcPr>
-          <w:p>
-            <w:pPr>
+            <w:tcW w:w="1462" w:type="dxa"/>
+          </w:tcPr>
+          <w:p>
+            <w:pPr>
+              <w:jc w:val="center"/>
               <w:rPr>
                 <w:b/>
                 <w:bCs/>
@@ -3840,10 +3966,11 @@
         </w:tc>
         <w:tc>
           <w:tcPr>
-            <w:tcW w:w="4508" w:type="dxa"/>
-          </w:tcPr>
-          <w:p>
-            <w:pPr>
+            <w:tcW w:w="8172" w:type="dxa"/>
+          </w:tcPr>
+          <w:p>
+            <w:pPr>
+              <w:jc w:val="center"/>
               <w:rPr>
                 <w:b/>
                 <w:bCs/>
@@ -3862,13 +3989,743 @@
       <w:tr>
         <w:tc>
           <w:tcPr>
-            <w:tcW w:w="4508" w:type="dxa"/>
+            <w:tcW w:w="1462" w:type="dxa"/>
+          </w:tcPr>
+          <w:p>
+            <w:pPr>
+              <w:spacing w:after="120"/>
+            </w:pPr>
+            <w:r>
+              <w:t>Risk</w:t>
+            </w:r>
+          </w:p>
+        </w:tc>
+        <w:tc>
+          <w:tcPr>
+            <w:tcW w:w="8172" w:type="dxa"/>
+          </w:tcPr>
+          <w:p>
+            <w:pPr>
+              <w:spacing w:after="120"/>
+            </w:pPr>
+            <w:r>
+              <w:t>The partnership may combine events, separate areas or discourage duplication, but the decision process is informal</w:t>
+            </w:r>
+          </w:p>
+        </w:tc>
+      </w:tr>
+      <w:tr>
+        <w:tc>
+          <w:tcPr>
+            <w:tcW w:w="1462" w:type="dxa"/>
+          </w:tcPr>
+          <w:p>
+            <w:pPr>
+              <w:spacing w:after="120"/>
+            </w:pPr>
+            <w:r>
+              <w:t>Risk</w:t>
+            </w:r>
+          </w:p>
+        </w:tc>
+        <w:tc>
+          <w:tcPr>
+            <w:tcW w:w="8172" w:type="dxa"/>
+          </w:tcPr>
+          <w:p>
+            <w:pPr>
+              <w:spacing w:after="120"/>
+            </w:pPr>
+            <w:r>
+              <w:t>Event leaders have different experience and training</w:t>
+            </w:r>
+          </w:p>
+        </w:tc>
+      </w:tr>
+      <w:tr>
+        <w:tc>
+          <w:tcPr>
+            <w:tcW w:w="1462" w:type="dxa"/>
+          </w:tcPr>
+          <w:p>
+            <w:pPr>
+              <w:spacing w:after="120"/>
+            </w:pPr>
+            <w:r>
+              <w:t>Rule</w:t>
+            </w:r>
+          </w:p>
+        </w:tc>
+        <w:tc>
+          <w:tcPr>
+            <w:tcW w:w="8172" w:type="dxa"/>
+          </w:tcPr>
+          <w:p>
+            <w:pPr>
+              <w:spacing w:after="120"/>
+            </w:pPr>
+            <w:r>
+              <w:t>Kerry Coastal Action Partnership coordinates volunteer clean-up events at beaches, harbours and coastal access points</w:t>
+            </w:r>
+          </w:p>
+        </w:tc>
+      </w:tr>
+      <w:tr>
+        <w:tc>
+          <w:tcPr>
+            <w:tcW w:w="1462" w:type="dxa"/>
+          </w:tcPr>
+          <w:p>
+            <w:pPr>
+              <w:spacing w:after="120"/>
+            </w:pPr>
+            <w:r>
+              <w:t>Rule</w:t>
+            </w:r>
+          </w:p>
+        </w:tc>
+        <w:tc>
+          <w:tcPr>
+            <w:tcW w:w="8172" w:type="dxa"/>
+          </w:tcPr>
+          <w:p>
+            <w:pPr>
+              <w:spacing w:after="120"/>
+            </w:pPr>
+            <w:r>
+              <w:t>The partnership helps with permissions, volunteer registration, equipment, waste collection and reporting.</w:t>
+            </w:r>
+          </w:p>
+        </w:tc>
+      </w:tr>
+      <w:tr>
+        <w:tc>
+          <w:tcPr>
+            <w:tcW w:w="1462" w:type="dxa"/>
+          </w:tcPr>
+          <w:p>
+            <w:pPr>
+              <w:spacing w:after="120"/>
+            </w:pPr>
+            <w:r>
+              <w:t>Rule</w:t>
+            </w:r>
+          </w:p>
+        </w:tc>
+        <w:tc>
+          <w:tcPr>
+            <w:tcW w:w="8172" w:type="dxa"/>
+          </w:tcPr>
+          <w:p>
+            <w:pPr>
+              <w:spacing w:after="120"/>
+            </w:pPr>
+            <w:r>
+              <w:t>A proposal identifies the site, preferred date, organiser, expected volunteers and type of clean-up</w:t>
+            </w:r>
+          </w:p>
+        </w:tc>
+      </w:tr>
+      <w:tr>
+        <w:tc>
+          <w:tcPr>
+            <w:tcW w:w="1462" w:type="dxa"/>
+          </w:tcPr>
+          <w:p>
+            <w:pPr>
+              <w:spacing w:after="120"/>
+            </w:pPr>
+            <w:r>
+              <w:t>Rule</w:t>
+            </w:r>
+          </w:p>
+        </w:tc>
+        <w:tc>
+          <w:tcPr>
+            <w:tcW w:w="8172" w:type="dxa"/>
+          </w:tcPr>
+          <w:p>
+            <w:pPr>
+              <w:spacing w:after="120"/>
+            </w:pPr>
+            <w:r>
+              <w:t>Some sites need landowner, harbour or local-authority permission</w:t>
+            </w:r>
+          </w:p>
+        </w:tc>
+      </w:tr>
+      <w:tr>
+        <w:tc>
+          <w:tcPr>
+            <w:tcW w:w="1462" w:type="dxa"/>
+          </w:tcPr>
+          <w:p>
+            <w:pPr>
+              <w:spacing w:after="120"/>
+            </w:pPr>
+            <w:r>
+              <w:t>Rule</w:t>
+            </w:r>
+          </w:p>
+        </w:tc>
+        <w:tc>
+          <w:tcPr>
+            <w:tcW w:w="8172" w:type="dxa"/>
+          </w:tcPr>
+          <w:p>
+            <w:pPr>
+              <w:spacing w:after="120"/>
+            </w:pPr>
+            <w:r>
+              <w:t>Site conditions include access, parking, tide times, known hazards and suitability for different volunteer groups</w:t>
+            </w:r>
+          </w:p>
+        </w:tc>
+      </w:tr>
+      <w:tr>
+        <w:tc>
+          <w:tcPr>
+            <w:tcW w:w="1462" w:type="dxa"/>
+          </w:tcPr>
+          <w:p>
+            <w:pPr>
+              <w:spacing w:after="120"/>
+            </w:pPr>
+            <w:r>
+              <w:t>Rule</w:t>
+            </w:r>
+          </w:p>
+        </w:tc>
+        <w:tc>
+          <w:tcPr>
+            <w:tcW w:w="8172" w:type="dxa"/>
+          </w:tcPr>
+          <w:p>
+            <w:pPr>
+              <w:spacing w:after="120"/>
+            </w:pPr>
+            <w:r>
+              <w:t>A site may remain usable if the meeting point or clean-up area changes</w:t>
+            </w:r>
+          </w:p>
+        </w:tc>
+      </w:tr>
+      <w:tr>
+        <w:tc>
+          <w:tcPr>
+            <w:tcW w:w="1462" w:type="dxa"/>
+          </w:tcPr>
+          <w:p>
+            <w:pPr>
+              <w:spacing w:after="120"/>
+            </w:pPr>
+            <w:r>
+              <w:t>Rule</w:t>
+            </w:r>
+          </w:p>
+        </w:tc>
+        <w:tc>
+          <w:tcPr>
+            <w:tcW w:w="8172" w:type="dxa"/>
+          </w:tcPr>
+          <w:p>
+            <w:pPr>
+              <w:spacing w:after="120"/>
+            </w:pPr>
+            <w:r>
+              <w:t>Several groups may propose nearby events</w:t>
+            </w:r>
+          </w:p>
+        </w:tc>
+      </w:tr>
+      <w:tr>
+        <w:tc>
+          <w:tcPr>
+            <w:tcW w:w="1462" w:type="dxa"/>
+          </w:tcPr>
+          <w:p>
+            <w:pPr>
+              <w:spacing w:after="120"/>
+            </w:pPr>
+            <w:r>
+              <w:t>Rule</w:t>
+            </w:r>
+          </w:p>
+        </w:tc>
+        <w:tc>
+          <w:tcPr>
+            <w:tcW w:w="8172" w:type="dxa"/>
+          </w:tcPr>
+          <w:p>
+            <w:pPr>
+              <w:spacing w:after="120"/>
+            </w:pPr>
+            <w:r>
+              <w:t>A volunteer may transfer to another event, arrive without registration or withdraw</w:t>
+            </w:r>
+          </w:p>
+        </w:tc>
+      </w:tr>
+      <w:tr>
+        <w:tc>
+          <w:tcPr>
+            <w:tcW w:w="1462" w:type="dxa"/>
+          </w:tcPr>
+          <w:p>
+            <w:pPr>
+              <w:spacing w:after="120"/>
+            </w:pPr>
+            <w:r>
+              <w:t>Rule</w:t>
+            </w:r>
+          </w:p>
+        </w:tc>
+        <w:tc>
+          <w:tcPr>
+            <w:tcW w:w="8172" w:type="dxa"/>
+          </w:tcPr>
+          <w:p>
+            <w:pPr>
+              <w:spacing w:after="120"/>
+            </w:pPr>
+            <w:r>
+              <w:t>Capacity depends partly on leaders, equipment and waste collection rather than only the physical site</w:t>
+            </w:r>
+          </w:p>
+        </w:tc>
+      </w:tr>
+      <w:tr>
+        <w:tc>
+          <w:tcPr>
+            <w:tcW w:w="1462" w:type="dxa"/>
+          </w:tcPr>
+          <w:p>
+            <w:pPr>
+              <w:spacing w:after="120"/>
+            </w:pPr>
+            <w:r>
+              <w:t>Rule</w:t>
+            </w:r>
+          </w:p>
+        </w:tc>
+        <w:tc>
+          <w:tcPr>
+            <w:tcW w:w="8172" w:type="dxa"/>
+          </w:tcPr>
+          <w:p>
+            <w:pPr>
+              <w:spacing w:after="120"/>
+            </w:pPr>
+            <w:r>
+              <w:t>Larger or dispersed sites may require several leaders</w:t>
+            </w:r>
+          </w:p>
+        </w:tc>
+      </w:tr>
+      <w:tr>
+        <w:tc>
+          <w:tcPr>
+            <w:tcW w:w="1462" w:type="dxa"/>
+          </w:tcPr>
+          <w:p>
+            <w:pPr>
+              <w:spacing w:after="120"/>
+            </w:pPr>
+            <w:r>
+              <w:t>Rule</w:t>
+            </w:r>
+          </w:p>
+        </w:tc>
+        <w:tc>
+          <w:tcPr>
+            <w:tcW w:w="8172" w:type="dxa"/>
+          </w:tcPr>
+          <w:p>
+            <w:pPr>
+              <w:spacing w:after="120"/>
+            </w:pPr>
+            <w:r>
+              <w:t>Waste collection may be arranged with a council, harbour or contractor</w:t>
+            </w:r>
+          </w:p>
+        </w:tc>
+      </w:tr>
+      <w:tr>
+        <w:tc>
+          <w:tcPr>
+            <w:tcW w:w="1462" w:type="dxa"/>
+          </w:tcPr>
+          <w:p>
+            <w:pPr>
+              <w:spacing w:after="120"/>
+            </w:pPr>
+            <w:r>
+              <w:t>Rule</w:t>
+            </w:r>
+          </w:p>
+        </w:tc>
+        <w:tc>
+          <w:tcPr>
+            <w:tcW w:w="8172" w:type="dxa"/>
+          </w:tcPr>
+          <w:p>
+            <w:pPr>
+              <w:spacing w:after="120"/>
+            </w:pPr>
+            <w:r>
+              <w:t>Different waste types may require separate handling</w:t>
+            </w:r>
+          </w:p>
+        </w:tc>
+      </w:tr>
+      <w:tr>
+        <w:tc>
+          <w:tcPr>
+            <w:tcW w:w="1462" w:type="dxa"/>
+          </w:tcPr>
+          <w:p>
+            <w:pPr>
+              <w:spacing w:after="120"/>
+            </w:pPr>
+            <w:r>
+              <w:t>Rule</w:t>
+            </w:r>
+          </w:p>
+        </w:tc>
+        <w:tc>
+          <w:tcPr>
+            <w:tcW w:w="8172" w:type="dxa"/>
+          </w:tcPr>
+          <w:p>
+            <w:pPr>
+              <w:spacing w:after="120"/>
+            </w:pPr>
+            <w:r>
+              <w:t>After the event, leaders record attendance, areas covered, waste quantities, unusual items, equipment returned and incidents</w:t>
+            </w:r>
+          </w:p>
+        </w:tc>
+      </w:tr>
+      <w:tr>
+        <w:tc>
+          <w:tcPr>
+            <w:tcW w:w="1462" w:type="dxa"/>
+          </w:tcPr>
+          <w:p>
+            <w:pPr>
+              <w:spacing w:after="120"/>
+            </w:pPr>
+            <w:r>
+              <w:t>Rule</w:t>
+            </w:r>
+          </w:p>
+        </w:tc>
+        <w:tc>
+          <w:tcPr>
+            <w:tcW w:w="8172" w:type="dxa"/>
+          </w:tcPr>
+          <w:p>
+            <w:pPr>
+              <w:spacing w:after="120"/>
+            </w:pPr>
+            <w:r>
+              <w:t>Waste figures may be estimated using bags, weight or collection reports</w:t>
+            </w:r>
+          </w:p>
+        </w:tc>
+      </w:tr>
+      <w:tr>
+        <w:tc>
+          <w:tcPr>
+            <w:tcW w:w="1462" w:type="dxa"/>
+          </w:tcPr>
+          <w:p>
+            <w:pPr>
+              <w:spacing w:after="120"/>
+            </w:pPr>
+            <w:r>
+              <w:t>Assumption</w:t>
+            </w:r>
+          </w:p>
+        </w:tc>
+        <w:tc>
+          <w:tcPr>
+            <w:tcW w:w="8172" w:type="dxa"/>
+          </w:tcPr>
+          <w:p>
+            <w:pPr>
+              <w:spacing w:after="120"/>
+            </w:pPr>
+            <w:r>
+              <w:t>Local groups propose events</w:t>
+            </w:r>
+          </w:p>
+        </w:tc>
+      </w:tr>
+    </w:tbl>
+    <w:p/>
+    <w:p>
+      <w:r>
+        <w:br w:type="page"/>
+      </w:r>
+    </w:p>
+    <w:p>
+      <w:pPr>
+        <w:pStyle w:val="Heading1"/>
+      </w:pPr>
+      <w:r>
+        <w:lastRenderedPageBreak/>
+        <w:t>Task 8: Stakeholder Clarification Questions</w:t>
+      </w:r>
+    </w:p>
+    <w:p>
+      <w:pPr>
+        <w:pStyle w:val="ListParagraph"/>
+        <w:numPr>
+          <w:ilvl w:val="0"/>
+          <w:numId w:val="2"/>
+        </w:numPr>
+        <w:spacing w:after="0"/>
+      </w:pPr>
+      <w:r>
+        <w:t>“What information is needed on each volunteer?”</w:t>
+      </w:r>
+    </w:p>
+    <w:p>
+      <w:pPr>
+        <w:pStyle w:val="ListParagraph"/>
+        <w:numPr>
+          <w:ilvl w:val="0"/>
+          <w:numId w:val="2"/>
+        </w:numPr>
+        <w:spacing w:after="0"/>
+      </w:pPr>
+      <w:r>
+        <w:t>“</w:t>
+      </w:r>
+      <w:r>
+        <w:t>What do we do with unsuitable equipment?</w:t>
+      </w:r>
+      <w:r>
+        <w:t>”</w:t>
+      </w:r>
+    </w:p>
+    <w:p>
+      <w:pPr>
+        <w:pStyle w:val="ListParagraph"/>
+        <w:numPr>
+          <w:ilvl w:val="0"/>
+          <w:numId w:val="2"/>
+        </w:numPr>
+        <w:spacing w:after="0"/>
+      </w:pPr>
+      <w:r>
+        <w:t>“Where can I get information about events?”</w:t>
+      </w:r>
+    </w:p>
+    <w:p>
+      <w:pPr>
+        <w:pStyle w:val="ListParagraph"/>
+        <w:numPr>
+          <w:ilvl w:val="0"/>
+          <w:numId w:val="2"/>
+        </w:numPr>
+        <w:spacing w:after="0"/>
+      </w:pPr>
+      <w:r>
+        <w:t>“When will I be notified if an event is postponed or cancelled?”</w:t>
+      </w:r>
+    </w:p>
+    <w:p>
+      <w:pPr>
+        <w:pStyle w:val="ListParagraph"/>
+        <w:numPr>
+          <w:ilvl w:val="0"/>
+          <w:numId w:val="2"/>
+        </w:numPr>
+        <w:spacing w:after="0"/>
+      </w:pPr>
+      <w:r>
+        <w:t>“How should we notify volunteers about a postponement or cancelation?”</w:t>
+      </w:r>
+    </w:p>
+    <w:p>
+      <w:pPr>
+        <w:pStyle w:val="ListParagraph"/>
+        <w:numPr>
+          <w:ilvl w:val="0"/>
+          <w:numId w:val="2"/>
+        </w:numPr>
+        <w:spacing w:after="0"/>
+      </w:pPr>
+      <w:r>
+        <w:t>“How often should we aim to host events?”</w:t>
+      </w:r>
+    </w:p>
+    <w:p>
+      <w:pPr>
+        <w:pStyle w:val="ListParagraph"/>
+        <w:numPr>
+          <w:ilvl w:val="0"/>
+          <w:numId w:val="2"/>
+        </w:numPr>
+        <w:spacing w:after="0"/>
+      </w:pPr>
+      <w:r>
+        <w:t>“</w:t>
+      </w:r>
+      <w:r>
+        <w:t>What safety precautions should we take on site?”</w:t>
+      </w:r>
+    </w:p>
+    <w:p>
+      <w:pPr>
+        <w:pStyle w:val="ListParagraph"/>
+        <w:spacing w:after="0"/>
+      </w:pPr>
+    </w:p>
+    <w:p>
+      <w:r>
+        <w:br w:type="page"/>
+      </w:r>
+    </w:p>
+    <w:p>
+      <w:pPr>
+        <w:pStyle w:val="Heading1"/>
+      </w:pPr>
+      <w:r>
+        <w:lastRenderedPageBreak/>
+        <w:t xml:space="preserve">Task 9: </w:t>
+      </w:r>
+      <w:r>
+        <w:t>User Stories</w:t>
+      </w:r>
+    </w:p>
+    <w:tbl>
+      <w:tblPr>
+        <w:tblStyle w:val="TableGrid"/>
+        <w:tblW w:w="9351" w:type="dxa"/>
+        <w:tblLook w:val="04A0" w:firstRow="1" w:lastRow="0" w:firstColumn="1" w:lastColumn="0" w:noHBand="0" w:noVBand="1"/>
+      </w:tblPr>
+      <w:tblGrid>
+        <w:gridCol w:w="1128"/>
+        <w:gridCol w:w="1637"/>
+        <w:gridCol w:w="6586"/>
+      </w:tblGrid>
+      <w:tr>
+        <w:tc>
+          <w:tcPr>
+            <w:tcW w:w="1129" w:type="dxa"/>
+          </w:tcPr>
+          <w:p>
+            <w:pPr>
+              <w:rPr>
+                <w:b/>
+                <w:bCs/>
+              </w:rPr>
+            </w:pPr>
+            <w:r>
+              <w:rPr>
+                <w:b/>
+                <w:bCs/>
+              </w:rPr>
+              <w:t>Story ID</w:t>
+            </w:r>
+          </w:p>
+        </w:tc>
+        <w:tc>
+          <w:tcPr>
+            <w:tcW w:w="1626" w:type="dxa"/>
+          </w:tcPr>
+          <w:p>
+            <w:pPr>
+              <w:rPr>
+                <w:b/>
+                <w:bCs/>
+              </w:rPr>
+            </w:pPr>
+            <w:r>
+              <w:rPr>
+                <w:b/>
+                <w:bCs/>
+              </w:rPr>
+              <w:t>Requirement</w:t>
+            </w:r>
+          </w:p>
+        </w:tc>
+        <w:tc>
+          <w:tcPr>
+            <w:tcW w:w="6596" w:type="dxa"/>
+          </w:tcPr>
+          <w:p>
+            <w:pPr>
+              <w:rPr>
+                <w:b/>
+                <w:bCs/>
+              </w:rPr>
+            </w:pPr>
+            <w:r>
+              <w:rPr>
+                <w:b/>
+                <w:bCs/>
+              </w:rPr>
+              <w:t>Role–goal–benefit user story</w:t>
+            </w:r>
+          </w:p>
+        </w:tc>
+      </w:tr>
+      <w:tr>
+        <w:tc>
+          <w:tcPr>
+            <w:tcW w:w="1129" w:type="dxa"/>
+          </w:tcPr>
+          <w:p>
+            <w:r>
+              <w:t>US01</w:t>
+            </w:r>
+          </w:p>
+        </w:tc>
+        <w:tc>
+          <w:tcPr>
+            <w:tcW w:w="1626" w:type="dxa"/>
+          </w:tcPr>
+          <w:p>
+            <w:r>
+              <w:t>FR01</w:t>
+            </w:r>
+          </w:p>
+        </w:tc>
+        <w:tc>
+          <w:tcPr>
+            <w:tcW w:w="6596" w:type="dxa"/>
           </w:tcPr>
           <w:p/>
         </w:tc>
-        <w:tc>
-          <w:tcPr>
-            <w:tcW w:w="4508" w:type="dxa"/>
+      </w:tr>
+      <w:tr>
+        <w:tc>
+          <w:tcPr>
+            <w:tcW w:w="1129" w:type="dxa"/>
+          </w:tcPr>
+          <w:p>
+            <w:r>
+              <w:t>US02</w:t>
+            </w:r>
+          </w:p>
+        </w:tc>
+        <w:tc>
+          <w:tcPr>
+            <w:tcW w:w="1626" w:type="dxa"/>
+          </w:tcPr>
+          <w:p>
+            <w:r>
+              <w:t>FR02</w:t>
+            </w:r>
+          </w:p>
+        </w:tc>
+        <w:tc>
+          <w:tcPr>
+            <w:tcW w:w="6596" w:type="dxa"/>
           </w:tcPr>
           <w:p/>
         </w:tc>
@@ -3876,13 +4733,55 @@
       <w:tr>
         <w:tc>
           <w:tcPr>
-            <w:tcW w:w="4508" w:type="dxa"/>
+            <w:tcW w:w="1129" w:type="dxa"/>
+          </w:tcPr>
+          <w:p>
+            <w:r>
+              <w:t>US03</w:t>
+            </w:r>
+          </w:p>
+        </w:tc>
+        <w:tc>
+          <w:tcPr>
+            <w:tcW w:w="1626" w:type="dxa"/>
+          </w:tcPr>
+          <w:p>
+            <w:r>
+              <w:t>FR03</w:t>
+            </w:r>
+          </w:p>
+        </w:tc>
+        <w:tc>
+          <w:tcPr>
+            <w:tcW w:w="6596" w:type="dxa"/>
           </w:tcPr>
           <w:p/>
         </w:tc>
-        <w:tc>
-          <w:tcPr>
-            <w:tcW w:w="4508" w:type="dxa"/>
+      </w:tr>
+      <w:tr>
+        <w:tc>
+          <w:tcPr>
+            <w:tcW w:w="1129" w:type="dxa"/>
+          </w:tcPr>
+          <w:p>
+            <w:r>
+              <w:t>US04</w:t>
+            </w:r>
+          </w:p>
+        </w:tc>
+        <w:tc>
+          <w:tcPr>
+            <w:tcW w:w="1626" w:type="dxa"/>
+          </w:tcPr>
+          <w:p>
+            <w:r>
+              <w:t>FR04</w:t>
+            </w:r>
+          </w:p>
+        </w:tc>
+        <w:tc>
+          <w:tcPr>
+            <w:tcW w:w="6596" w:type="dxa"/>
           </w:tcPr>
           <w:p/>
         </w:tc>
@@ -3890,46 +4789,34 @@
       <w:tr>
         <w:tc>
           <w:tcPr>
-            <w:tcW w:w="4508" w:type="dxa"/>
+            <w:tcW w:w="1129" w:type="dxa"/>
+          </w:tcPr>
+          <w:p>
+            <w:r>
+              <w:t>US05</w:t>
+            </w:r>
+          </w:p>
+        </w:tc>
+        <w:tc>
+          <w:tcPr>
+            <w:tcW w:w="1626" w:type="dxa"/>
+          </w:tcPr>
+          <w:p>
+            <w:r>
+              <w:t>FR05</w:t>
+            </w:r>
+          </w:p>
+        </w:tc>
+        <w:tc>
+          <w:tcPr>
+            <w:tcW w:w="6596" w:type="dxa"/>
           </w:tcPr>
           <w:p/>
         </w:tc>
-        <w:tc>
-          <w:tcPr>
-            <w:tcW w:w="4508" w:type="dxa"/>
-          </w:tcPr>
-          <w:p/>
-        </w:tc>
-      </w:tr>
-      <w:tr>
-        <w:tc>
-          <w:tcPr>
-            <w:tcW w:w="4508" w:type="dxa"/>
-          </w:tcPr>
-          <w:p/>
-        </w:tc>
-        <w:tc>
-          <w:tcPr>
-            <w:tcW w:w="4508" w:type="dxa"/>
-          </w:tcPr>
-          <w:p/>
-        </w:tc>
-      </w:tr>
-      <w:tr>
-        <w:tc>
-          <w:tcPr>
-            <w:tcW w:w="4508" w:type="dxa"/>
-          </w:tcPr>
-          <w:p/>
-        </w:tc>
-        <w:tc>
-          <w:tcPr>
-            <w:tcW w:w="4508" w:type="dxa"/>
-          </w:tcPr>
-          <w:p/>
-        </w:tc>
       </w:tr>
     </w:tbl>
+    <w:p/>
+    <w:p/>
     <w:p/>
     <w:sectPr>
       <w:pgSz w:w="11906" w:h="16838"/>
@@ -3939,6 +4826,189 @@
     </w:sectPr>
   </w:body>
 </w:document>
+</file>
+
+<file path=word/numbering.xml><?xml version="1.0" encoding="utf-8"?>
+<w:numbering xmlns:wpc="http://schemas.microsoft.com/office/word/2010/wordprocessingCanvas" xmlns:cx="http://schemas.microsoft.com/office/drawing/2014/chartex" xmlns:cx1="http://schemas.microsoft.com/office/drawing/2015/9/8/chartex" xmlns:cx2="http://schemas.microsoft.com/office/drawing/2015/10/21/chartex" xmlns:cx3="http://schemas.microsoft.com/office/drawing/2016/5/9/chartex" xmlns:cx4="http://schemas.microsoft.com/office/drawing/2016/5/10/chartex" xmlns:cx5="http://schemas.microsoft.com/office/drawing/2016/5/11/chartex" xmlns:cx6="http://schemas.microsoft.com/office/drawing/2016/5/12/chartex" xmlns:cx7="http://schemas.microsoft.com/office/drawing/2016/5/13/chartex" xmlns:cx8="http://schemas.microsoft.com/office/drawing/2016/5/14/chartex" xmlns:mc="http://schemas.openxmlformats.org/markup-compatibility/2006" xmlns:aink="http://schemas.microsoft.com/office/drawing/2016/ink" xmlns:am3d="http://schemas.microsoft.com/office/drawing/2017/model3d" xmlns:o="urn:schemas-microsoft-com:office:office" xmlns:oel="http://schemas.microsoft.com/office/2019/extlst" xmlns:r="http://schemas.openxmlformats.org/officeDocument/2006/relationships" xmlns:m="http://schemas.openxmlformats.org/officeDocument/2006/math" xmlns:v="urn:schemas-microsoft-com:vml" xmlns:wp14="http://schemas.microsoft.com/office/word/2010/wordprocessingDrawing" xmlns:wp="http://schemas.openxmlformats.org/drawingml/2006/wordprocessingDrawing" xmlns:w10="urn:schemas-microsoft-com:office:word" xmlns:w="http://schemas.openxmlformats.org/wordprocessingml/2006/main" xmlns:w14="http://schemas.microsoft.com/office/word/2010/wordml" xmlns:w15="http://schemas.microsoft.com/office/word/2012/wordml" xmlns:w16cex="http://schemas.microsoft.com/office/word/2018/wordml/cex" xmlns:w16cid="http://schemas.microsoft.com/office/word/2016/wordml/cid" xmlns:w16="http://schemas.microsoft.com/office/word/2018/wordml" xmlns:w16du="http://schemas.microsoft.com/office/word/2023/wordml/word16du" xmlns:w16sdtdh="http://schemas.microsoft.com/office/word/2020/wordml/sdtdatahash" xmlns:w16sdtfl="http://schemas.microsoft.com/office/word/2024/wordml/sdtformatlock" xmlns:w16se="http://schemas.microsoft.com/office/word/2015/wordml/symex" xmlns:wpg="http://schemas.microsoft.com/office/word/2010/wordprocessingGroup" xmlns:wpi="http://schemas.microsoft.com/office/word/2010/wordprocessingInk" xmlns:wne="http://schemas.microsoft.com/office/word/2006/wordml" xmlns:wps="http://schemas.microsoft.com/office/word/2010/wordprocessingShape" mc:Ignorable="w14 w15 w16se w16cid w16 w16cex w16sdtdh w16sdtfl w16du wp14">
+  <w:abstractNum w:abstractNumId="0" w15:restartNumberingAfterBreak="0">
+    <w:nsid w:val="18692E61"/>
+    <w:multiLevelType w:val="hybridMultilevel"/>
+    <w:tmpl w:val="D6E81F90"/>
+    <w:lvl w:ilvl="0" w:tplc="1809000F">
+      <w:start w:val="1"/>
+      <w:numFmt w:val="decimal"/>
+      <w:lvlText w:val="%1."/>
+      <w:lvlJc w:val="left"/>
+      <w:pPr>
+        <w:ind w:left="720" w:hanging="360"/>
+      </w:pPr>
+    </w:lvl>
+    <w:lvl w:ilvl="1" w:tplc="18090019" w:tentative="1">
+      <w:start w:val="1"/>
+      <w:numFmt w:val="lowerLetter"/>
+      <w:lvlText w:val="%2."/>
+      <w:lvlJc w:val="left"/>
+      <w:pPr>
+        <w:ind w:left="1440" w:hanging="360"/>
+      </w:pPr>
+    </w:lvl>
+    <w:lvl w:ilvl="2" w:tplc="1809001B" w:tentative="1">
+      <w:start w:val="1"/>
+      <w:numFmt w:val="lowerRoman"/>
+      <w:lvlText w:val="%3."/>
+      <w:lvlJc w:val="right"/>
+      <w:pPr>
+        <w:ind w:left="2160" w:hanging="180"/>
+      </w:pPr>
+    </w:lvl>
+    <w:lvl w:ilvl="3" w:tplc="1809000F" w:tentative="1">
+      <w:start w:val="1"/>
+      <w:numFmt w:val="decimal"/>
+      <w:lvlText w:val="%4."/>
+      <w:lvlJc w:val="left"/>
+      <w:pPr>
+        <w:ind w:left="2880" w:hanging="360"/>
+      </w:pPr>
+    </w:lvl>
+    <w:lvl w:ilvl="4" w:tplc="18090019" w:tentative="1">
+      <w:start w:val="1"/>
+      <w:numFmt w:val="lowerLetter"/>
+      <w:lvlText w:val="%5."/>
+      <w:lvlJc w:val="left"/>
+      <w:pPr>
+        <w:ind w:left="3600" w:hanging="360"/>
+      </w:pPr>
+    </w:lvl>
+    <w:lvl w:ilvl="5" w:tplc="1809001B" w:tentative="1">
+      <w:start w:val="1"/>
+      <w:numFmt w:val="lowerRoman"/>
+      <w:lvlText w:val="%6."/>
+      <w:lvlJc w:val="right"/>
+      <w:pPr>
+        <w:ind w:left="4320" w:hanging="180"/>
+      </w:pPr>
+    </w:lvl>
+    <w:lvl w:ilvl="6" w:tplc="1809000F" w:tentative="1">
+      <w:start w:val="1"/>
+      <w:numFmt w:val="decimal"/>
+      <w:lvlText w:val="%7."/>
+      <w:lvlJc w:val="left"/>
+      <w:pPr>
+        <w:ind w:left="5040" w:hanging="360"/>
+      </w:pPr>
+    </w:lvl>
+    <w:lvl w:ilvl="7" w:tplc="18090019" w:tentative="1">
+      <w:start w:val="1"/>
+      <w:numFmt w:val="lowerLetter"/>
+      <w:lvlText w:val="%8."/>
+      <w:lvlJc w:val="left"/>
+      <w:pPr>
+        <w:ind w:left="5760" w:hanging="360"/>
+      </w:pPr>
+    </w:lvl>
+    <w:lvl w:ilvl="8" w:tplc="1809001B" w:tentative="1">
+      <w:start w:val="1"/>
+      <w:numFmt w:val="lowerRoman"/>
+      <w:lvlText w:val="%9."/>
+      <w:lvlJc w:val="right"/>
+      <w:pPr>
+        <w:ind w:left="6480" w:hanging="180"/>
+      </w:pPr>
+    </w:lvl>
+  </w:abstractNum>
+  <w:abstractNum w:abstractNumId="1" w15:restartNumberingAfterBreak="0">
+    <w:nsid w:val="3FFC72FF"/>
+    <w:multiLevelType w:val="hybridMultilevel"/>
+    <w:tmpl w:val="F6DE46B0"/>
+    <w:lvl w:ilvl="0" w:tplc="1809000F">
+      <w:start w:val="1"/>
+      <w:numFmt w:val="decimal"/>
+      <w:lvlText w:val="%1."/>
+      <w:lvlJc w:val="left"/>
+      <w:pPr>
+        <w:ind w:left="720" w:hanging="360"/>
+      </w:pPr>
+    </w:lvl>
+    <w:lvl w:ilvl="1" w:tplc="18090019" w:tentative="1">
+      <w:start w:val="1"/>
+      <w:numFmt w:val="lowerLetter"/>
+      <w:lvlText w:val="%2."/>
+      <w:lvlJc w:val="left"/>
+      <w:pPr>
+        <w:ind w:left="1440" w:hanging="360"/>
+      </w:pPr>
+    </w:lvl>
+    <w:lvl w:ilvl="2" w:tplc="1809001B" w:tentative="1">
+      <w:start w:val="1"/>
+      <w:numFmt w:val="lowerRoman"/>
+      <w:lvlText w:val="%3."/>
+      <w:lvlJc w:val="right"/>
+      <w:pPr>
+        <w:ind w:left="2160" w:hanging="180"/>
+      </w:pPr>
+    </w:lvl>
+    <w:lvl w:ilvl="3" w:tplc="1809000F" w:tentative="1">
+      <w:start w:val="1"/>
+      <w:numFmt w:val="decimal"/>
+      <w:lvlText w:val="%4."/>
+      <w:lvlJc w:val="left"/>
+      <w:pPr>
+        <w:ind w:left="2880" w:hanging="360"/>
+      </w:pPr>
+    </w:lvl>
+    <w:lvl w:ilvl="4" w:tplc="18090019" w:tentative="1">
+      <w:start w:val="1"/>
+      <w:numFmt w:val="lowerLetter"/>
+      <w:lvlText w:val="%5."/>
+      <w:lvlJc w:val="left"/>
+      <w:pPr>
+        <w:ind w:left="3600" w:hanging="360"/>
+      </w:pPr>
+    </w:lvl>
+    <w:lvl w:ilvl="5" w:tplc="1809001B" w:tentative="1">
+      <w:start w:val="1"/>
+      <w:numFmt w:val="lowerRoman"/>
+      <w:lvlText w:val="%6."/>
+      <w:lvlJc w:val="right"/>
+      <w:pPr>
+        <w:ind w:left="4320" w:hanging="180"/>
+      </w:pPr>
+    </w:lvl>
+    <w:lvl w:ilvl="6" w:tplc="1809000F" w:tentative="1">
+      <w:start w:val="1"/>
+      <w:numFmt w:val="decimal"/>
+      <w:lvlText w:val="%7."/>
+      <w:lvlJc w:val="left"/>
+      <w:pPr>
+        <w:ind w:left="5040" w:hanging="360"/>
+      </w:pPr>
+    </w:lvl>
+    <w:lvl w:ilvl="7" w:tplc="18090019" w:tentative="1">
+      <w:start w:val="1"/>
+      <w:numFmt w:val="lowerLetter"/>
+      <w:lvlText w:val="%8."/>
+      <w:lvlJc w:val="left"/>
+      <w:pPr>
+        <w:ind w:left="5760" w:hanging="360"/>
+      </w:pPr>
+    </w:lvl>
+    <w:lvl w:ilvl="8" w:tplc="1809001B" w:tentative="1">
+      <w:start w:val="1"/>
+      <w:numFmt w:val="lowerRoman"/>
+      <w:lvlText w:val="%9."/>
+      <w:lvlJc w:val="right"/>
+      <w:pPr>
+        <w:ind w:left="6480" w:hanging="180"/>
+      </w:pPr>
+    </w:lvl>
+  </w:abstractNum>
+  <w:num w:numId="1" w16cid:durableId="904029835">
+    <w:abstractNumId w:val="1"/>
+  </w:num>
+  <w:num w:numId="2" w16cid:durableId="2091847544">
+    <w:abstractNumId w:val="0"/>
+  </w:num>
+</w:numbering>
 </file>
 
 <file path=word/styles.xml><?xml version="1.0" encoding="utf-8"?>
@@ -4874,6 +5944,15 @@
       </w:tblBorders>
     </w:tblPr>
   </w:style>
+  <w:style w:type="paragraph" w:styleId="NoSpacing">
+    <w:name w:val="No Spacing"/>
+    <w:uiPriority w:val="1"/>
+    <w:qFormat/>
+    <w:rsid w:val="00964484"/>
+    <w:pPr>
+      <w:spacing w:after="0" w:line="240" w:lineRule="auto"/>
+    </w:pPr>
+  </w:style>
 </w:styles>
 </file>
 

</xml_diff>

<commit_message>
Made user stories and began work on acceptance criteria Signed-off-by: Harvey <HarveyDanSmith@gmail.com>
</commit_message>
<xml_diff>
--- a/OOP Coastal Project.docx
+++ b/OOP Coastal Project.docx
@@ -715,15 +715,7 @@
           <w:p/>
           <w:p>
             <w:r>
-              <w:t xml:space="preserve">Creates strong </w:t>
-            </w:r>
-            <w:proofErr w:type="gramStart"/>
-            <w:r>
-              <w:t>likely-hood</w:t>
-            </w:r>
-            <w:proofErr w:type="gramEnd"/>
-            <w:r>
-              <w:t xml:space="preserve"> of errors such as fragmentation in the system</w:t>
+              <w:t>Creates strong likely-hood of errors such as fragmentation in the system</w:t>
             </w:r>
           </w:p>
         </w:tc>
@@ -1814,31 +1806,7 @@
     </w:p>
     <w:p>
       <w:r>
-        <w:t xml:space="preserve">There are </w:t>
-      </w:r>
-      <w:proofErr w:type="gramStart"/>
-      <w:r>
-        <w:t>a number of</w:t>
-      </w:r>
-      <w:proofErr w:type="gramEnd"/>
-      <w:r>
-        <w:t xml:space="preserve"> problems throughout this system. Event details, volunteer lists, equipment requests and waste arrangements are managed through email, forms and shared calendars which can cause fragmentation. Due to this, data will be spread among </w:t>
-      </w:r>
-      <w:proofErr w:type="gramStart"/>
-      <w:r>
-        <w:t>a number of</w:t>
-      </w:r>
-      <w:proofErr w:type="gramEnd"/>
-      <w:r>
-        <w:t xml:space="preserve"> different data collection methods and will cause confusion or missing data. Because volunteers may register individually or through schools, clubs and community organisations, duplication could occur here if someone is to register on their </w:t>
-      </w:r>
-      <w:proofErr w:type="gramStart"/>
-      <w:r>
-        <w:t>own, but</w:t>
-      </w:r>
-      <w:proofErr w:type="gramEnd"/>
-      <w:r>
-        <w:t xml:space="preserve"> then be registered by their school. Because Group organisers sometimes provide only estimated numbers until shortly before the event, issues could arise as if the estimated numbers differ greatly from the estimation (numbers being much higher or lower than predicted), leaders could come overprepared or worse, underprepared and not have enough equipment for the event. Equipment may be reserved across several events and can return wet, incomplete or damaged which can encourage people to not take proper care of equipment. If there is no penalty or issue with returning a broken piece of equipment, then why would anyone need to care too much about the condition of equipment, it promotes faulty equipment which can be a safety hazard.</w:t>
+        <w:t>There are a number of problems throughout this system. Event details, volunteer lists, equipment requests and waste arrangements are managed through email, forms and shared calendars which can cause fragmentation. Due to this, data will be spread among a number of different data collection methods and will cause confusion or missing data. Because volunteers may register individually or through schools, clubs and community organisations, duplication could occur here if someone is to register on their own, but then be registered by their school. Because Group organisers sometimes provide only estimated numbers until shortly before the event, issues could arise as if the estimated numbers differ greatly from the estimation (numbers being much higher or lower than predicted), leaders could come overprepared or worse, underprepared and not have enough equipment for the event. Equipment may be reserved across several events and can return wet, incomplete or damaged which can encourage people to not take proper care of equipment. If there is no penalty or issue with returning a broken piece of equipment, then why would anyone need to care too much about the condition of equipment, it promotes faulty equipment which can be a safety hazard.</w:t>
       </w:r>
       <w:r>
         <w:t xml:space="preserve"> If a leader assignment can remain provisional while availability or permission is confirmed, it could end up having an event not have a leader available at the time of the event causing the event to be postponed, cancelled or urgently needing a new leader to take over the position. A collection vehicle may have limited access or capacity, this is a problem as if the collection vehicle does not have enough capacity required for the event, it could cause delays or if underprepared jeopardise the whole event. Weather, tides, access restrictions or insufficient leadership may cause relocation, postponement, shortening or cancellation. Anything that can risk cancelation of an event is a problem that needs to be planned around better. If messages to volunteers and partners are not always updated consistently, it can cause issues with volunteers maybe not showing on time, or at all if not correctly informed of a postponement or time change. It could also cause volunteers to show up early or on the wrong date prior to the event which will cause angry volunteers due to a lack of planning.</w:t>
@@ -1973,23 +1941,7 @@
                       <w:b/>
                       <w:bCs/>
                     </w:rPr>
-                    <w:t xml:space="preserve">Out Of Scope </w:t>
-                  </w:r>
-                  <w:proofErr w:type="gramStart"/>
-                  <w:r>
-                    <w:rPr>
-                      <w:b/>
-                      <w:bCs/>
-                    </w:rPr>
-                    <w:t>For</w:t>
-                  </w:r>
-                  <w:proofErr w:type="gramEnd"/>
-                  <w:r>
-                    <w:rPr>
-                      <w:b/>
-                      <w:bCs/>
-                    </w:rPr>
-                    <w:t xml:space="preserve"> Initial Release</w:t>
+                    <w:t>Out Of Scope For Initial Release</w:t>
                   </w:r>
                 </w:p>
               </w:tc>
@@ -2351,6 +2303,13 @@
                 <w:szCs w:val="20"/>
               </w:rPr>
             </w:pPr>
+            <w:r>
+              <w:rPr>
+                <w:sz w:val="20"/>
+                <w:szCs w:val="20"/>
+              </w:rPr>
+              <w:t>Are relevant parties notified when I create or update an event?</w:t>
+            </w:r>
           </w:p>
         </w:tc>
         <w:tc>
@@ -2542,6 +2501,13 @@
                 <w:szCs w:val="20"/>
               </w:rPr>
             </w:pPr>
+            <w:r>
+              <w:rPr>
+                <w:sz w:val="20"/>
+                <w:szCs w:val="20"/>
+              </w:rPr>
+              <w:t xml:space="preserve">Access relevant information regarding volunteers and events to lead events effectively </w:t>
+            </w:r>
           </w:p>
         </w:tc>
         <w:tc>
@@ -2555,6 +2521,13 @@
                 <w:szCs w:val="20"/>
               </w:rPr>
             </w:pPr>
+            <w:r>
+              <w:rPr>
+                <w:sz w:val="20"/>
+                <w:szCs w:val="20"/>
+              </w:rPr>
+              <w:t>Is my level of training good enough to lead a specific event? Do I need more leaders to help?</w:t>
+            </w:r>
           </w:p>
         </w:tc>
         <w:tc>
@@ -2588,6 +2561,13 @@
                 <w:szCs w:val="20"/>
               </w:rPr>
             </w:pPr>
+            <w:r>
+              <w:rPr>
+                <w:sz w:val="20"/>
+                <w:szCs w:val="20"/>
+              </w:rPr>
+              <w:t>Get info on events and volunteers</w:t>
+            </w:r>
           </w:p>
         </w:tc>
       </w:tr>
@@ -2745,6 +2725,13 @@
                 <w:szCs w:val="20"/>
               </w:rPr>
             </w:pPr>
+            <w:r>
+              <w:rPr>
+                <w:sz w:val="20"/>
+                <w:szCs w:val="20"/>
+              </w:rPr>
+              <w:t>Are volunteers notified or can I contact them when I decided to assign them to a specific group?</w:t>
+            </w:r>
           </w:p>
         </w:tc>
         <w:tc>
@@ -2778,6 +2765,13 @@
                 <w:szCs w:val="20"/>
               </w:rPr>
             </w:pPr>
+            <w:r>
+              <w:rPr>
+                <w:sz w:val="20"/>
+                <w:szCs w:val="20"/>
+              </w:rPr>
+              <w:t>Add volunteers to groups and notify/contact them</w:t>
+            </w:r>
           </w:p>
         </w:tc>
       </w:tr>
@@ -2818,7 +2812,14 @@
                 <w:sz w:val="20"/>
                 <w:szCs w:val="20"/>
               </w:rPr>
-              <w:t xml:space="preserve">View equipment inventory, and  </w:t>
+              <w:t xml:space="preserve">View equipment inventory, and </w:t>
+            </w:r>
+            <w:r>
+              <w:rPr>
+                <w:sz w:val="20"/>
+                <w:szCs w:val="20"/>
+              </w:rPr>
+              <w:t>make relevant changes regarding inventory stats</w:t>
             </w:r>
           </w:p>
         </w:tc>
@@ -2840,6 +2841,13 @@
               </w:rPr>
               <w:t>Equipment may be returned still wet, incomplete or unsuitable for next event</w:t>
             </w:r>
+            <w:r>
+              <w:rPr>
+                <w:sz w:val="20"/>
+                <w:szCs w:val="20"/>
+              </w:rPr>
+              <w:t>, what do I do with them?</w:t>
+            </w:r>
           </w:p>
         </w:tc>
         <w:tc>
@@ -2873,6 +2881,13 @@
                 <w:szCs w:val="20"/>
               </w:rPr>
             </w:pPr>
+            <w:r>
+              <w:rPr>
+                <w:sz w:val="20"/>
+                <w:szCs w:val="20"/>
+              </w:rPr>
+              <w:t>View inventory and update numbers, quality etc.</w:t>
+            </w:r>
           </w:p>
         </w:tc>
       </w:tr>
@@ -4699,7 +4714,11 @@
           <w:tcPr>
             <w:tcW w:w="6596" w:type="dxa"/>
           </w:tcPr>
-          <w:p/>
+          <w:p>
+            <w:r>
+              <w:t>As a Coordinator I want to complete required checks so that I can advertise confirmed events</w:t>
+            </w:r>
+          </w:p>
         </w:tc>
       </w:tr>
       <w:tr>
@@ -4727,7 +4746,11 @@
           <w:tcPr>
             <w:tcW w:w="6596" w:type="dxa"/>
           </w:tcPr>
-          <w:p/>
+          <w:p>
+            <w:r>
+              <w:t>As a volunteer I want to see relevant accessibility on registration forms so that I can complete registration unaffected by my disability</w:t>
+            </w:r>
+          </w:p>
         </w:tc>
       </w:tr>
       <w:tr>
@@ -4755,7 +4778,11 @@
           <w:tcPr>
             <w:tcW w:w="6596" w:type="dxa"/>
           </w:tcPr>
-          <w:p/>
+          <w:p>
+            <w:r>
+              <w:t>As an event leader I want to have enough relevant information so that I can prepare safely for events</w:t>
+            </w:r>
+          </w:p>
         </w:tc>
       </w:tr>
       <w:tr>
@@ -4783,7 +4810,11 @@
           <w:tcPr>
             <w:tcW w:w="6596" w:type="dxa"/>
           </w:tcPr>
-          <w:p/>
+          <w:p>
+            <w:r>
+              <w:t>As a waste partner I want to have the right equipment so that I can safely do my job</w:t>
+            </w:r>
+          </w:p>
         </w:tc>
       </w:tr>
       <w:tr>
@@ -4811,13 +4842,752 @@
           <w:tcPr>
             <w:tcW w:w="6596" w:type="dxa"/>
           </w:tcPr>
-          <w:p/>
+          <w:p>
+            <w:r>
+              <w:t>As a Coordinator I want to have views of events so that I can safely and effectively coordinate events</w:t>
+            </w:r>
+          </w:p>
         </w:tc>
       </w:tr>
     </w:tbl>
     <w:p/>
+    <w:p>
+      <w:r>
+        <w:br w:type="page"/>
+      </w:r>
+    </w:p>
+    <w:p>
+      <w:pPr>
+        <w:pStyle w:val="Heading1"/>
+      </w:pPr>
+      <w:r>
+        <w:lastRenderedPageBreak/>
+        <w:t xml:space="preserve">Task </w:t>
+      </w:r>
+      <w:r>
+        <w:t>10</w:t>
+      </w:r>
+      <w:r>
+        <w:t>: Acceptance Criteria</w:t>
+      </w:r>
+    </w:p>
+    <w:p>
+      <w:pPr>
+        <w:pStyle w:val="Heading2"/>
+      </w:pPr>
+      <w:r>
+        <w:t>Selected Story 1: US0</w:t>
+      </w:r>
+      <w:r>
+        <w:t>1</w:t>
+      </w:r>
+    </w:p>
+    <w:p>
+      <w:pPr>
+        <w:pStyle w:val="Subtitle"/>
+      </w:pPr>
+      <w:r>
+        <w:t>Story</w:t>
+      </w:r>
+    </w:p>
+    <w:p>
+      <w:pPr>
+        <w:rPr>
+          <w:rStyle w:val="SubtleEmphasis"/>
+        </w:rPr>
+      </w:pPr>
+      <w:r>
+        <w:rPr>
+          <w:rStyle w:val="SubtleEmphasis"/>
+        </w:rPr>
+        <w:t>“</w:t>
+      </w:r>
+      <w:r>
+        <w:rPr>
+          <w:rStyle w:val="SubtleEmphasis"/>
+        </w:rPr>
+        <w:t>As a Coordinator I want to complete required checks so that I can advertise confirmed events</w:t>
+      </w:r>
+      <w:r>
+        <w:rPr>
+          <w:rStyle w:val="SubtleEmphasis"/>
+        </w:rPr>
+        <w:t>”</w:t>
+      </w:r>
+    </w:p>
+    <w:tbl>
+      <w:tblPr>
+        <w:tblStyle w:val="TableGrid"/>
+        <w:tblW w:w="0" w:type="auto"/>
+        <w:tblLook w:val="04A0" w:firstRow="1" w:lastRow="0" w:firstColumn="1" w:lastColumn="0" w:noHBand="0" w:noVBand="1"/>
+      </w:tblPr>
+      <w:tblGrid>
+        <w:gridCol w:w="4508"/>
+        <w:gridCol w:w="4508"/>
+      </w:tblGrid>
+      <w:tr>
+        <w:tc>
+          <w:tcPr>
+            <w:tcW w:w="4508" w:type="dxa"/>
+          </w:tcPr>
+          <w:p>
+            <w:pPr>
+              <w:rPr>
+                <w:b/>
+                <w:bCs/>
+              </w:rPr>
+            </w:pPr>
+            <w:r>
+              <w:rPr>
+                <w:b/>
+                <w:bCs/>
+              </w:rPr>
+              <w:t>Criterion</w:t>
+            </w:r>
+          </w:p>
+        </w:tc>
+        <w:tc>
+          <w:tcPr>
+            <w:tcW w:w="4508" w:type="dxa"/>
+          </w:tcPr>
+          <w:p>
+            <w:pPr>
+              <w:rPr>
+                <w:b/>
+                <w:bCs/>
+              </w:rPr>
+            </w:pPr>
+            <w:r>
+              <w:rPr>
+                <w:b/>
+                <w:bCs/>
+              </w:rPr>
+              <w:t>Observable Acceptance Condition</w:t>
+            </w:r>
+          </w:p>
+        </w:tc>
+      </w:tr>
+      <w:tr>
+        <w:tc>
+          <w:tcPr>
+            <w:tcW w:w="4508" w:type="dxa"/>
+          </w:tcPr>
+          <w:p/>
+        </w:tc>
+        <w:tc>
+          <w:tcPr>
+            <w:tcW w:w="4508" w:type="dxa"/>
+          </w:tcPr>
+          <w:p/>
+        </w:tc>
+      </w:tr>
+      <w:tr>
+        <w:tc>
+          <w:tcPr>
+            <w:tcW w:w="4508" w:type="dxa"/>
+          </w:tcPr>
+          <w:p/>
+        </w:tc>
+        <w:tc>
+          <w:tcPr>
+            <w:tcW w:w="4508" w:type="dxa"/>
+          </w:tcPr>
+          <w:p/>
+        </w:tc>
+      </w:tr>
+      <w:tr>
+        <w:tc>
+          <w:tcPr>
+            <w:tcW w:w="4508" w:type="dxa"/>
+          </w:tcPr>
+          <w:p/>
+        </w:tc>
+        <w:tc>
+          <w:tcPr>
+            <w:tcW w:w="4508" w:type="dxa"/>
+          </w:tcPr>
+          <w:p/>
+        </w:tc>
+      </w:tr>
+      <w:tr>
+        <w:tc>
+          <w:tcPr>
+            <w:tcW w:w="4508" w:type="dxa"/>
+          </w:tcPr>
+          <w:p/>
+        </w:tc>
+        <w:tc>
+          <w:tcPr>
+            <w:tcW w:w="4508" w:type="dxa"/>
+          </w:tcPr>
+          <w:p/>
+        </w:tc>
+      </w:tr>
+      <w:tr>
+        <w:tc>
+          <w:tcPr>
+            <w:tcW w:w="4508" w:type="dxa"/>
+          </w:tcPr>
+          <w:p/>
+        </w:tc>
+        <w:tc>
+          <w:tcPr>
+            <w:tcW w:w="4508" w:type="dxa"/>
+          </w:tcPr>
+          <w:p/>
+        </w:tc>
+      </w:tr>
+    </w:tbl>
+    <w:p>
+      <w:pPr>
+        <w:pStyle w:val="Heading3"/>
+      </w:pPr>
+      <w:r>
+        <w:t>Given–When–Then example</w:t>
+      </w:r>
+    </w:p>
+    <w:p>
+      <w:pPr>
+        <w:rPr>
+          <w:b/>
+          <w:bCs/>
+        </w:rPr>
+      </w:pPr>
+      <w:r>
+        <w:rPr>
+          <w:b/>
+          <w:bCs/>
+        </w:rPr>
+        <w:t>Given</w:t>
+      </w:r>
+    </w:p>
+    <w:p>
+      <w:pPr>
+        <w:rPr>
+          <w:b/>
+          <w:bCs/>
+        </w:rPr>
+      </w:pPr>
+      <w:r>
+        <w:rPr>
+          <w:b/>
+          <w:bCs/>
+        </w:rPr>
+        <w:t>When</w:t>
+      </w:r>
+    </w:p>
+    <w:p>
+      <w:pPr>
+        <w:rPr>
+          <w:b/>
+          <w:bCs/>
+        </w:rPr>
+      </w:pPr>
+      <w:r>
+        <w:rPr>
+          <w:b/>
+          <w:bCs/>
+        </w:rPr>
+        <w:t>Then</w:t>
+      </w:r>
+    </w:p>
+    <w:p>
+      <w:pPr>
+        <w:pStyle w:val="Heading3"/>
+      </w:pPr>
+      <w:r>
+        <w:t>Questions revealed</w:t>
+      </w:r>
+    </w:p>
+    <w:p>
+      <w:r>
+        <w:br w:type="page"/>
+      </w:r>
+    </w:p>
+    <w:p>
+      <w:pPr>
+        <w:pStyle w:val="Heading2"/>
+      </w:pPr>
+      <w:r>
+        <w:lastRenderedPageBreak/>
+        <w:t xml:space="preserve">Selected Story </w:t>
+      </w:r>
+      <w:r>
+        <w:t>2</w:t>
+      </w:r>
+      <w:r>
+        <w:t>: US0</w:t>
+      </w:r>
+      <w:r>
+        <w:t>2</w:t>
+      </w:r>
+    </w:p>
+    <w:p>
+      <w:pPr>
+        <w:pStyle w:val="Subtitle"/>
+      </w:pPr>
+      <w:r>
+        <w:t>Story</w:t>
+      </w:r>
+    </w:p>
+    <w:p>
+      <w:pPr>
+        <w:rPr>
+          <w:rStyle w:val="SubtleEmphasis"/>
+        </w:rPr>
+      </w:pPr>
+      <w:r>
+        <w:rPr>
+          <w:rStyle w:val="SubtleEmphasis"/>
+        </w:rPr>
+        <w:t>“</w:t>
+      </w:r>
+      <w:r>
+        <w:rPr>
+          <w:rStyle w:val="SubtleEmphasis"/>
+        </w:rPr>
+        <w:t>As a volunteer I want to see relevant accessibility on registration forms so that I can complete registration unaffected by my disability</w:t>
+      </w:r>
+      <w:r>
+        <w:rPr>
+          <w:rStyle w:val="SubtleEmphasis"/>
+        </w:rPr>
+        <w:t>”</w:t>
+      </w:r>
+    </w:p>
+    <w:tbl>
+      <w:tblPr>
+        <w:tblStyle w:val="TableGrid"/>
+        <w:tblW w:w="0" w:type="auto"/>
+        <w:tblLook w:val="04A0" w:firstRow="1" w:lastRow="0" w:firstColumn="1" w:lastColumn="0" w:noHBand="0" w:noVBand="1"/>
+      </w:tblPr>
+      <w:tblGrid>
+        <w:gridCol w:w="4508"/>
+        <w:gridCol w:w="4508"/>
+      </w:tblGrid>
+      <w:tr>
+        <w:tc>
+          <w:tcPr>
+            <w:tcW w:w="4508" w:type="dxa"/>
+          </w:tcPr>
+          <w:p>
+            <w:pPr>
+              <w:rPr>
+                <w:b/>
+                <w:bCs/>
+              </w:rPr>
+            </w:pPr>
+            <w:r>
+              <w:rPr>
+                <w:b/>
+                <w:bCs/>
+              </w:rPr>
+              <w:t>Criterion</w:t>
+            </w:r>
+          </w:p>
+        </w:tc>
+        <w:tc>
+          <w:tcPr>
+            <w:tcW w:w="4508" w:type="dxa"/>
+          </w:tcPr>
+          <w:p>
+            <w:pPr>
+              <w:rPr>
+                <w:b/>
+                <w:bCs/>
+              </w:rPr>
+            </w:pPr>
+            <w:r>
+              <w:rPr>
+                <w:b/>
+                <w:bCs/>
+              </w:rPr>
+              <w:t>Observable Acceptance Condition</w:t>
+            </w:r>
+          </w:p>
+        </w:tc>
+      </w:tr>
+      <w:tr>
+        <w:tc>
+          <w:tcPr>
+            <w:tcW w:w="4508" w:type="dxa"/>
+          </w:tcPr>
+          <w:p/>
+        </w:tc>
+        <w:tc>
+          <w:tcPr>
+            <w:tcW w:w="4508" w:type="dxa"/>
+          </w:tcPr>
+          <w:p/>
+        </w:tc>
+      </w:tr>
+      <w:tr>
+        <w:tc>
+          <w:tcPr>
+            <w:tcW w:w="4508" w:type="dxa"/>
+          </w:tcPr>
+          <w:p/>
+        </w:tc>
+        <w:tc>
+          <w:tcPr>
+            <w:tcW w:w="4508" w:type="dxa"/>
+          </w:tcPr>
+          <w:p/>
+        </w:tc>
+      </w:tr>
+      <w:tr>
+        <w:tc>
+          <w:tcPr>
+            <w:tcW w:w="4508" w:type="dxa"/>
+          </w:tcPr>
+          <w:p/>
+        </w:tc>
+        <w:tc>
+          <w:tcPr>
+            <w:tcW w:w="4508" w:type="dxa"/>
+          </w:tcPr>
+          <w:p/>
+        </w:tc>
+      </w:tr>
+      <w:tr>
+        <w:tc>
+          <w:tcPr>
+            <w:tcW w:w="4508" w:type="dxa"/>
+          </w:tcPr>
+          <w:p/>
+        </w:tc>
+        <w:tc>
+          <w:tcPr>
+            <w:tcW w:w="4508" w:type="dxa"/>
+          </w:tcPr>
+          <w:p/>
+        </w:tc>
+      </w:tr>
+      <w:tr>
+        <w:tc>
+          <w:tcPr>
+            <w:tcW w:w="4508" w:type="dxa"/>
+          </w:tcPr>
+          <w:p/>
+        </w:tc>
+        <w:tc>
+          <w:tcPr>
+            <w:tcW w:w="4508" w:type="dxa"/>
+          </w:tcPr>
+          <w:p/>
+        </w:tc>
+      </w:tr>
+    </w:tbl>
+    <w:p>
+      <w:pPr>
+        <w:pStyle w:val="Heading3"/>
+      </w:pPr>
+      <w:r>
+        <w:t>Given–When–Then example</w:t>
+      </w:r>
+    </w:p>
+    <w:p>
+      <w:pPr>
+        <w:rPr>
+          <w:b/>
+          <w:bCs/>
+        </w:rPr>
+      </w:pPr>
+      <w:r>
+        <w:rPr>
+          <w:b/>
+          <w:bCs/>
+        </w:rPr>
+        <w:t>Given</w:t>
+      </w:r>
+    </w:p>
+    <w:p>
+      <w:pPr>
+        <w:rPr>
+          <w:b/>
+          <w:bCs/>
+        </w:rPr>
+      </w:pPr>
+      <w:r>
+        <w:rPr>
+          <w:b/>
+          <w:bCs/>
+        </w:rPr>
+        <w:t>When</w:t>
+      </w:r>
+    </w:p>
+    <w:p>
+      <w:pPr>
+        <w:rPr>
+          <w:b/>
+          <w:bCs/>
+        </w:rPr>
+      </w:pPr>
+      <w:r>
+        <w:rPr>
+          <w:b/>
+          <w:bCs/>
+        </w:rPr>
+        <w:t>Then</w:t>
+      </w:r>
+    </w:p>
+    <w:p>
+      <w:pPr>
+        <w:pStyle w:val="Heading3"/>
+      </w:pPr>
+      <w:r>
+        <w:t>Questions revealed</w:t>
+      </w:r>
+    </w:p>
+    <w:p>
+      <w:r>
+        <w:br w:type="page"/>
+      </w:r>
+    </w:p>
+    <w:p>
+      <w:pPr>
+        <w:pStyle w:val="Heading2"/>
+      </w:pPr>
+      <w:r>
+        <w:lastRenderedPageBreak/>
+        <w:t xml:space="preserve">Selected Story </w:t>
+      </w:r>
+      <w:r>
+        <w:t>3</w:t>
+      </w:r>
+      <w:r>
+        <w:t>: US0</w:t>
+      </w:r>
+      <w:r>
+        <w:t>3</w:t>
+      </w:r>
+    </w:p>
+    <w:p>
+      <w:pPr>
+        <w:pStyle w:val="Subtitle"/>
+      </w:pPr>
+      <w:r>
+        <w:t>Story</w:t>
+      </w:r>
+    </w:p>
+    <w:p>
+      <w:pPr>
+        <w:rPr>
+          <w:rStyle w:val="SubtleEmphasis"/>
+        </w:rPr>
+      </w:pPr>
+      <w:r>
+        <w:rPr>
+          <w:rStyle w:val="SubtleEmphasis"/>
+        </w:rPr>
+        <w:t>“</w:t>
+      </w:r>
+      <w:r>
+        <w:rPr>
+          <w:rStyle w:val="SubtleEmphasis"/>
+        </w:rPr>
+        <w:t>As an event leader I want to have enough relevant information so that I can prepare safely for events</w:t>
+      </w:r>
+      <w:r>
+        <w:rPr>
+          <w:rStyle w:val="SubtleEmphasis"/>
+        </w:rPr>
+        <w:t>”</w:t>
+      </w:r>
+    </w:p>
+    <w:tbl>
+      <w:tblPr>
+        <w:tblStyle w:val="TableGrid"/>
+        <w:tblW w:w="0" w:type="auto"/>
+        <w:tblLook w:val="04A0" w:firstRow="1" w:lastRow="0" w:firstColumn="1" w:lastColumn="0" w:noHBand="0" w:noVBand="1"/>
+      </w:tblPr>
+      <w:tblGrid>
+        <w:gridCol w:w="4508"/>
+        <w:gridCol w:w="4508"/>
+      </w:tblGrid>
+      <w:tr>
+        <w:tc>
+          <w:tcPr>
+            <w:tcW w:w="4508" w:type="dxa"/>
+          </w:tcPr>
+          <w:p>
+            <w:pPr>
+              <w:rPr>
+                <w:b/>
+                <w:bCs/>
+              </w:rPr>
+            </w:pPr>
+            <w:r>
+              <w:rPr>
+                <w:b/>
+                <w:bCs/>
+              </w:rPr>
+              <w:t>Criterion</w:t>
+            </w:r>
+          </w:p>
+        </w:tc>
+        <w:tc>
+          <w:tcPr>
+            <w:tcW w:w="4508" w:type="dxa"/>
+          </w:tcPr>
+          <w:p>
+            <w:pPr>
+              <w:rPr>
+                <w:b/>
+                <w:bCs/>
+              </w:rPr>
+            </w:pPr>
+            <w:r>
+              <w:rPr>
+                <w:b/>
+                <w:bCs/>
+              </w:rPr>
+              <w:t>Observable Acceptance Condition</w:t>
+            </w:r>
+          </w:p>
+        </w:tc>
+      </w:tr>
+      <w:tr>
+        <w:tc>
+          <w:tcPr>
+            <w:tcW w:w="4508" w:type="dxa"/>
+          </w:tcPr>
+          <w:p/>
+        </w:tc>
+        <w:tc>
+          <w:tcPr>
+            <w:tcW w:w="4508" w:type="dxa"/>
+          </w:tcPr>
+          <w:p/>
+        </w:tc>
+      </w:tr>
+      <w:tr>
+        <w:tc>
+          <w:tcPr>
+            <w:tcW w:w="4508" w:type="dxa"/>
+          </w:tcPr>
+          <w:p/>
+        </w:tc>
+        <w:tc>
+          <w:tcPr>
+            <w:tcW w:w="4508" w:type="dxa"/>
+          </w:tcPr>
+          <w:p/>
+        </w:tc>
+      </w:tr>
+      <w:tr>
+        <w:tc>
+          <w:tcPr>
+            <w:tcW w:w="4508" w:type="dxa"/>
+          </w:tcPr>
+          <w:p/>
+        </w:tc>
+        <w:tc>
+          <w:tcPr>
+            <w:tcW w:w="4508" w:type="dxa"/>
+          </w:tcPr>
+          <w:p/>
+        </w:tc>
+      </w:tr>
+      <w:tr>
+        <w:tc>
+          <w:tcPr>
+            <w:tcW w:w="4508" w:type="dxa"/>
+          </w:tcPr>
+          <w:p/>
+        </w:tc>
+        <w:tc>
+          <w:tcPr>
+            <w:tcW w:w="4508" w:type="dxa"/>
+          </w:tcPr>
+          <w:p/>
+        </w:tc>
+      </w:tr>
+      <w:tr>
+        <w:tc>
+          <w:tcPr>
+            <w:tcW w:w="4508" w:type="dxa"/>
+          </w:tcPr>
+          <w:p/>
+        </w:tc>
+        <w:tc>
+          <w:tcPr>
+            <w:tcW w:w="4508" w:type="dxa"/>
+          </w:tcPr>
+          <w:p/>
+        </w:tc>
+      </w:tr>
+    </w:tbl>
+    <w:p>
+      <w:pPr>
+        <w:pStyle w:val="Heading3"/>
+      </w:pPr>
+      <w:r>
+        <w:t>Given–When–Then example</w:t>
+      </w:r>
+    </w:p>
+    <w:p>
+      <w:pPr>
+        <w:rPr>
+          <w:b/>
+          <w:bCs/>
+        </w:rPr>
+      </w:pPr>
+      <w:r>
+        <w:rPr>
+          <w:b/>
+          <w:bCs/>
+        </w:rPr>
+        <w:t>Given</w:t>
+      </w:r>
+    </w:p>
+    <w:p>
+      <w:pPr>
+        <w:rPr>
+          <w:b/>
+          <w:bCs/>
+        </w:rPr>
+      </w:pPr>
+      <w:r>
+        <w:rPr>
+          <w:b/>
+          <w:bCs/>
+        </w:rPr>
+        <w:t>When</w:t>
+      </w:r>
+    </w:p>
+    <w:p>
+      <w:pPr>
+        <w:rPr>
+          <w:b/>
+          <w:bCs/>
+        </w:rPr>
+      </w:pPr>
+      <w:r>
+        <w:rPr>
+          <w:b/>
+          <w:bCs/>
+        </w:rPr>
+        <w:t>Then</w:t>
+      </w:r>
+    </w:p>
+    <w:p>
+      <w:pPr>
+        <w:pStyle w:val="Heading3"/>
+      </w:pPr>
+      <w:r>
+        <w:t>Questions revealed</w:t>
+      </w:r>
+    </w:p>
     <w:p/>
-    <w:p/>
+    <w:p>
+      <w:pPr>
+        <w:rPr>
+          <w:b/>
+          <w:bCs/>
+        </w:rPr>
+      </w:pPr>
+    </w:p>
     <w:sectPr>
       <w:pgSz w:w="11906" w:h="16838"/>
       <w:pgMar w:top="1440" w:right="1440" w:bottom="1440" w:left="1440" w:header="708" w:footer="708" w:gutter="0"/>
@@ -5461,7 +6231,6 @@
     <w:next w:val="Normal"/>
     <w:link w:val="Heading3Char"/>
     <w:uiPriority w:val="9"/>
-    <w:semiHidden/>
     <w:unhideWhenUsed/>
     <w:qFormat/>
     <w:rsid w:val="00270067"/>
@@ -5667,7 +6436,6 @@
     <w:basedOn w:val="DefaultParagraphFont"/>
     <w:link w:val="Heading3"/>
     <w:uiPriority w:val="9"/>
-    <w:semiHidden/>
     <w:rsid w:val="00270067"/>
     <w:rPr>
       <w:rFonts w:eastAsiaTheme="majorEastAsia" w:cstheme="majorBidi"/>
@@ -5952,6 +6720,18 @@
     <w:pPr>
       <w:spacing w:after="0" w:line="240" w:lineRule="auto"/>
     </w:pPr>
+  </w:style>
+  <w:style w:type="character" w:styleId="SubtleEmphasis">
+    <w:name w:val="Subtle Emphasis"/>
+    <w:basedOn w:val="DefaultParagraphFont"/>
+    <w:uiPriority w:val="19"/>
+    <w:qFormat/>
+    <w:rsid w:val="00D1108E"/>
+    <w:rPr>
+      <w:i/>
+      <w:iCs/>
+      <w:color w:val="404040" w:themeColor="text1" w:themeTint="BF"/>
+    </w:rPr>
   </w:style>
 </w:styles>
 </file>

</xml_diff>